<commit_message>
animations fixed and such
</commit_message>
<xml_diff>
--- a/MiniProject_AP_MED2026_Clara.docx
+++ b/MiniProject_AP_MED2026_Clara.docx
@@ -16,15 +16,10 @@
       </w:r>
     </w:p>
     <w:p>
-      <w:proofErr w:type="spellStart"/>
-      <w:r>
-        <w:t>Github</w:t>
-      </w:r>
-      <w:proofErr w:type="spellEnd"/>
-      <w:r>
-        <w:t xml:space="preserve">: </w:t>
-      </w:r>
-      <w:hyperlink r:id="rId4" w:history="1">
+      <w:r>
+        <w:t xml:space="preserve">Github: </w:t>
+      </w:r>
+      <w:hyperlink r:id="rId5" w:history="1">
         <w:r>
           <w:rPr>
             <w:rStyle w:val="Hyperlink"/>
@@ -98,6 +93,131 @@
       </w:pPr>
       <w:r>
         <w:t>Bibliography:</w:t>
+      </w:r>
+    </w:p>
+    <w:p/>
+    <w:p/>
+    <w:p>
+      <w:pPr>
+        <w:pStyle w:val="ListParagraph"/>
+        <w:numPr>
+          <w:ilvl w:val="0"/>
+          <w:numId w:val="1"/>
+        </w:numPr>
+      </w:pPr>
+      <w:r>
+        <w:t>Created a store layout with shelfs and visualized it</w:t>
+      </w:r>
+    </w:p>
+    <w:p>
+      <w:pPr>
+        <w:pStyle w:val="ListParagraph"/>
+        <w:numPr>
+          <w:ilvl w:val="0"/>
+          <w:numId w:val="1"/>
+        </w:numPr>
+      </w:pPr>
+      <w:r>
+        <w:t>Created items and placed them in the store layout and visualized it</w:t>
+      </w:r>
+    </w:p>
+    <w:p>
+      <w:pPr>
+        <w:pStyle w:val="ListParagraph"/>
+        <w:numPr>
+          <w:ilvl w:val="0"/>
+          <w:numId w:val="1"/>
+        </w:numPr>
+      </w:pPr>
+      <w:r>
+        <w:t>Used A* pathfinding to find the shortest path between the items</w:t>
+      </w:r>
+    </w:p>
+    <w:p>
+      <w:pPr>
+        <w:pStyle w:val="ListParagraph"/>
+        <w:numPr>
+          <w:ilvl w:val="0"/>
+          <w:numId w:val="1"/>
+        </w:numPr>
+      </w:pPr>
+      <w:r>
+        <w:t>Created 5 parent selection methods: tournament, random, roulette, sus, rank</w:t>
+      </w:r>
+    </w:p>
+    <w:p>
+      <w:pPr>
+        <w:pStyle w:val="ListParagraph"/>
+        <w:numPr>
+          <w:ilvl w:val="0"/>
+          <w:numId w:val="1"/>
+        </w:numPr>
+      </w:pPr>
+      <w:r>
+        <w:t>Created GA and print the best distance for every 10 generations + the final best route and distance</w:t>
+      </w:r>
+    </w:p>
+    <w:p>
+      <w:pPr>
+        <w:pStyle w:val="ListParagraph"/>
+        <w:numPr>
+          <w:ilvl w:val="0"/>
+          <w:numId w:val="1"/>
+        </w:numPr>
+      </w:pPr>
+      <w:r>
+        <w:t>Visualized the best path</w:t>
+      </w:r>
+    </w:p>
+    <w:p>
+      <w:pPr>
+        <w:pStyle w:val="ListParagraph"/>
+        <w:numPr>
+          <w:ilvl w:val="0"/>
+          <w:numId w:val="1"/>
+        </w:numPr>
+      </w:pPr>
+      <w:r>
+        <w:t>Animated the best path</w:t>
+      </w:r>
+    </w:p>
+    <w:p>
+      <w:pPr>
+        <w:pStyle w:val="ListParagraph"/>
+        <w:numPr>
+          <w:ilvl w:val="0"/>
+          <w:numId w:val="1"/>
+        </w:numPr>
+      </w:pPr>
+      <w:r>
+        <w:lastRenderedPageBreak/>
+        <w:t>Animated the GA evolution + a graph of the evolution</w:t>
+      </w:r>
+    </w:p>
+    <w:p/>
+    <w:p/>
+    <w:p>
+      <w:pPr>
+        <w:pStyle w:val="ListParagraph"/>
+        <w:numPr>
+          <w:ilvl w:val="0"/>
+          <w:numId w:val="1"/>
+        </w:numPr>
+      </w:pPr>
+      <w:r>
+        <w:t>Crossover types???</w:t>
+      </w:r>
+    </w:p>
+    <w:p>
+      <w:pPr>
+        <w:pStyle w:val="ListParagraph"/>
+        <w:numPr>
+          <w:ilvl w:val="0"/>
+          <w:numId w:val="1"/>
+        </w:numPr>
+      </w:pPr>
+      <w:r>
+        <w:t>Matrix over the best parent selection???</w:t>
       </w:r>
     </w:p>
     <w:sectPr>
@@ -108,6 +228,126 @@
     </w:sectPr>
   </w:body>
 </w:document>
+</file>
+
+<file path=word/numbering.xml><?xml version="1.0" encoding="utf-8"?>
+<w:numbering xmlns:wpc="http://schemas.microsoft.com/office/word/2010/wordprocessingCanvas" xmlns:cx="http://schemas.microsoft.com/office/drawing/2014/chartex" xmlns:cx1="http://schemas.microsoft.com/office/drawing/2015/9/8/chartex" xmlns:cx2="http://schemas.microsoft.com/office/drawing/2015/10/21/chartex" xmlns:cx3="http://schemas.microsoft.com/office/drawing/2016/5/9/chartex" xmlns:cx4="http://schemas.microsoft.com/office/drawing/2016/5/10/chartex" xmlns:cx5="http://schemas.microsoft.com/office/drawing/2016/5/11/chartex" xmlns:cx6="http://schemas.microsoft.com/office/drawing/2016/5/12/chartex" xmlns:cx7="http://schemas.microsoft.com/office/drawing/2016/5/13/chartex" xmlns:cx8="http://schemas.microsoft.com/office/drawing/2016/5/14/chartex" xmlns:mc="http://schemas.openxmlformats.org/markup-compatibility/2006" xmlns:aink="http://schemas.microsoft.com/office/drawing/2016/ink" xmlns:am3d="http://schemas.microsoft.com/office/drawing/2017/model3d" xmlns:o="urn:schemas-microsoft-com:office:office" xmlns:oel="http://schemas.microsoft.com/office/2019/extlst" xmlns:r="http://schemas.openxmlformats.org/officeDocument/2006/relationships" xmlns:m="http://schemas.openxmlformats.org/officeDocument/2006/math" xmlns:v="urn:schemas-microsoft-com:vml" xmlns:wp14="http://schemas.microsoft.com/office/word/2010/wordprocessingDrawing" xmlns:wp="http://schemas.openxmlformats.org/drawingml/2006/wordprocessingDrawing" xmlns:w10="urn:schemas-microsoft-com:office:word" xmlns:w="http://schemas.openxmlformats.org/wordprocessingml/2006/main" xmlns:w14="http://schemas.microsoft.com/office/word/2010/wordml" xmlns:w15="http://schemas.microsoft.com/office/word/2012/wordml" xmlns:w16cex="http://schemas.microsoft.com/office/word/2018/wordml/cex" xmlns:w16cid="http://schemas.microsoft.com/office/word/2016/wordml/cid" xmlns:w16="http://schemas.microsoft.com/office/word/2018/wordml" xmlns:w16du="http://schemas.microsoft.com/office/word/2023/wordml/word16du" xmlns:w16sdtdh="http://schemas.microsoft.com/office/word/2020/wordml/sdtdatahash" xmlns:w16sdtfl="http://schemas.microsoft.com/office/word/2024/wordml/sdtformatlock" xmlns:w16se="http://schemas.microsoft.com/office/word/2015/wordml/symex" xmlns:wpg="http://schemas.microsoft.com/office/word/2010/wordprocessingGroup" xmlns:wpi="http://schemas.microsoft.com/office/word/2010/wordprocessingInk" xmlns:wne="http://schemas.microsoft.com/office/word/2006/wordml" xmlns:wps="http://schemas.microsoft.com/office/word/2010/wordprocessingShape" mc:Ignorable="w14 w15 w16se w16cid w16 w16cex w16sdtdh w16sdtfl w16du wp14">
+  <w:abstractNum w:abstractNumId="0" w15:restartNumberingAfterBreak="0">
+    <w:nsid w:val="56F407D2"/>
+    <w:multiLevelType w:val="hybridMultilevel"/>
+    <w:tmpl w:val="2D12985C"/>
+    <w:lvl w:ilvl="0" w:tplc="32C03824">
+      <w:numFmt w:val="bullet"/>
+      <w:lvlText w:val="-"/>
+      <w:lvlJc w:val="left"/>
+      <w:pPr>
+        <w:ind w:left="720" w:hanging="360"/>
+      </w:pPr>
+      <w:rPr>
+        <w:rFonts w:ascii="Aptos" w:eastAsiaTheme="minorHAnsi" w:hAnsi="Aptos" w:cstheme="minorBidi" w:hint="default"/>
+      </w:rPr>
+    </w:lvl>
+    <w:lvl w:ilvl="1" w:tplc="20000003" w:tentative="1">
+      <w:start w:val="1"/>
+      <w:numFmt w:val="bullet"/>
+      <w:lvlText w:val="o"/>
+      <w:lvlJc w:val="left"/>
+      <w:pPr>
+        <w:ind w:left="1440" w:hanging="360"/>
+      </w:pPr>
+      <w:rPr>
+        <w:rFonts w:ascii="Courier New" w:hAnsi="Courier New" w:cs="Courier New" w:hint="default"/>
+      </w:rPr>
+    </w:lvl>
+    <w:lvl w:ilvl="2" w:tplc="20000005" w:tentative="1">
+      <w:start w:val="1"/>
+      <w:numFmt w:val="bullet"/>
+      <w:lvlText w:val=""/>
+      <w:lvlJc w:val="left"/>
+      <w:pPr>
+        <w:ind w:left="2160" w:hanging="360"/>
+      </w:pPr>
+      <w:rPr>
+        <w:rFonts w:ascii="Wingdings" w:hAnsi="Wingdings" w:hint="default"/>
+      </w:rPr>
+    </w:lvl>
+    <w:lvl w:ilvl="3" w:tplc="20000001" w:tentative="1">
+      <w:start w:val="1"/>
+      <w:numFmt w:val="bullet"/>
+      <w:lvlText w:val=""/>
+      <w:lvlJc w:val="left"/>
+      <w:pPr>
+        <w:ind w:left="2880" w:hanging="360"/>
+      </w:pPr>
+      <w:rPr>
+        <w:rFonts w:ascii="Symbol" w:hAnsi="Symbol" w:hint="default"/>
+      </w:rPr>
+    </w:lvl>
+    <w:lvl w:ilvl="4" w:tplc="20000003" w:tentative="1">
+      <w:start w:val="1"/>
+      <w:numFmt w:val="bullet"/>
+      <w:lvlText w:val="o"/>
+      <w:lvlJc w:val="left"/>
+      <w:pPr>
+        <w:ind w:left="3600" w:hanging="360"/>
+      </w:pPr>
+      <w:rPr>
+        <w:rFonts w:ascii="Courier New" w:hAnsi="Courier New" w:cs="Courier New" w:hint="default"/>
+      </w:rPr>
+    </w:lvl>
+    <w:lvl w:ilvl="5" w:tplc="20000005" w:tentative="1">
+      <w:start w:val="1"/>
+      <w:numFmt w:val="bullet"/>
+      <w:lvlText w:val=""/>
+      <w:lvlJc w:val="left"/>
+      <w:pPr>
+        <w:ind w:left="4320" w:hanging="360"/>
+      </w:pPr>
+      <w:rPr>
+        <w:rFonts w:ascii="Wingdings" w:hAnsi="Wingdings" w:hint="default"/>
+      </w:rPr>
+    </w:lvl>
+    <w:lvl w:ilvl="6" w:tplc="20000001" w:tentative="1">
+      <w:start w:val="1"/>
+      <w:numFmt w:val="bullet"/>
+      <w:lvlText w:val=""/>
+      <w:lvlJc w:val="left"/>
+      <w:pPr>
+        <w:ind w:left="5040" w:hanging="360"/>
+      </w:pPr>
+      <w:rPr>
+        <w:rFonts w:ascii="Symbol" w:hAnsi="Symbol" w:hint="default"/>
+      </w:rPr>
+    </w:lvl>
+    <w:lvl w:ilvl="7" w:tplc="20000003" w:tentative="1">
+      <w:start w:val="1"/>
+      <w:numFmt w:val="bullet"/>
+      <w:lvlText w:val="o"/>
+      <w:lvlJc w:val="left"/>
+      <w:pPr>
+        <w:ind w:left="5760" w:hanging="360"/>
+      </w:pPr>
+      <w:rPr>
+        <w:rFonts w:ascii="Courier New" w:hAnsi="Courier New" w:cs="Courier New" w:hint="default"/>
+      </w:rPr>
+    </w:lvl>
+    <w:lvl w:ilvl="8" w:tplc="20000005" w:tentative="1">
+      <w:start w:val="1"/>
+      <w:numFmt w:val="bullet"/>
+      <w:lvlText w:val=""/>
+      <w:lvlJc w:val="left"/>
+      <w:pPr>
+        <w:ind w:left="6480" w:hanging="360"/>
+      </w:pPr>
+      <w:rPr>
+        <w:rFonts w:ascii="Wingdings" w:hAnsi="Wingdings" w:hint="default"/>
+      </w:rPr>
+    </w:lvl>
+  </w:abstractNum>
+  <w:num w:numId="1" w16cid:durableId="1064569920">
+    <w:abstractNumId w:val="0"/>
+  </w:num>
+</w:numbering>
 </file>
 
 <file path=word/styles.xml><?xml version="1.0" encoding="utf-8"?>

</xml_diff>

<commit_message>
cleaning up and fixing
</commit_message>
<xml_diff>
--- a/MiniProject_AP_MED2026_Clara.docx
+++ b/MiniProject_AP_MED2026_Clara.docx
@@ -45,7 +45,15 @@
       </w:r>
     </w:p>
     <w:p>
-      <w:r>
+      <w:pPr>
+        <w:rPr>
+          <w:color w:val="808080" w:themeColor="background1" w:themeShade="80"/>
+        </w:rPr>
+      </w:pPr>
+      <w:r>
+        <w:rPr>
+          <w:color w:val="808080" w:themeColor="background1" w:themeShade="80"/>
+        </w:rPr>
         <w:t>AI has been used in this project....</w:t>
       </w:r>
     </w:p>
@@ -65,6 +73,9 @@
         <w:br/>
       </w:r>
       <w:r>
+        <w:rPr>
+          <w:noProof/>
+        </w:rPr>
         <w:drawing>
           <wp:inline distT="0" distB="0" distL="0" distR="0" wp14:anchorId="6E7DC4F8" wp14:editId="317D617D">
             <wp:extent cx="3616036" cy="1391808"/>
@@ -118,6 +129,9 @@
         <w:pStyle w:val="Heading3"/>
       </w:pPr>
       <w:r>
+        <w:t xml:space="preserve">1.1 </w:t>
+      </w:r>
+      <w:r>
         <w:t>Purpose of the Project</w:t>
       </w:r>
     </w:p>
@@ -126,11 +140,13 @@
         <w:pStyle w:val="NormalWeb"/>
         <w:rPr>
           <w:rFonts w:asciiTheme="majorHAnsi" w:eastAsiaTheme="majorEastAsia" w:hAnsiTheme="majorHAnsi" w:cstheme="majorBidi"/>
-        </w:rPr>
-      </w:pPr>
-      <w:r>
-        <w:rPr>
-          <w:rFonts w:asciiTheme="majorHAnsi" w:eastAsiaTheme="majorEastAsia" w:hAnsiTheme="majorHAnsi" w:cstheme="majorBidi"/>
+          <w:color w:val="808080" w:themeColor="background1" w:themeShade="80"/>
+        </w:rPr>
+      </w:pPr>
+      <w:r>
+        <w:rPr>
+          <w:rFonts w:asciiTheme="majorHAnsi" w:eastAsiaTheme="majorEastAsia" w:hAnsiTheme="majorHAnsi" w:cstheme="majorBidi"/>
+          <w:color w:val="808080" w:themeColor="background1" w:themeShade="80"/>
         </w:rPr>
         <w:t>Explain:</w:t>
       </w:r>
@@ -144,11 +160,13 @@
         </w:numPr>
         <w:rPr>
           <w:rFonts w:asciiTheme="majorHAnsi" w:eastAsiaTheme="majorEastAsia" w:hAnsiTheme="majorHAnsi" w:cstheme="majorBidi"/>
-        </w:rPr>
-      </w:pPr>
-      <w:r>
-        <w:rPr>
-          <w:rFonts w:asciiTheme="majorHAnsi" w:eastAsiaTheme="majorEastAsia" w:hAnsiTheme="majorHAnsi" w:cstheme="majorBidi"/>
+          <w:color w:val="808080" w:themeColor="background1" w:themeShade="80"/>
+        </w:rPr>
+      </w:pPr>
+      <w:r>
+        <w:rPr>
+          <w:rFonts w:asciiTheme="majorHAnsi" w:eastAsiaTheme="majorEastAsia" w:hAnsiTheme="majorHAnsi" w:cstheme="majorBidi"/>
+          <w:color w:val="808080" w:themeColor="background1" w:themeShade="80"/>
         </w:rPr>
         <w:t xml:space="preserve">warehouse order picking problem </w:t>
       </w:r>
@@ -162,11 +180,13 @@
         </w:numPr>
         <w:rPr>
           <w:rFonts w:asciiTheme="majorHAnsi" w:eastAsiaTheme="majorEastAsia" w:hAnsiTheme="majorHAnsi" w:cstheme="majorBidi"/>
-        </w:rPr>
-      </w:pPr>
-      <w:r>
-        <w:rPr>
-          <w:rFonts w:asciiTheme="majorHAnsi" w:eastAsiaTheme="majorEastAsia" w:hAnsiTheme="majorHAnsi" w:cstheme="majorBidi"/>
+          <w:color w:val="808080" w:themeColor="background1" w:themeShade="80"/>
+        </w:rPr>
+      </w:pPr>
+      <w:r>
+        <w:rPr>
+          <w:rFonts w:asciiTheme="majorHAnsi" w:eastAsiaTheme="majorEastAsia" w:hAnsiTheme="majorHAnsi" w:cstheme="majorBidi"/>
+          <w:color w:val="808080" w:themeColor="background1" w:themeShade="80"/>
         </w:rPr>
         <w:t xml:space="preserve">importance of route optimization </w:t>
       </w:r>
@@ -180,11 +200,13 @@
         </w:numPr>
         <w:rPr>
           <w:rFonts w:asciiTheme="majorHAnsi" w:eastAsiaTheme="majorEastAsia" w:hAnsiTheme="majorHAnsi" w:cstheme="majorBidi"/>
-        </w:rPr>
-      </w:pPr>
-      <w:r>
-        <w:rPr>
-          <w:rFonts w:asciiTheme="majorHAnsi" w:eastAsiaTheme="majorEastAsia" w:hAnsiTheme="majorHAnsi" w:cstheme="majorBidi"/>
+          <w:color w:val="808080" w:themeColor="background1" w:themeShade="80"/>
+        </w:rPr>
+      </w:pPr>
+      <w:r>
+        <w:rPr>
+          <w:rFonts w:asciiTheme="majorHAnsi" w:eastAsiaTheme="majorEastAsia" w:hAnsiTheme="majorHAnsi" w:cstheme="majorBidi"/>
+          <w:color w:val="808080" w:themeColor="background1" w:themeShade="80"/>
         </w:rPr>
         <w:t xml:space="preserve">reducing travel distance/time </w:t>
       </w:r>
@@ -194,11 +216,13 @@
         <w:pStyle w:val="NormalWeb"/>
         <w:rPr>
           <w:rFonts w:asciiTheme="majorHAnsi" w:eastAsiaTheme="majorEastAsia" w:hAnsiTheme="majorHAnsi" w:cstheme="majorBidi"/>
-        </w:rPr>
-      </w:pPr>
-      <w:r>
-        <w:rPr>
-          <w:rFonts w:asciiTheme="majorHAnsi" w:eastAsiaTheme="majorEastAsia" w:hAnsiTheme="majorHAnsi" w:cstheme="majorBidi"/>
+          <w:color w:val="808080" w:themeColor="background1" w:themeShade="80"/>
+        </w:rPr>
+      </w:pPr>
+      <w:r>
+        <w:rPr>
+          <w:rFonts w:asciiTheme="majorHAnsi" w:eastAsiaTheme="majorEastAsia" w:hAnsiTheme="majorHAnsi" w:cstheme="majorBidi"/>
+          <w:color w:val="808080" w:themeColor="background1" w:themeShade="80"/>
         </w:rPr>
         <w:t>Example topics:</w:t>
       </w:r>
@@ -212,11 +236,13 @@
         </w:numPr>
         <w:rPr>
           <w:rFonts w:asciiTheme="majorHAnsi" w:eastAsiaTheme="majorEastAsia" w:hAnsiTheme="majorHAnsi" w:cstheme="majorBidi"/>
-        </w:rPr>
-      </w:pPr>
-      <w:r>
-        <w:rPr>
-          <w:rFonts w:asciiTheme="majorHAnsi" w:eastAsiaTheme="majorEastAsia" w:hAnsiTheme="majorHAnsi" w:cstheme="majorBidi"/>
+          <w:color w:val="808080" w:themeColor="background1" w:themeShade="80"/>
+        </w:rPr>
+      </w:pPr>
+      <w:r>
+        <w:rPr>
+          <w:rFonts w:asciiTheme="majorHAnsi" w:eastAsiaTheme="majorEastAsia" w:hAnsiTheme="majorHAnsi" w:cstheme="majorBidi"/>
+          <w:color w:val="808080" w:themeColor="background1" w:themeShade="80"/>
         </w:rPr>
         <w:t xml:space="preserve">logistics efficiency </w:t>
       </w:r>
@@ -230,11 +256,13 @@
         </w:numPr>
         <w:rPr>
           <w:rFonts w:asciiTheme="majorHAnsi" w:eastAsiaTheme="majorEastAsia" w:hAnsiTheme="majorHAnsi" w:cstheme="majorBidi"/>
-        </w:rPr>
-      </w:pPr>
-      <w:r>
-        <w:rPr>
-          <w:rFonts w:asciiTheme="majorHAnsi" w:eastAsiaTheme="majorEastAsia" w:hAnsiTheme="majorHAnsi" w:cstheme="majorBidi"/>
+          <w:color w:val="808080" w:themeColor="background1" w:themeShade="80"/>
+        </w:rPr>
+      </w:pPr>
+      <w:r>
+        <w:rPr>
+          <w:rFonts w:asciiTheme="majorHAnsi" w:eastAsiaTheme="majorEastAsia" w:hAnsiTheme="majorHAnsi" w:cstheme="majorBidi"/>
+          <w:color w:val="808080" w:themeColor="background1" w:themeShade="80"/>
         </w:rPr>
         <w:t xml:space="preserve">NP-hard routing problems </w:t>
       </w:r>
@@ -248,11 +276,13 @@
         </w:numPr>
         <w:rPr>
           <w:rFonts w:asciiTheme="majorHAnsi" w:eastAsiaTheme="majorEastAsia" w:hAnsiTheme="majorHAnsi" w:cstheme="majorBidi"/>
-        </w:rPr>
-      </w:pPr>
-      <w:r>
-        <w:rPr>
-          <w:rFonts w:asciiTheme="majorHAnsi" w:eastAsiaTheme="majorEastAsia" w:hAnsiTheme="majorHAnsi" w:cstheme="majorBidi"/>
+          <w:color w:val="808080" w:themeColor="background1" w:themeShade="80"/>
+        </w:rPr>
+      </w:pPr>
+      <w:r>
+        <w:rPr>
+          <w:rFonts w:asciiTheme="majorHAnsi" w:eastAsiaTheme="majorEastAsia" w:hAnsiTheme="majorHAnsi" w:cstheme="majorBidi"/>
+          <w:color w:val="808080" w:themeColor="background1" w:themeShade="80"/>
         </w:rPr>
         <w:t xml:space="preserve">automation in warehouses </w:t>
       </w:r>
@@ -269,16 +299,47 @@
           <w:rFonts w:asciiTheme="majorHAnsi" w:eastAsiaTheme="majorEastAsia" w:hAnsiTheme="majorHAnsi" w:cstheme="majorBidi"/>
         </w:rPr>
         <w:pict w14:anchorId="66D9E050">
-          <v:rect id="_x0000_i1480" style="width:0;height:1.5pt" o:hralign="center" o:hrstd="t" o:hr="t" fillcolor="#a0a0a0" stroked="f"/>
+          <v:rect id="_x0000_i1060" style="width:0;height:1.5pt" o:hralign="center" o:bullet="t" o:hrstd="t" o:hr="t" fillcolor="#a0a0a0" stroked="f"/>
         </w:pict>
       </w:r>
     </w:p>
     <w:p>
+      <w:r>
+        <w:t xml:space="preserve">Online shopping has become very normal and something consumers do not often think about is what happens after they have made their order. For physical items, the items </w:t>
+      </w:r>
+      <w:r>
+        <w:lastRenderedPageBreak/>
+        <w:t>must</w:t>
+      </w:r>
+      <w:r>
+        <w:t xml:space="preserve"> be picked up from where they are stored, packed, and shipped to the customer.</w:t>
+      </w:r>
+      <w:r>
+        <w:t xml:space="preserve"> </w:t>
+      </w:r>
+      <w:r>
+        <w:t>Depending on the size of the warehouse/store where the items need to be picked, there is a lot to gain from route optimization. By</w:t>
+      </w:r>
+      <w:r>
+        <w:t xml:space="preserve"> optimizing the picking order, it can reduce both travel distance and travel time. This will make the order ready faster, resulting in reduced need for workers</w:t>
+      </w:r>
+      <w:r>
+        <w:t xml:space="preserve"> and with that less expenses for the company. It can also be used to create efficient automated picking systems in a warehouse or alike.</w:t>
+      </w:r>
+    </w:p>
+    <w:p>
+      <w:r>
+        <w:t xml:space="preserve"> </w:t>
+      </w:r>
+    </w:p>
+    <w:p>
       <w:pPr>
         <w:pStyle w:val="Heading3"/>
       </w:pPr>
       <w:r>
-        <w:lastRenderedPageBreak/>
+        <w:t xml:space="preserve">1.2 </w:t>
+      </w:r>
+      <w:r>
         <w:t>Objectives</w:t>
       </w:r>
     </w:p>
@@ -287,11 +348,13 @@
         <w:pStyle w:val="NormalWeb"/>
         <w:rPr>
           <w:rFonts w:asciiTheme="majorHAnsi" w:eastAsiaTheme="majorEastAsia" w:hAnsiTheme="majorHAnsi" w:cstheme="majorBidi"/>
-        </w:rPr>
-      </w:pPr>
-      <w:r>
-        <w:rPr>
-          <w:rFonts w:asciiTheme="majorHAnsi" w:eastAsiaTheme="majorEastAsia" w:hAnsiTheme="majorHAnsi" w:cstheme="majorBidi"/>
+          <w:color w:val="808080" w:themeColor="background1" w:themeShade="80"/>
+        </w:rPr>
+      </w:pPr>
+      <w:r>
+        <w:rPr>
+          <w:rFonts w:asciiTheme="majorHAnsi" w:eastAsiaTheme="majorEastAsia" w:hAnsiTheme="majorHAnsi" w:cstheme="majorBidi"/>
+          <w:color w:val="808080" w:themeColor="background1" w:themeShade="80"/>
         </w:rPr>
         <w:t>State clearly what your system does:</w:t>
       </w:r>
@@ -301,11 +364,13 @@
         <w:pStyle w:val="NormalWeb"/>
         <w:rPr>
           <w:rFonts w:asciiTheme="majorHAnsi" w:eastAsiaTheme="majorEastAsia" w:hAnsiTheme="majorHAnsi" w:cstheme="majorBidi"/>
-        </w:rPr>
-      </w:pPr>
-      <w:r>
-        <w:rPr>
-          <w:rFonts w:asciiTheme="majorHAnsi" w:eastAsiaTheme="majorEastAsia" w:hAnsiTheme="majorHAnsi" w:cstheme="majorBidi"/>
+          <w:color w:val="808080" w:themeColor="background1" w:themeShade="80"/>
+        </w:rPr>
+      </w:pPr>
+      <w:r>
+        <w:rPr>
+          <w:rFonts w:asciiTheme="majorHAnsi" w:eastAsiaTheme="majorEastAsia" w:hAnsiTheme="majorHAnsi" w:cstheme="majorBidi"/>
+          <w:color w:val="808080" w:themeColor="background1" w:themeShade="80"/>
         </w:rPr>
         <w:t>Example:</w:t>
       </w:r>
@@ -319,11 +384,13 @@
         </w:numPr>
         <w:rPr>
           <w:rFonts w:asciiTheme="majorHAnsi" w:eastAsiaTheme="majorEastAsia" w:hAnsiTheme="majorHAnsi" w:cstheme="majorBidi"/>
-        </w:rPr>
-      </w:pPr>
-      <w:r>
-        <w:rPr>
-          <w:rFonts w:asciiTheme="majorHAnsi" w:eastAsiaTheme="majorEastAsia" w:hAnsiTheme="majorHAnsi" w:cstheme="majorBidi"/>
+          <w:color w:val="808080" w:themeColor="background1" w:themeShade="80"/>
+        </w:rPr>
+      </w:pPr>
+      <w:r>
+        <w:rPr>
+          <w:rFonts w:asciiTheme="majorHAnsi" w:eastAsiaTheme="majorEastAsia" w:hAnsiTheme="majorHAnsi" w:cstheme="majorBidi"/>
+          <w:color w:val="808080" w:themeColor="background1" w:themeShade="80"/>
         </w:rPr>
         <w:t xml:space="preserve">simulate warehouse navigation </w:t>
       </w:r>
@@ -337,11 +404,13 @@
         </w:numPr>
         <w:rPr>
           <w:rFonts w:asciiTheme="majorHAnsi" w:eastAsiaTheme="majorEastAsia" w:hAnsiTheme="majorHAnsi" w:cstheme="majorBidi"/>
-        </w:rPr>
-      </w:pPr>
-      <w:r>
-        <w:rPr>
-          <w:rFonts w:asciiTheme="majorHAnsi" w:eastAsiaTheme="majorEastAsia" w:hAnsiTheme="majorHAnsi" w:cstheme="majorBidi"/>
+          <w:color w:val="808080" w:themeColor="background1" w:themeShade="80"/>
+        </w:rPr>
+      </w:pPr>
+      <w:r>
+        <w:rPr>
+          <w:rFonts w:asciiTheme="majorHAnsi" w:eastAsiaTheme="majorEastAsia" w:hAnsiTheme="majorHAnsi" w:cstheme="majorBidi"/>
+          <w:color w:val="808080" w:themeColor="background1" w:themeShade="80"/>
         </w:rPr>
         <w:t xml:space="preserve">optimize picking order using a Genetic Algorithm </w:t>
       </w:r>
@@ -355,11 +424,13 @@
         </w:numPr>
         <w:rPr>
           <w:rFonts w:asciiTheme="majorHAnsi" w:eastAsiaTheme="majorEastAsia" w:hAnsiTheme="majorHAnsi" w:cstheme="majorBidi"/>
-        </w:rPr>
-      </w:pPr>
-      <w:r>
-        <w:rPr>
-          <w:rFonts w:asciiTheme="majorHAnsi" w:eastAsiaTheme="majorEastAsia" w:hAnsiTheme="majorHAnsi" w:cstheme="majorBidi"/>
+          <w:color w:val="808080" w:themeColor="background1" w:themeShade="80"/>
+        </w:rPr>
+      </w:pPr>
+      <w:r>
+        <w:rPr>
+          <w:rFonts w:asciiTheme="majorHAnsi" w:eastAsiaTheme="majorEastAsia" w:hAnsiTheme="majorHAnsi" w:cstheme="majorBidi"/>
+          <w:color w:val="808080" w:themeColor="background1" w:themeShade="80"/>
         </w:rPr>
         <w:t xml:space="preserve">use A* for shortest pathfinding between locations </w:t>
       </w:r>
@@ -373,11 +444,13 @@
         </w:numPr>
         <w:rPr>
           <w:rFonts w:asciiTheme="majorHAnsi" w:eastAsiaTheme="majorEastAsia" w:hAnsiTheme="majorHAnsi" w:cstheme="majorBidi"/>
-        </w:rPr>
-      </w:pPr>
-      <w:r>
-        <w:rPr>
-          <w:rFonts w:asciiTheme="majorHAnsi" w:eastAsiaTheme="majorEastAsia" w:hAnsiTheme="majorHAnsi" w:cstheme="majorBidi"/>
+          <w:color w:val="808080" w:themeColor="background1" w:themeShade="80"/>
+        </w:rPr>
+      </w:pPr>
+      <w:r>
+        <w:rPr>
+          <w:rFonts w:asciiTheme="majorHAnsi" w:eastAsiaTheme="majorEastAsia" w:hAnsiTheme="majorHAnsi" w:cstheme="majorBidi"/>
+          <w:color w:val="808080" w:themeColor="background1" w:themeShade="80"/>
         </w:rPr>
         <w:t xml:space="preserve">compare optimization strategies and configurations </w:t>
       </w:r>
@@ -400,10 +473,11 @@
           <w:szCs w:val="32"/>
         </w:rPr>
         <w:pict w14:anchorId="4F7F5193">
-          <v:rect id="_x0000_i1481" style="width:0;height:1.5pt" o:hralign="center" o:hrstd="t" o:hr="t" fillcolor="#a0a0a0" stroked="f"/>
+          <v:rect id="_x0000_i1026" style="width:0;height:1.5pt" o:hralign="center" o:hrstd="t" o:hr="t" fillcolor="#a0a0a0" stroked="f"/>
         </w:pict>
       </w:r>
     </w:p>
+    <w:p/>
     <w:p>
       <w:pPr>
         <w:pStyle w:val="Heading2"/>
@@ -417,11 +491,13 @@
         <w:pStyle w:val="NormalWeb"/>
         <w:rPr>
           <w:rFonts w:asciiTheme="majorHAnsi" w:eastAsiaTheme="majorEastAsia" w:hAnsiTheme="majorHAnsi" w:cstheme="majorBidi"/>
-        </w:rPr>
-      </w:pPr>
-      <w:r>
-        <w:rPr>
-          <w:rFonts w:asciiTheme="majorHAnsi" w:eastAsiaTheme="majorEastAsia" w:hAnsiTheme="majorHAnsi" w:cstheme="majorBidi"/>
+          <w:color w:val="808080" w:themeColor="background1" w:themeShade="80"/>
+        </w:rPr>
+      </w:pPr>
+      <w:r>
+        <w:rPr>
+          <w:rFonts w:asciiTheme="majorHAnsi" w:eastAsiaTheme="majorEastAsia" w:hAnsiTheme="majorHAnsi" w:cstheme="majorBidi"/>
+          <w:color w:val="808080" w:themeColor="background1" w:themeShade="80"/>
         </w:rPr>
         <w:t>This section explains the algorithms conceptually.</w:t>
       </w:r>
@@ -444,10 +520,11 @@
           <w:szCs w:val="32"/>
         </w:rPr>
         <w:pict w14:anchorId="62695F8C">
-          <v:rect id="_x0000_i1482" style="width:0;height:1.5pt" o:hralign="center" o:hrstd="t" o:hr="t" fillcolor="#a0a0a0" stroked="f"/>
+          <v:rect id="_x0000_i1063" style="width:0;height:1.5pt" o:hralign="center" o:bullet="t" o:hrstd="t" o:hr="t" fillcolor="#a0a0a0" stroked="f"/>
         </w:pict>
       </w:r>
     </w:p>
+    <w:p/>
     <w:p>
       <w:pPr>
         <w:pStyle w:val="Heading3"/>
@@ -461,11 +538,13 @@
         <w:pStyle w:val="NormalWeb"/>
         <w:rPr>
           <w:rFonts w:asciiTheme="majorHAnsi" w:eastAsiaTheme="majorEastAsia" w:hAnsiTheme="majorHAnsi" w:cstheme="majorBidi"/>
-        </w:rPr>
-      </w:pPr>
-      <w:r>
-        <w:rPr>
-          <w:rFonts w:asciiTheme="majorHAnsi" w:eastAsiaTheme="majorEastAsia" w:hAnsiTheme="majorHAnsi" w:cstheme="majorBidi"/>
+          <w:color w:val="808080" w:themeColor="background1" w:themeShade="80"/>
+        </w:rPr>
+      </w:pPr>
+      <w:r>
+        <w:rPr>
+          <w:rFonts w:asciiTheme="majorHAnsi" w:eastAsiaTheme="majorEastAsia" w:hAnsiTheme="majorHAnsi" w:cstheme="majorBidi"/>
+          <w:color w:val="808080" w:themeColor="background1" w:themeShade="80"/>
         </w:rPr>
         <w:t>Explain:</w:t>
       </w:r>
@@ -479,11 +558,13 @@
         </w:numPr>
         <w:rPr>
           <w:rFonts w:asciiTheme="majorHAnsi" w:eastAsiaTheme="majorEastAsia" w:hAnsiTheme="majorHAnsi" w:cstheme="majorBidi"/>
-        </w:rPr>
-      </w:pPr>
-      <w:r>
-        <w:rPr>
-          <w:rFonts w:asciiTheme="majorHAnsi" w:eastAsiaTheme="majorEastAsia" w:hAnsiTheme="majorHAnsi" w:cstheme="majorBidi"/>
+          <w:color w:val="808080" w:themeColor="background1" w:themeShade="80"/>
+        </w:rPr>
+      </w:pPr>
+      <w:r>
+        <w:rPr>
+          <w:rFonts w:asciiTheme="majorHAnsi" w:eastAsiaTheme="majorEastAsia" w:hAnsiTheme="majorHAnsi" w:cstheme="majorBidi"/>
+          <w:color w:val="808080" w:themeColor="background1" w:themeShade="80"/>
         </w:rPr>
         <w:t xml:space="preserve">grids </w:t>
       </w:r>
@@ -497,11 +578,13 @@
         </w:numPr>
         <w:rPr>
           <w:rFonts w:asciiTheme="majorHAnsi" w:eastAsiaTheme="majorEastAsia" w:hAnsiTheme="majorHAnsi" w:cstheme="majorBidi"/>
-        </w:rPr>
-      </w:pPr>
-      <w:r>
-        <w:rPr>
-          <w:rFonts w:asciiTheme="majorHAnsi" w:eastAsiaTheme="majorEastAsia" w:hAnsiTheme="majorHAnsi" w:cstheme="majorBidi"/>
+          <w:color w:val="808080" w:themeColor="background1" w:themeShade="80"/>
+        </w:rPr>
+      </w:pPr>
+      <w:r>
+        <w:rPr>
+          <w:rFonts w:asciiTheme="majorHAnsi" w:eastAsiaTheme="majorEastAsia" w:hAnsiTheme="majorHAnsi" w:cstheme="majorBidi"/>
+          <w:color w:val="808080" w:themeColor="background1" w:themeShade="80"/>
         </w:rPr>
         <w:t xml:space="preserve">obstacles/shelves </w:t>
       </w:r>
@@ -515,11 +598,13 @@
         </w:numPr>
         <w:rPr>
           <w:rFonts w:asciiTheme="majorHAnsi" w:eastAsiaTheme="majorEastAsia" w:hAnsiTheme="majorHAnsi" w:cstheme="majorBidi"/>
-        </w:rPr>
-      </w:pPr>
-      <w:r>
-        <w:rPr>
-          <w:rFonts w:asciiTheme="majorHAnsi" w:eastAsiaTheme="majorEastAsia" w:hAnsiTheme="majorHAnsi" w:cstheme="majorBidi"/>
+          <w:color w:val="808080" w:themeColor="background1" w:themeShade="80"/>
+        </w:rPr>
+      </w:pPr>
+      <w:r>
+        <w:rPr>
+          <w:rFonts w:asciiTheme="majorHAnsi" w:eastAsiaTheme="majorEastAsia" w:hAnsiTheme="majorHAnsi" w:cstheme="majorBidi"/>
+          <w:color w:val="808080" w:themeColor="background1" w:themeShade="80"/>
         </w:rPr>
         <w:t xml:space="preserve">shortest path search </w:t>
       </w:r>
@@ -533,11 +618,13 @@
         </w:numPr>
         <w:rPr>
           <w:rFonts w:asciiTheme="majorHAnsi" w:eastAsiaTheme="majorEastAsia" w:hAnsiTheme="majorHAnsi" w:cstheme="majorBidi"/>
-        </w:rPr>
-      </w:pPr>
-      <w:r>
-        <w:rPr>
-          <w:rFonts w:asciiTheme="majorHAnsi" w:eastAsiaTheme="majorEastAsia" w:hAnsiTheme="majorHAnsi" w:cstheme="majorBidi"/>
+          <w:color w:val="808080" w:themeColor="background1" w:themeShade="80"/>
+        </w:rPr>
+      </w:pPr>
+      <w:r>
+        <w:rPr>
+          <w:rFonts w:asciiTheme="majorHAnsi" w:eastAsiaTheme="majorEastAsia" w:hAnsiTheme="majorHAnsi" w:cstheme="majorBidi"/>
+          <w:color w:val="808080" w:themeColor="background1" w:themeShade="80"/>
         </w:rPr>
         <w:t xml:space="preserve">heuristic (Manhattan distance) </w:t>
       </w:r>
@@ -547,11 +634,13 @@
         <w:pStyle w:val="NormalWeb"/>
         <w:rPr>
           <w:rFonts w:asciiTheme="majorHAnsi" w:eastAsiaTheme="majorEastAsia" w:hAnsiTheme="majorHAnsi" w:cstheme="majorBidi"/>
-        </w:rPr>
-      </w:pPr>
-      <w:r>
-        <w:rPr>
-          <w:rFonts w:asciiTheme="majorHAnsi" w:eastAsiaTheme="majorEastAsia" w:hAnsiTheme="majorHAnsi" w:cstheme="majorBidi"/>
+          <w:color w:val="808080" w:themeColor="background1" w:themeShade="80"/>
+        </w:rPr>
+      </w:pPr>
+      <w:r>
+        <w:rPr>
+          <w:rFonts w:asciiTheme="majorHAnsi" w:eastAsiaTheme="majorEastAsia" w:hAnsiTheme="majorHAnsi" w:cstheme="majorBidi"/>
+          <w:color w:val="808080" w:themeColor="background1" w:themeShade="80"/>
         </w:rPr>
         <w:t>Include:</w:t>
       </w:r>
@@ -565,11 +654,13 @@
         </w:numPr>
         <w:rPr>
           <w:rFonts w:asciiTheme="majorHAnsi" w:eastAsiaTheme="majorEastAsia" w:hAnsiTheme="majorHAnsi" w:cstheme="majorBidi"/>
-        </w:rPr>
-      </w:pPr>
-      <w:r>
-        <w:rPr>
-          <w:rFonts w:asciiTheme="majorHAnsi" w:eastAsiaTheme="majorEastAsia" w:hAnsiTheme="majorHAnsi" w:cstheme="majorBidi"/>
+          <w:color w:val="808080" w:themeColor="background1" w:themeShade="80"/>
+        </w:rPr>
+      </w:pPr>
+      <w:r>
+        <w:rPr>
+          <w:rFonts w:asciiTheme="majorHAnsi" w:eastAsiaTheme="majorEastAsia" w:hAnsiTheme="majorHAnsi" w:cstheme="majorBidi"/>
+          <w:color w:val="808080" w:themeColor="background1" w:themeShade="80"/>
         </w:rPr>
         <w:t xml:space="preserve">simple A* explanation </w:t>
       </w:r>
@@ -583,11 +674,13 @@
         </w:numPr>
         <w:rPr>
           <w:rFonts w:asciiTheme="majorHAnsi" w:eastAsiaTheme="majorEastAsia" w:hAnsiTheme="majorHAnsi" w:cstheme="majorBidi"/>
-        </w:rPr>
-      </w:pPr>
-      <w:r>
-        <w:rPr>
-          <w:rFonts w:asciiTheme="majorHAnsi" w:eastAsiaTheme="majorEastAsia" w:hAnsiTheme="majorHAnsi" w:cstheme="majorBidi"/>
+          <w:color w:val="808080" w:themeColor="background1" w:themeShade="80"/>
+        </w:rPr>
+      </w:pPr>
+      <w:r>
+        <w:rPr>
+          <w:rFonts w:asciiTheme="majorHAnsi" w:eastAsiaTheme="majorEastAsia" w:hAnsiTheme="majorHAnsi" w:cstheme="majorBidi"/>
+          <w:color w:val="808080" w:themeColor="background1" w:themeShade="80"/>
         </w:rPr>
         <w:t xml:space="preserve">why A* is suitable for warehouses </w:t>
       </w:r>
@@ -609,11 +702,13 @@
           <w:sz w:val="32"/>
           <w:szCs w:val="32"/>
         </w:rPr>
+        <w:lastRenderedPageBreak/>
         <w:pict w14:anchorId="7F837451">
-          <v:rect id="_x0000_i1483" style="width:0;height:1.5pt" o:hralign="center" o:hrstd="t" o:hr="t" fillcolor="#a0a0a0" stroked="f"/>
+          <v:rect id="_x0000_i1066" style="width:0;height:1.5pt" o:hralign="center" o:bullet="t" o:hrstd="t" o:hr="t" fillcolor="#a0a0a0" stroked="f"/>
         </w:pict>
       </w:r>
     </w:p>
+    <w:p/>
     <w:p>
       <w:pPr>
         <w:pStyle w:val="Heading3"/>
@@ -627,11 +722,13 @@
         <w:pStyle w:val="NormalWeb"/>
         <w:rPr>
           <w:rFonts w:asciiTheme="majorHAnsi" w:eastAsiaTheme="majorEastAsia" w:hAnsiTheme="majorHAnsi" w:cstheme="majorBidi"/>
-        </w:rPr>
-      </w:pPr>
-      <w:r>
-        <w:rPr>
-          <w:rFonts w:asciiTheme="majorHAnsi" w:eastAsiaTheme="majorEastAsia" w:hAnsiTheme="majorHAnsi" w:cstheme="majorBidi"/>
+          <w:color w:val="808080" w:themeColor="background1" w:themeShade="80"/>
+        </w:rPr>
+      </w:pPr>
+      <w:r>
+        <w:rPr>
+          <w:rFonts w:asciiTheme="majorHAnsi" w:eastAsiaTheme="majorEastAsia" w:hAnsiTheme="majorHAnsi" w:cstheme="majorBidi"/>
+          <w:color w:val="808080" w:themeColor="background1" w:themeShade="80"/>
         </w:rPr>
         <w:t>Explain:</w:t>
       </w:r>
@@ -645,11 +742,13 @@
         </w:numPr>
         <w:rPr>
           <w:rFonts w:asciiTheme="majorHAnsi" w:eastAsiaTheme="majorEastAsia" w:hAnsiTheme="majorHAnsi" w:cstheme="majorBidi"/>
-        </w:rPr>
-      </w:pPr>
-      <w:r>
-        <w:rPr>
-          <w:rFonts w:asciiTheme="majorHAnsi" w:eastAsiaTheme="majorEastAsia" w:hAnsiTheme="majorHAnsi" w:cstheme="majorBidi"/>
+          <w:color w:val="808080" w:themeColor="background1" w:themeShade="80"/>
+        </w:rPr>
+      </w:pPr>
+      <w:r>
+        <w:rPr>
+          <w:rFonts w:asciiTheme="majorHAnsi" w:eastAsiaTheme="majorEastAsia" w:hAnsiTheme="majorHAnsi" w:cstheme="majorBidi"/>
+          <w:color w:val="808080" w:themeColor="background1" w:themeShade="80"/>
         </w:rPr>
         <w:t xml:space="preserve">population </w:t>
       </w:r>
@@ -663,11 +762,13 @@
         </w:numPr>
         <w:rPr>
           <w:rFonts w:asciiTheme="majorHAnsi" w:eastAsiaTheme="majorEastAsia" w:hAnsiTheme="majorHAnsi" w:cstheme="majorBidi"/>
-        </w:rPr>
-      </w:pPr>
-      <w:r>
-        <w:rPr>
-          <w:rFonts w:asciiTheme="majorHAnsi" w:eastAsiaTheme="majorEastAsia" w:hAnsiTheme="majorHAnsi" w:cstheme="majorBidi"/>
+          <w:color w:val="808080" w:themeColor="background1" w:themeShade="80"/>
+        </w:rPr>
+      </w:pPr>
+      <w:r>
+        <w:rPr>
+          <w:rFonts w:asciiTheme="majorHAnsi" w:eastAsiaTheme="majorEastAsia" w:hAnsiTheme="majorHAnsi" w:cstheme="majorBidi"/>
+          <w:color w:val="808080" w:themeColor="background1" w:themeShade="80"/>
         </w:rPr>
         <w:t xml:space="preserve">fitness </w:t>
       </w:r>
@@ -681,11 +782,13 @@
         </w:numPr>
         <w:rPr>
           <w:rFonts w:asciiTheme="majorHAnsi" w:eastAsiaTheme="majorEastAsia" w:hAnsiTheme="majorHAnsi" w:cstheme="majorBidi"/>
-        </w:rPr>
-      </w:pPr>
-      <w:r>
-        <w:rPr>
-          <w:rFonts w:asciiTheme="majorHAnsi" w:eastAsiaTheme="majorEastAsia" w:hAnsiTheme="majorHAnsi" w:cstheme="majorBidi"/>
+          <w:color w:val="808080" w:themeColor="background1" w:themeShade="80"/>
+        </w:rPr>
+      </w:pPr>
+      <w:r>
+        <w:rPr>
+          <w:rFonts w:asciiTheme="majorHAnsi" w:eastAsiaTheme="majorEastAsia" w:hAnsiTheme="majorHAnsi" w:cstheme="majorBidi"/>
+          <w:color w:val="808080" w:themeColor="background1" w:themeShade="80"/>
         </w:rPr>
         <w:t xml:space="preserve">selection </w:t>
       </w:r>
@@ -699,11 +802,13 @@
         </w:numPr>
         <w:rPr>
           <w:rFonts w:asciiTheme="majorHAnsi" w:eastAsiaTheme="majorEastAsia" w:hAnsiTheme="majorHAnsi" w:cstheme="majorBidi"/>
-        </w:rPr>
-      </w:pPr>
-      <w:r>
-        <w:rPr>
-          <w:rFonts w:asciiTheme="majorHAnsi" w:eastAsiaTheme="majorEastAsia" w:hAnsiTheme="majorHAnsi" w:cstheme="majorBidi"/>
+          <w:color w:val="808080" w:themeColor="background1" w:themeShade="80"/>
+        </w:rPr>
+      </w:pPr>
+      <w:r>
+        <w:rPr>
+          <w:rFonts w:asciiTheme="majorHAnsi" w:eastAsiaTheme="majorEastAsia" w:hAnsiTheme="majorHAnsi" w:cstheme="majorBidi"/>
+          <w:color w:val="808080" w:themeColor="background1" w:themeShade="80"/>
         </w:rPr>
         <w:t xml:space="preserve">crossover </w:t>
       </w:r>
@@ -717,11 +822,13 @@
         </w:numPr>
         <w:rPr>
           <w:rFonts w:asciiTheme="majorHAnsi" w:eastAsiaTheme="majorEastAsia" w:hAnsiTheme="majorHAnsi" w:cstheme="majorBidi"/>
-        </w:rPr>
-      </w:pPr>
-      <w:r>
-        <w:rPr>
-          <w:rFonts w:asciiTheme="majorHAnsi" w:eastAsiaTheme="majorEastAsia" w:hAnsiTheme="majorHAnsi" w:cstheme="majorBidi"/>
+          <w:color w:val="808080" w:themeColor="background1" w:themeShade="80"/>
+        </w:rPr>
+      </w:pPr>
+      <w:r>
+        <w:rPr>
+          <w:rFonts w:asciiTheme="majorHAnsi" w:eastAsiaTheme="majorEastAsia" w:hAnsiTheme="majorHAnsi" w:cstheme="majorBidi"/>
+          <w:color w:val="808080" w:themeColor="background1" w:themeShade="80"/>
         </w:rPr>
         <w:t xml:space="preserve">mutation </w:t>
       </w:r>
@@ -731,13 +838,14 @@
         <w:pStyle w:val="NormalWeb"/>
         <w:rPr>
           <w:rFonts w:asciiTheme="majorHAnsi" w:eastAsiaTheme="majorEastAsia" w:hAnsiTheme="majorHAnsi" w:cstheme="majorBidi"/>
-        </w:rPr>
-      </w:pPr>
-      <w:r>
-        <w:rPr>
-          <w:rFonts w:asciiTheme="majorHAnsi" w:eastAsiaTheme="majorEastAsia" w:hAnsiTheme="majorHAnsi" w:cstheme="majorBidi"/>
-        </w:rPr>
-        <w:lastRenderedPageBreak/>
+          <w:color w:val="808080" w:themeColor="background1" w:themeShade="80"/>
+        </w:rPr>
+      </w:pPr>
+      <w:r>
+        <w:rPr>
+          <w:rFonts w:asciiTheme="majorHAnsi" w:eastAsiaTheme="majorEastAsia" w:hAnsiTheme="majorHAnsi" w:cstheme="majorBidi"/>
+          <w:color w:val="808080" w:themeColor="background1" w:themeShade="80"/>
+        </w:rPr>
         <w:t>Then explain your specific implementation:</w:t>
       </w:r>
     </w:p>
@@ -750,11 +858,13 @@
         </w:numPr>
         <w:rPr>
           <w:rFonts w:asciiTheme="majorHAnsi" w:eastAsiaTheme="majorEastAsia" w:hAnsiTheme="majorHAnsi" w:cstheme="majorBidi"/>
-        </w:rPr>
-      </w:pPr>
-      <w:r>
-        <w:rPr>
-          <w:rFonts w:asciiTheme="majorHAnsi" w:eastAsiaTheme="majorEastAsia" w:hAnsiTheme="majorHAnsi" w:cstheme="majorBidi"/>
+          <w:color w:val="808080" w:themeColor="background1" w:themeShade="80"/>
+        </w:rPr>
+      </w:pPr>
+      <w:r>
+        <w:rPr>
+          <w:rFonts w:asciiTheme="majorHAnsi" w:eastAsiaTheme="majorEastAsia" w:hAnsiTheme="majorHAnsi" w:cstheme="majorBidi"/>
+          <w:color w:val="808080" w:themeColor="background1" w:themeShade="80"/>
         </w:rPr>
         <w:t xml:space="preserve">permutation representation </w:t>
       </w:r>
@@ -768,11 +878,13 @@
         </w:numPr>
         <w:rPr>
           <w:rFonts w:asciiTheme="majorHAnsi" w:eastAsiaTheme="majorEastAsia" w:hAnsiTheme="majorHAnsi" w:cstheme="majorBidi"/>
-        </w:rPr>
-      </w:pPr>
-      <w:r>
-        <w:rPr>
-          <w:rFonts w:asciiTheme="majorHAnsi" w:eastAsiaTheme="majorEastAsia" w:hAnsiTheme="majorHAnsi" w:cstheme="majorBidi"/>
+          <w:color w:val="808080" w:themeColor="background1" w:themeShade="80"/>
+        </w:rPr>
+      </w:pPr>
+      <w:r>
+        <w:rPr>
+          <w:rFonts w:asciiTheme="majorHAnsi" w:eastAsiaTheme="majorEastAsia" w:hAnsiTheme="majorHAnsi" w:cstheme="majorBidi"/>
+          <w:color w:val="808080" w:themeColor="background1" w:themeShade="80"/>
         </w:rPr>
         <w:t xml:space="preserve">route optimization </w:t>
       </w:r>
@@ -786,11 +898,13 @@
         </w:numPr>
         <w:rPr>
           <w:rFonts w:asciiTheme="majorHAnsi" w:eastAsiaTheme="majorEastAsia" w:hAnsiTheme="majorHAnsi" w:cstheme="majorBidi"/>
-        </w:rPr>
-      </w:pPr>
-      <w:r>
-        <w:rPr>
-          <w:rFonts w:asciiTheme="majorHAnsi" w:eastAsiaTheme="majorEastAsia" w:hAnsiTheme="majorHAnsi" w:cstheme="majorBidi"/>
+          <w:color w:val="808080" w:themeColor="background1" w:themeShade="80"/>
+        </w:rPr>
+      </w:pPr>
+      <w:r>
+        <w:rPr>
+          <w:rFonts w:asciiTheme="majorHAnsi" w:eastAsiaTheme="majorEastAsia" w:hAnsiTheme="majorHAnsi" w:cstheme="majorBidi"/>
+          <w:color w:val="808080" w:themeColor="background1" w:themeShade="80"/>
         </w:rPr>
         <w:t xml:space="preserve">mutation swapping </w:t>
       </w:r>
@@ -804,11 +918,13 @@
         </w:numPr>
         <w:rPr>
           <w:rFonts w:asciiTheme="majorHAnsi" w:eastAsiaTheme="majorEastAsia" w:hAnsiTheme="majorHAnsi" w:cstheme="majorBidi"/>
-        </w:rPr>
-      </w:pPr>
-      <w:r>
-        <w:rPr>
-          <w:rFonts w:asciiTheme="majorHAnsi" w:eastAsiaTheme="majorEastAsia" w:hAnsiTheme="majorHAnsi" w:cstheme="majorBidi"/>
+          <w:color w:val="808080" w:themeColor="background1" w:themeShade="80"/>
+        </w:rPr>
+      </w:pPr>
+      <w:r>
+        <w:rPr>
+          <w:rFonts w:asciiTheme="majorHAnsi" w:eastAsiaTheme="majorEastAsia" w:hAnsiTheme="majorHAnsi" w:cstheme="majorBidi"/>
+          <w:color w:val="808080" w:themeColor="background1" w:themeShade="80"/>
         </w:rPr>
         <w:t xml:space="preserve">crossover type (Order Crossover / OX) </w:t>
       </w:r>
@@ -831,10 +947,11 @@
           <w:szCs w:val="32"/>
         </w:rPr>
         <w:pict w14:anchorId="71124E4B">
-          <v:rect id="_x0000_i1484" style="width:0;height:1.5pt" o:hralign="center" o:hrstd="t" o:hr="t" fillcolor="#a0a0a0" stroked="f"/>
+          <v:rect id="_x0000_i1029" style="width:0;height:1.5pt" o:hralign="center" o:hrstd="t" o:hr="t" fillcolor="#a0a0a0" stroked="f"/>
         </w:pict>
       </w:r>
     </w:p>
+    <w:p/>
     <w:p>
       <w:pPr>
         <w:pStyle w:val="Heading3"/>
@@ -848,11 +965,13 @@
         <w:pStyle w:val="NormalWeb"/>
         <w:rPr>
           <w:rFonts w:asciiTheme="majorHAnsi" w:eastAsiaTheme="majorEastAsia" w:hAnsiTheme="majorHAnsi" w:cstheme="majorBidi"/>
-        </w:rPr>
-      </w:pPr>
-      <w:r>
-        <w:rPr>
-          <w:rFonts w:asciiTheme="majorHAnsi" w:eastAsiaTheme="majorEastAsia" w:hAnsiTheme="majorHAnsi" w:cstheme="majorBidi"/>
+          <w:color w:val="808080" w:themeColor="background1" w:themeShade="80"/>
+        </w:rPr>
+      </w:pPr>
+      <w:r>
+        <w:rPr>
+          <w:rFonts w:asciiTheme="majorHAnsi" w:eastAsiaTheme="majorEastAsia" w:hAnsiTheme="majorHAnsi" w:cstheme="majorBidi"/>
+          <w:color w:val="808080" w:themeColor="background1" w:themeShade="80"/>
         </w:rPr>
         <w:t>Explain:</w:t>
       </w:r>
@@ -866,11 +985,13 @@
         </w:numPr>
         <w:rPr>
           <w:rFonts w:asciiTheme="majorHAnsi" w:eastAsiaTheme="majorEastAsia" w:hAnsiTheme="majorHAnsi" w:cstheme="majorBidi"/>
-        </w:rPr>
-      </w:pPr>
-      <w:r>
-        <w:rPr>
-          <w:rFonts w:asciiTheme="majorHAnsi" w:eastAsiaTheme="majorEastAsia" w:hAnsiTheme="majorHAnsi" w:cstheme="majorBidi"/>
+          <w:color w:val="808080" w:themeColor="background1" w:themeShade="80"/>
+        </w:rPr>
+      </w:pPr>
+      <w:r>
+        <w:rPr>
+          <w:rFonts w:asciiTheme="majorHAnsi" w:eastAsiaTheme="majorEastAsia" w:hAnsiTheme="majorHAnsi" w:cstheme="majorBidi"/>
+          <w:color w:val="808080" w:themeColor="background1" w:themeShade="80"/>
         </w:rPr>
         <w:t xml:space="preserve">Travelling Salesman similarity </w:t>
       </w:r>
@@ -884,11 +1005,13 @@
         </w:numPr>
         <w:rPr>
           <w:rFonts w:asciiTheme="majorHAnsi" w:eastAsiaTheme="majorEastAsia" w:hAnsiTheme="majorHAnsi" w:cstheme="majorBidi"/>
-        </w:rPr>
-      </w:pPr>
-      <w:r>
-        <w:rPr>
-          <w:rFonts w:asciiTheme="majorHAnsi" w:eastAsiaTheme="majorEastAsia" w:hAnsiTheme="majorHAnsi" w:cstheme="majorBidi"/>
+          <w:color w:val="808080" w:themeColor="background1" w:themeShade="80"/>
+        </w:rPr>
+      </w:pPr>
+      <w:r>
+        <w:rPr>
+          <w:rFonts w:asciiTheme="majorHAnsi" w:eastAsiaTheme="majorEastAsia" w:hAnsiTheme="majorHAnsi" w:cstheme="majorBidi"/>
+          <w:color w:val="808080" w:themeColor="background1" w:themeShade="80"/>
         </w:rPr>
         <w:t xml:space="preserve">combinatorial explosion </w:t>
       </w:r>
@@ -902,11 +1025,13 @@
         </w:numPr>
         <w:rPr>
           <w:rFonts w:asciiTheme="majorHAnsi" w:eastAsiaTheme="majorEastAsia" w:hAnsiTheme="majorHAnsi" w:cstheme="majorBidi"/>
-        </w:rPr>
-      </w:pPr>
-      <w:r>
-        <w:rPr>
-          <w:rFonts w:asciiTheme="majorHAnsi" w:eastAsiaTheme="majorEastAsia" w:hAnsiTheme="majorHAnsi" w:cstheme="majorBidi"/>
+          <w:color w:val="808080" w:themeColor="background1" w:themeShade="80"/>
+        </w:rPr>
+      </w:pPr>
+      <w:r>
+        <w:rPr>
+          <w:rFonts w:asciiTheme="majorHAnsi" w:eastAsiaTheme="majorEastAsia" w:hAnsiTheme="majorHAnsi" w:cstheme="majorBidi"/>
+          <w:color w:val="808080" w:themeColor="background1" w:themeShade="80"/>
         </w:rPr>
         <w:t xml:space="preserve">why brute force is infeasible </w:t>
       </w:r>
@@ -916,11 +1041,13 @@
         <w:pStyle w:val="NormalWeb"/>
         <w:rPr>
           <w:rFonts w:asciiTheme="majorHAnsi" w:eastAsiaTheme="majorEastAsia" w:hAnsiTheme="majorHAnsi" w:cstheme="majorBidi"/>
-        </w:rPr>
-      </w:pPr>
-      <w:r>
-        <w:rPr>
-          <w:rFonts w:asciiTheme="majorHAnsi" w:eastAsiaTheme="majorEastAsia" w:hAnsiTheme="majorHAnsi" w:cstheme="majorBidi"/>
+          <w:color w:val="808080" w:themeColor="background1" w:themeShade="80"/>
+        </w:rPr>
+      </w:pPr>
+      <w:r>
+        <w:rPr>
+          <w:rFonts w:asciiTheme="majorHAnsi" w:eastAsiaTheme="majorEastAsia" w:hAnsiTheme="majorHAnsi" w:cstheme="majorBidi"/>
+          <w:color w:val="808080" w:themeColor="background1" w:themeShade="80"/>
         </w:rPr>
         <w:t>This strengthens the motivation for GA.</w:t>
       </w:r>
@@ -943,10 +1070,11 @@
           <w:szCs w:val="32"/>
         </w:rPr>
         <w:pict w14:anchorId="665291A6">
-          <v:rect id="_x0000_i1485" style="width:0;height:1.5pt" o:hralign="center" o:hrstd="t" o:hr="t" fillcolor="#a0a0a0" stroked="f"/>
+          <v:rect id="_x0000_i1030" style="width:0;height:1.5pt" o:hralign="center" o:hrstd="t" o:hr="t" fillcolor="#a0a0a0" stroked="f"/>
         </w:pict>
       </w:r>
     </w:p>
+    <w:p/>
     <w:p>
       <w:pPr>
         <w:pStyle w:val="Heading2"/>
@@ -960,11 +1088,13 @@
         <w:pStyle w:val="NormalWeb"/>
         <w:rPr>
           <w:rFonts w:asciiTheme="majorHAnsi" w:eastAsiaTheme="majorEastAsia" w:hAnsiTheme="majorHAnsi" w:cstheme="majorBidi"/>
-        </w:rPr>
-      </w:pPr>
-      <w:r>
-        <w:rPr>
-          <w:rFonts w:asciiTheme="majorHAnsi" w:eastAsiaTheme="majorEastAsia" w:hAnsiTheme="majorHAnsi" w:cstheme="majorBidi"/>
+          <w:color w:val="808080" w:themeColor="background1" w:themeShade="80"/>
+        </w:rPr>
+      </w:pPr>
+      <w:r>
+        <w:rPr>
+          <w:rFonts w:asciiTheme="majorHAnsi" w:eastAsiaTheme="majorEastAsia" w:hAnsiTheme="majorHAnsi" w:cstheme="majorBidi"/>
+          <w:color w:val="808080" w:themeColor="background1" w:themeShade="80"/>
         </w:rPr>
         <w:t>This is the “how I built it” section.</w:t>
       </w:r>
@@ -987,15 +1117,17 @@
           <w:szCs w:val="32"/>
         </w:rPr>
         <w:pict w14:anchorId="08AA77A2">
-          <v:rect id="_x0000_i1486" style="width:0;height:1.5pt" o:hralign="center" o:hrstd="t" o:hr="t" fillcolor="#a0a0a0" stroked="f"/>
+          <v:rect id="_x0000_i1031" style="width:0;height:1.5pt" o:hralign="center" o:hrstd="t" o:hr="t" fillcolor="#a0a0a0" stroked="f"/>
         </w:pict>
       </w:r>
     </w:p>
+    <w:p/>
     <w:p>
       <w:pPr>
         <w:pStyle w:val="Heading3"/>
       </w:pPr>
       <w:r>
+        <w:lastRenderedPageBreak/>
         <w:t>3.1 Warehouse Environment</w:t>
       </w:r>
     </w:p>
@@ -1004,11 +1136,13 @@
         <w:pStyle w:val="NormalWeb"/>
         <w:rPr>
           <w:rFonts w:asciiTheme="majorHAnsi" w:eastAsiaTheme="majorEastAsia" w:hAnsiTheme="majorHAnsi" w:cstheme="majorBidi"/>
-        </w:rPr>
-      </w:pPr>
-      <w:r>
-        <w:rPr>
-          <w:rFonts w:asciiTheme="majorHAnsi" w:eastAsiaTheme="majorEastAsia" w:hAnsiTheme="majorHAnsi" w:cstheme="majorBidi"/>
+          <w:color w:val="808080" w:themeColor="background1" w:themeShade="80"/>
+        </w:rPr>
+      </w:pPr>
+      <w:r>
+        <w:rPr>
+          <w:rFonts w:asciiTheme="majorHAnsi" w:eastAsiaTheme="majorEastAsia" w:hAnsiTheme="majorHAnsi" w:cstheme="majorBidi"/>
+          <w:color w:val="808080" w:themeColor="background1" w:themeShade="80"/>
         </w:rPr>
         <w:t>Explain:</w:t>
       </w:r>
@@ -1022,11 +1156,13 @@
         </w:numPr>
         <w:rPr>
           <w:rFonts w:asciiTheme="majorHAnsi" w:eastAsiaTheme="majorEastAsia" w:hAnsiTheme="majorHAnsi" w:cstheme="majorBidi"/>
-        </w:rPr>
-      </w:pPr>
-      <w:r>
-        <w:rPr>
-          <w:rFonts w:asciiTheme="majorHAnsi" w:eastAsiaTheme="majorEastAsia" w:hAnsiTheme="majorHAnsi" w:cstheme="majorBidi"/>
+          <w:color w:val="808080" w:themeColor="background1" w:themeShade="80"/>
+        </w:rPr>
+      </w:pPr>
+      <w:r>
+        <w:rPr>
+          <w:rFonts w:asciiTheme="majorHAnsi" w:eastAsiaTheme="majorEastAsia" w:hAnsiTheme="majorHAnsi" w:cstheme="majorBidi"/>
+          <w:color w:val="808080" w:themeColor="background1" w:themeShade="80"/>
         </w:rPr>
         <w:t xml:space="preserve">grid size </w:t>
       </w:r>
@@ -1040,11 +1176,13 @@
         </w:numPr>
         <w:rPr>
           <w:rFonts w:asciiTheme="majorHAnsi" w:eastAsiaTheme="majorEastAsia" w:hAnsiTheme="majorHAnsi" w:cstheme="majorBidi"/>
-        </w:rPr>
-      </w:pPr>
-      <w:r>
-        <w:rPr>
-          <w:rFonts w:asciiTheme="majorHAnsi" w:eastAsiaTheme="majorEastAsia" w:hAnsiTheme="majorHAnsi" w:cstheme="majorBidi"/>
+          <w:color w:val="808080" w:themeColor="background1" w:themeShade="80"/>
+        </w:rPr>
+      </w:pPr>
+      <w:r>
+        <w:rPr>
+          <w:rFonts w:asciiTheme="majorHAnsi" w:eastAsiaTheme="majorEastAsia" w:hAnsiTheme="majorHAnsi" w:cstheme="majorBidi"/>
+          <w:color w:val="808080" w:themeColor="background1" w:themeShade="80"/>
         </w:rPr>
         <w:t xml:space="preserve">shelves/walls </w:t>
       </w:r>
@@ -1058,11 +1196,13 @@
         </w:numPr>
         <w:rPr>
           <w:rFonts w:asciiTheme="majorHAnsi" w:eastAsiaTheme="majorEastAsia" w:hAnsiTheme="majorHAnsi" w:cstheme="majorBidi"/>
-        </w:rPr>
-      </w:pPr>
-      <w:r>
-        <w:rPr>
-          <w:rFonts w:asciiTheme="majorHAnsi" w:eastAsiaTheme="majorEastAsia" w:hAnsiTheme="majorHAnsi" w:cstheme="majorBidi"/>
+          <w:color w:val="808080" w:themeColor="background1" w:themeShade="80"/>
+        </w:rPr>
+      </w:pPr>
+      <w:r>
+        <w:rPr>
+          <w:rFonts w:asciiTheme="majorHAnsi" w:eastAsiaTheme="majorEastAsia" w:hAnsiTheme="majorHAnsi" w:cstheme="majorBidi"/>
+          <w:color w:val="808080" w:themeColor="background1" w:themeShade="80"/>
         </w:rPr>
         <w:t xml:space="preserve">item locations </w:t>
       </w:r>
@@ -1076,11 +1216,13 @@
         </w:numPr>
         <w:rPr>
           <w:rFonts w:asciiTheme="majorHAnsi" w:eastAsiaTheme="majorEastAsia" w:hAnsiTheme="majorHAnsi" w:cstheme="majorBidi"/>
-        </w:rPr>
-      </w:pPr>
-      <w:r>
-        <w:rPr>
-          <w:rFonts w:asciiTheme="majorHAnsi" w:eastAsiaTheme="majorEastAsia" w:hAnsiTheme="majorHAnsi" w:cstheme="majorBidi"/>
+          <w:color w:val="808080" w:themeColor="background1" w:themeShade="80"/>
+        </w:rPr>
+      </w:pPr>
+      <w:r>
+        <w:rPr>
+          <w:rFonts w:asciiTheme="majorHAnsi" w:eastAsiaTheme="majorEastAsia" w:hAnsiTheme="majorHAnsi" w:cstheme="majorBidi"/>
+          <w:color w:val="808080" w:themeColor="background1" w:themeShade="80"/>
         </w:rPr>
         <w:t xml:space="preserve">start location </w:t>
       </w:r>
@@ -1090,11 +1232,13 @@
         <w:pStyle w:val="NormalWeb"/>
         <w:rPr>
           <w:rFonts w:asciiTheme="majorHAnsi" w:eastAsiaTheme="majorEastAsia" w:hAnsiTheme="majorHAnsi" w:cstheme="majorBidi"/>
-        </w:rPr>
-      </w:pPr>
-      <w:r>
-        <w:rPr>
-          <w:rFonts w:asciiTheme="majorHAnsi" w:eastAsiaTheme="majorEastAsia" w:hAnsiTheme="majorHAnsi" w:cstheme="majorBidi"/>
+          <w:color w:val="808080" w:themeColor="background1" w:themeShade="80"/>
+        </w:rPr>
+      </w:pPr>
+      <w:r>
+        <w:rPr>
+          <w:rFonts w:asciiTheme="majorHAnsi" w:eastAsiaTheme="majorEastAsia" w:hAnsiTheme="majorHAnsi" w:cstheme="majorBidi"/>
+          <w:color w:val="808080" w:themeColor="background1" w:themeShade="80"/>
         </w:rPr>
         <w:t>Include:</w:t>
       </w:r>
@@ -1108,11 +1252,13 @@
         </w:numPr>
         <w:rPr>
           <w:rFonts w:asciiTheme="majorHAnsi" w:eastAsiaTheme="majorEastAsia" w:hAnsiTheme="majorHAnsi" w:cstheme="majorBidi"/>
-        </w:rPr>
-      </w:pPr>
-      <w:r>
-        <w:rPr>
-          <w:rFonts w:asciiTheme="majorHAnsi" w:eastAsiaTheme="majorEastAsia" w:hAnsiTheme="majorHAnsi" w:cstheme="majorBidi"/>
+          <w:color w:val="808080" w:themeColor="background1" w:themeShade="80"/>
+        </w:rPr>
+      </w:pPr>
+      <w:r>
+        <w:rPr>
+          <w:rFonts w:asciiTheme="majorHAnsi" w:eastAsiaTheme="majorEastAsia" w:hAnsiTheme="majorHAnsi" w:cstheme="majorBidi"/>
+          <w:color w:val="808080" w:themeColor="background1" w:themeShade="80"/>
         </w:rPr>
         <w:t xml:space="preserve">warehouse visualization figure </w:t>
       </w:r>
@@ -1135,10 +1281,11 @@
           <w:szCs w:val="32"/>
         </w:rPr>
         <w:pict w14:anchorId="0EBC2BAA">
-          <v:rect id="_x0000_i1487" style="width:0;height:1.5pt" o:hralign="center" o:hrstd="t" o:hr="t" fillcolor="#a0a0a0" stroked="f"/>
+          <v:rect id="_x0000_i1032" style="width:0;height:1.5pt" o:hralign="center" o:hrstd="t" o:hr="t" fillcolor="#a0a0a0" stroked="f"/>
         </w:pict>
       </w:r>
     </w:p>
+    <w:p/>
     <w:p>
       <w:pPr>
         <w:pStyle w:val="Heading3"/>
@@ -1152,11 +1299,13 @@
         <w:pStyle w:val="NormalWeb"/>
         <w:rPr>
           <w:rFonts w:asciiTheme="majorHAnsi" w:eastAsiaTheme="majorEastAsia" w:hAnsiTheme="majorHAnsi" w:cstheme="majorBidi"/>
-        </w:rPr>
-      </w:pPr>
-      <w:r>
-        <w:rPr>
-          <w:rFonts w:asciiTheme="majorHAnsi" w:eastAsiaTheme="majorEastAsia" w:hAnsiTheme="majorHAnsi" w:cstheme="majorBidi"/>
+          <w:color w:val="808080" w:themeColor="background1" w:themeShade="80"/>
+        </w:rPr>
+      </w:pPr>
+      <w:r>
+        <w:rPr>
+          <w:rFonts w:asciiTheme="majorHAnsi" w:eastAsiaTheme="majorEastAsia" w:hAnsiTheme="majorHAnsi" w:cstheme="majorBidi"/>
+          <w:color w:val="808080" w:themeColor="background1" w:themeShade="80"/>
         </w:rPr>
         <w:t>Explain:</w:t>
       </w:r>
@@ -1170,13 +1319,14 @@
         </w:numPr>
         <w:rPr>
           <w:rFonts w:asciiTheme="majorHAnsi" w:eastAsiaTheme="majorEastAsia" w:hAnsiTheme="majorHAnsi" w:cstheme="majorBidi"/>
-        </w:rPr>
-      </w:pPr>
-      <w:r>
-        <w:rPr>
-          <w:rFonts w:asciiTheme="majorHAnsi" w:eastAsiaTheme="majorEastAsia" w:hAnsiTheme="majorHAnsi" w:cstheme="majorBidi"/>
-        </w:rPr>
-        <w:lastRenderedPageBreak/>
+          <w:color w:val="808080" w:themeColor="background1" w:themeShade="80"/>
+        </w:rPr>
+      </w:pPr>
+      <w:r>
+        <w:rPr>
+          <w:rFonts w:asciiTheme="majorHAnsi" w:eastAsiaTheme="majorEastAsia" w:hAnsiTheme="majorHAnsi" w:cstheme="majorBidi"/>
+          <w:color w:val="808080" w:themeColor="background1" w:themeShade="80"/>
+        </w:rPr>
         <w:t xml:space="preserve">precomputing distances </w:t>
       </w:r>
     </w:p>
@@ -1189,11 +1339,13 @@
         </w:numPr>
         <w:rPr>
           <w:rFonts w:asciiTheme="majorHAnsi" w:eastAsiaTheme="majorEastAsia" w:hAnsiTheme="majorHAnsi" w:cstheme="majorBidi"/>
-        </w:rPr>
-      </w:pPr>
-      <w:r>
-        <w:rPr>
-          <w:rFonts w:asciiTheme="majorHAnsi" w:eastAsiaTheme="majorEastAsia" w:hAnsiTheme="majorHAnsi" w:cstheme="majorBidi"/>
+          <w:color w:val="808080" w:themeColor="background1" w:themeShade="80"/>
+        </w:rPr>
+      </w:pPr>
+      <w:r>
+        <w:rPr>
+          <w:rFonts w:asciiTheme="majorHAnsi" w:eastAsiaTheme="majorEastAsia" w:hAnsiTheme="majorHAnsi" w:cstheme="majorBidi"/>
+          <w:color w:val="808080" w:themeColor="background1" w:themeShade="80"/>
         </w:rPr>
         <w:t xml:space="preserve">reducing repeated A* calls </w:t>
       </w:r>
@@ -1207,11 +1359,13 @@
         </w:numPr>
         <w:rPr>
           <w:rFonts w:asciiTheme="majorHAnsi" w:eastAsiaTheme="majorEastAsia" w:hAnsiTheme="majorHAnsi" w:cstheme="majorBidi"/>
-        </w:rPr>
-      </w:pPr>
-      <w:r>
-        <w:rPr>
-          <w:rFonts w:asciiTheme="majorHAnsi" w:eastAsiaTheme="majorEastAsia" w:hAnsiTheme="majorHAnsi" w:cstheme="majorBidi"/>
+          <w:color w:val="808080" w:themeColor="background1" w:themeShade="80"/>
+        </w:rPr>
+      </w:pPr>
+      <w:r>
+        <w:rPr>
+          <w:rFonts w:asciiTheme="majorHAnsi" w:eastAsiaTheme="majorEastAsia" w:hAnsiTheme="majorHAnsi" w:cstheme="majorBidi"/>
+          <w:color w:val="808080" w:themeColor="background1" w:themeShade="80"/>
         </w:rPr>
         <w:t xml:space="preserve">efficiency benefits </w:t>
       </w:r>
@@ -1221,11 +1375,13 @@
         <w:pStyle w:val="NormalWeb"/>
         <w:rPr>
           <w:rFonts w:asciiTheme="majorHAnsi" w:eastAsiaTheme="majorEastAsia" w:hAnsiTheme="majorHAnsi" w:cstheme="majorBidi"/>
-        </w:rPr>
-      </w:pPr>
-      <w:r>
-        <w:rPr>
-          <w:rFonts w:asciiTheme="majorHAnsi" w:eastAsiaTheme="majorEastAsia" w:hAnsiTheme="majorHAnsi" w:cstheme="majorBidi"/>
+          <w:color w:val="808080" w:themeColor="background1" w:themeShade="80"/>
+        </w:rPr>
+      </w:pPr>
+      <w:r>
+        <w:rPr>
+          <w:rFonts w:asciiTheme="majorHAnsi" w:eastAsiaTheme="majorEastAsia" w:hAnsiTheme="majorHAnsi" w:cstheme="majorBidi"/>
+          <w:color w:val="808080" w:themeColor="background1" w:themeShade="80"/>
         </w:rPr>
         <w:t>Include:</w:t>
       </w:r>
@@ -1239,11 +1395,13 @@
         </w:numPr>
         <w:rPr>
           <w:rFonts w:asciiTheme="majorHAnsi" w:eastAsiaTheme="majorEastAsia" w:hAnsiTheme="majorHAnsi" w:cstheme="majorBidi"/>
-        </w:rPr>
-      </w:pPr>
-      <w:r>
-        <w:rPr>
-          <w:rFonts w:asciiTheme="majorHAnsi" w:eastAsiaTheme="majorEastAsia" w:hAnsiTheme="majorHAnsi" w:cstheme="majorBidi"/>
+          <w:color w:val="808080" w:themeColor="background1" w:themeShade="80"/>
+        </w:rPr>
+      </w:pPr>
+      <w:r>
+        <w:rPr>
+          <w:rFonts w:asciiTheme="majorHAnsi" w:eastAsiaTheme="majorEastAsia" w:hAnsiTheme="majorHAnsi" w:cstheme="majorBidi"/>
+          <w:color w:val="808080" w:themeColor="background1" w:themeShade="80"/>
         </w:rPr>
         <w:t xml:space="preserve">distance matrix visualization/table </w:t>
       </w:r>
@@ -1266,10 +1424,11 @@
           <w:szCs w:val="32"/>
         </w:rPr>
         <w:pict w14:anchorId="63E3D9DE">
-          <v:rect id="_x0000_i1488" style="width:0;height:1.5pt" o:hralign="center" o:hrstd="t" o:hr="t" fillcolor="#a0a0a0" stroked="f"/>
+          <v:rect id="_x0000_i1033" style="width:0;height:1.5pt" o:hralign="center" o:hrstd="t" o:hr="t" fillcolor="#a0a0a0" stroked="f"/>
         </w:pict>
       </w:r>
     </w:p>
+    <w:p/>
     <w:p>
       <w:pPr>
         <w:pStyle w:val="Heading3"/>
@@ -1283,20 +1442,46 @@
         <w:pStyle w:val="NormalWeb"/>
         <w:rPr>
           <w:rFonts w:asciiTheme="majorHAnsi" w:eastAsiaTheme="majorEastAsia" w:hAnsiTheme="majorHAnsi" w:cstheme="majorBidi"/>
-        </w:rPr>
-      </w:pPr>
-      <w:r>
-        <w:rPr>
-          <w:rFonts w:asciiTheme="majorHAnsi" w:eastAsiaTheme="majorEastAsia" w:hAnsiTheme="majorHAnsi" w:cstheme="majorBidi"/>
+          <w:color w:val="808080" w:themeColor="background1" w:themeShade="80"/>
+        </w:rPr>
+      </w:pPr>
+      <w:r>
+        <w:rPr>
+          <w:rFonts w:asciiTheme="majorHAnsi" w:eastAsiaTheme="majorEastAsia" w:hAnsiTheme="majorHAnsi" w:cstheme="majorBidi"/>
+          <w:color w:val="808080" w:themeColor="background1" w:themeShade="80"/>
         </w:rPr>
         <w:t>Explain your implementation choices:</w:t>
       </w:r>
     </w:p>
     <w:p>
       <w:pPr>
+        <w:pStyle w:val="NormalWeb"/>
+        <w:rPr>
+          <w:rFonts w:asciiTheme="majorHAnsi" w:eastAsiaTheme="majorEastAsia" w:hAnsiTheme="majorHAnsi" w:cstheme="majorBidi"/>
+          <w:color w:val="808080" w:themeColor="background1" w:themeShade="80"/>
+        </w:rPr>
+      </w:pPr>
+      <w:r>
+        <w:rPr>
+          <w:rFonts w:asciiTheme="majorHAnsi" w:eastAsiaTheme="majorEastAsia" w:hAnsiTheme="majorHAnsi" w:cstheme="majorBidi"/>
+          <w:color w:val="0F4761" w:themeColor="accent1" w:themeShade="BF"/>
+          <w:sz w:val="32"/>
+          <w:szCs w:val="32"/>
+        </w:rPr>
+        <w:pict w14:anchorId="04CCCAC8">
+          <v:rect id="_x0000_i1067" style="width:0;height:1.5pt" o:hralign="center" o:hrstd="t" o:hr="t" fillcolor="#a0a0a0" stroked="f"/>
+        </w:pict>
+      </w:r>
+    </w:p>
+    <w:p/>
+    <w:p>
+      <w:pPr>
         <w:pStyle w:val="Heading4"/>
       </w:pPr>
       <w:r>
+        <w:t xml:space="preserve">3.3.1 </w:t>
+      </w:r>
+      <w:r>
         <w:t>Chromosome Representation</w:t>
       </w:r>
     </w:p>
@@ -1305,11 +1490,13 @@
         <w:pStyle w:val="NormalWeb"/>
         <w:rPr>
           <w:rFonts w:asciiTheme="majorHAnsi" w:eastAsiaTheme="majorEastAsia" w:hAnsiTheme="majorHAnsi" w:cstheme="majorBidi"/>
-        </w:rPr>
-      </w:pPr>
-      <w:r>
-        <w:rPr>
-          <w:rFonts w:asciiTheme="majorHAnsi" w:eastAsiaTheme="majorEastAsia" w:hAnsiTheme="majorHAnsi" w:cstheme="majorBidi"/>
+          <w:color w:val="808080" w:themeColor="background1" w:themeShade="80"/>
+        </w:rPr>
+      </w:pPr>
+      <w:r>
+        <w:rPr>
+          <w:rFonts w:asciiTheme="majorHAnsi" w:eastAsiaTheme="majorEastAsia" w:hAnsiTheme="majorHAnsi" w:cstheme="majorBidi"/>
+          <w:color w:val="808080" w:themeColor="background1" w:themeShade="80"/>
         </w:rPr>
         <w:t>Example:</w:t>
       </w:r>
@@ -1319,11 +1506,13 @@
         <w:pStyle w:val="NormalWeb"/>
         <w:rPr>
           <w:rFonts w:asciiTheme="majorHAnsi" w:eastAsiaTheme="majorEastAsia" w:hAnsiTheme="majorHAnsi" w:cstheme="majorBidi"/>
-        </w:rPr>
-      </w:pPr>
-      <w:r>
-        <w:rPr>
-          <w:rFonts w:asciiTheme="majorHAnsi" w:eastAsiaTheme="majorEastAsia" w:hAnsiTheme="majorHAnsi" w:cstheme="majorBidi"/>
+          <w:color w:val="808080" w:themeColor="background1" w:themeShade="80"/>
+        </w:rPr>
+      </w:pPr>
+      <w:r>
+        <w:rPr>
+          <w:rFonts w:asciiTheme="majorHAnsi" w:eastAsiaTheme="majorEastAsia" w:hAnsiTheme="majorHAnsi" w:cstheme="majorBidi"/>
+          <w:color w:val="808080" w:themeColor="background1" w:themeShade="80"/>
         </w:rPr>
         <w:t>[3, 1, 7, 0, 2]</w:t>
       </w:r>
@@ -1339,16 +1528,21 @@
         <w:rPr>
           <w:rFonts w:asciiTheme="majorHAnsi" w:eastAsiaTheme="majorEastAsia" w:hAnsiTheme="majorHAnsi" w:cstheme="majorBidi"/>
         </w:rPr>
+        <w:lastRenderedPageBreak/>
         <w:pict w14:anchorId="372A13EF">
-          <v:rect id="_x0000_i1489" style="width:0;height:1.5pt" o:hralign="center" o:hrstd="t" o:hr="t" fillcolor="#a0a0a0" stroked="f"/>
+          <v:rect id="_x0000_i1034" style="width:0;height:1.5pt" o:hralign="center" o:hrstd="t" o:hr="t" fillcolor="#a0a0a0" stroked="f"/>
         </w:pict>
       </w:r>
     </w:p>
+    <w:p/>
     <w:p>
       <w:pPr>
         <w:pStyle w:val="Heading4"/>
       </w:pPr>
       <w:r>
+        <w:t xml:space="preserve">3.3.2 </w:t>
+      </w:r>
+      <w:r>
         <w:t>Fitness Function</w:t>
       </w:r>
     </w:p>
@@ -1357,11 +1551,13 @@
         <w:pStyle w:val="NormalWeb"/>
         <w:rPr>
           <w:rFonts w:asciiTheme="majorHAnsi" w:eastAsiaTheme="majorEastAsia" w:hAnsiTheme="majorHAnsi" w:cstheme="majorBidi"/>
-        </w:rPr>
-      </w:pPr>
-      <w:r>
-        <w:rPr>
-          <w:rFonts w:asciiTheme="majorHAnsi" w:eastAsiaTheme="majorEastAsia" w:hAnsiTheme="majorHAnsi" w:cstheme="majorBidi"/>
+          <w:color w:val="808080" w:themeColor="background1" w:themeShade="80"/>
+        </w:rPr>
+      </w:pPr>
+      <w:r>
+        <w:rPr>
+          <w:rFonts w:asciiTheme="majorHAnsi" w:eastAsiaTheme="majorEastAsia" w:hAnsiTheme="majorHAnsi" w:cstheme="majorBidi"/>
+          <w:color w:val="808080" w:themeColor="background1" w:themeShade="80"/>
         </w:rPr>
         <w:t>Explain:</w:t>
       </w:r>
@@ -1375,11 +1571,13 @@
         </w:numPr>
         <w:rPr>
           <w:rFonts w:asciiTheme="majorHAnsi" w:eastAsiaTheme="majorEastAsia" w:hAnsiTheme="majorHAnsi" w:cstheme="majorBidi"/>
-        </w:rPr>
-      </w:pPr>
-      <w:r>
-        <w:rPr>
-          <w:rFonts w:asciiTheme="majorHAnsi" w:eastAsiaTheme="majorEastAsia" w:hAnsiTheme="majorHAnsi" w:cstheme="majorBidi"/>
+          <w:color w:val="808080" w:themeColor="background1" w:themeShade="80"/>
+        </w:rPr>
+      </w:pPr>
+      <w:r>
+        <w:rPr>
+          <w:rFonts w:asciiTheme="majorHAnsi" w:eastAsiaTheme="majorEastAsia" w:hAnsiTheme="majorHAnsi" w:cstheme="majorBidi"/>
+          <w:color w:val="808080" w:themeColor="background1" w:themeShade="80"/>
         </w:rPr>
         <w:t xml:space="preserve">total route distance </w:t>
       </w:r>
@@ -1393,11 +1591,13 @@
         </w:numPr>
         <w:rPr>
           <w:rFonts w:asciiTheme="majorHAnsi" w:eastAsiaTheme="majorEastAsia" w:hAnsiTheme="majorHAnsi" w:cstheme="majorBidi"/>
-        </w:rPr>
-      </w:pPr>
-      <w:r>
-        <w:rPr>
-          <w:rFonts w:asciiTheme="majorHAnsi" w:eastAsiaTheme="majorEastAsia" w:hAnsiTheme="majorHAnsi" w:cstheme="majorBidi"/>
+          <w:color w:val="808080" w:themeColor="background1" w:themeShade="80"/>
+        </w:rPr>
+      </w:pPr>
+      <w:r>
+        <w:rPr>
+          <w:rFonts w:asciiTheme="majorHAnsi" w:eastAsiaTheme="majorEastAsia" w:hAnsiTheme="majorHAnsi" w:cstheme="majorBidi"/>
+          <w:color w:val="808080" w:themeColor="background1" w:themeShade="80"/>
         </w:rPr>
         <w:t xml:space="preserve">returning to start </w:t>
       </w:r>
@@ -1414,15 +1614,19 @@
           <w:rFonts w:asciiTheme="majorHAnsi" w:eastAsiaTheme="majorEastAsia" w:hAnsiTheme="majorHAnsi" w:cstheme="majorBidi"/>
         </w:rPr>
         <w:pict w14:anchorId="644B7C15">
-          <v:rect id="_x0000_i1490" style="width:0;height:1.5pt" o:hralign="center" o:hrstd="t" o:hr="t" fillcolor="#a0a0a0" stroked="f"/>
+          <v:rect id="_x0000_i1035" style="width:0;height:1.5pt" o:hralign="center" o:hrstd="t" o:hr="t" fillcolor="#a0a0a0" stroked="f"/>
         </w:pict>
       </w:r>
     </w:p>
+    <w:p/>
     <w:p>
       <w:pPr>
         <w:pStyle w:val="Heading4"/>
       </w:pPr>
       <w:r>
+        <w:t xml:space="preserve">3.3.3 </w:t>
+      </w:r>
+      <w:r>
         <w:t>Parent Selection</w:t>
       </w:r>
     </w:p>
@@ -1431,11 +1635,13 @@
         <w:pStyle w:val="NormalWeb"/>
         <w:rPr>
           <w:rFonts w:asciiTheme="majorHAnsi" w:eastAsiaTheme="majorEastAsia" w:hAnsiTheme="majorHAnsi" w:cstheme="majorBidi"/>
-        </w:rPr>
-      </w:pPr>
-      <w:r>
-        <w:rPr>
-          <w:rFonts w:asciiTheme="majorHAnsi" w:eastAsiaTheme="majorEastAsia" w:hAnsiTheme="majorHAnsi" w:cstheme="majorBidi"/>
+          <w:color w:val="808080" w:themeColor="background1" w:themeShade="80"/>
+        </w:rPr>
+      </w:pPr>
+      <w:r>
+        <w:rPr>
+          <w:rFonts w:asciiTheme="majorHAnsi" w:eastAsiaTheme="majorEastAsia" w:hAnsiTheme="majorHAnsi" w:cstheme="majorBidi"/>
+          <w:color w:val="808080" w:themeColor="background1" w:themeShade="80"/>
         </w:rPr>
         <w:t>Explain the 5 methods:</w:t>
       </w:r>
@@ -1449,11 +1655,13 @@
         </w:numPr>
         <w:rPr>
           <w:rFonts w:asciiTheme="majorHAnsi" w:eastAsiaTheme="majorEastAsia" w:hAnsiTheme="majorHAnsi" w:cstheme="majorBidi"/>
-        </w:rPr>
-      </w:pPr>
-      <w:r>
-        <w:rPr>
-          <w:rFonts w:asciiTheme="majorHAnsi" w:eastAsiaTheme="majorEastAsia" w:hAnsiTheme="majorHAnsi" w:cstheme="majorBidi"/>
+          <w:color w:val="808080" w:themeColor="background1" w:themeShade="80"/>
+        </w:rPr>
+      </w:pPr>
+      <w:r>
+        <w:rPr>
+          <w:rFonts w:asciiTheme="majorHAnsi" w:eastAsiaTheme="majorEastAsia" w:hAnsiTheme="majorHAnsi" w:cstheme="majorBidi"/>
+          <w:color w:val="808080" w:themeColor="background1" w:themeShade="80"/>
         </w:rPr>
         <w:t xml:space="preserve">Random </w:t>
       </w:r>
@@ -1467,11 +1675,13 @@
         </w:numPr>
         <w:rPr>
           <w:rFonts w:asciiTheme="majorHAnsi" w:eastAsiaTheme="majorEastAsia" w:hAnsiTheme="majorHAnsi" w:cstheme="majorBidi"/>
-        </w:rPr>
-      </w:pPr>
-      <w:r>
-        <w:rPr>
-          <w:rFonts w:asciiTheme="majorHAnsi" w:eastAsiaTheme="majorEastAsia" w:hAnsiTheme="majorHAnsi" w:cstheme="majorBidi"/>
+          <w:color w:val="808080" w:themeColor="background1" w:themeShade="80"/>
+        </w:rPr>
+      </w:pPr>
+      <w:r>
+        <w:rPr>
+          <w:rFonts w:asciiTheme="majorHAnsi" w:eastAsiaTheme="majorEastAsia" w:hAnsiTheme="majorHAnsi" w:cstheme="majorBidi"/>
+          <w:color w:val="808080" w:themeColor="background1" w:themeShade="80"/>
         </w:rPr>
         <w:t xml:space="preserve">Roulette </w:t>
       </w:r>
@@ -1485,11 +1695,13 @@
         </w:numPr>
         <w:rPr>
           <w:rFonts w:asciiTheme="majorHAnsi" w:eastAsiaTheme="majorEastAsia" w:hAnsiTheme="majorHAnsi" w:cstheme="majorBidi"/>
-        </w:rPr>
-      </w:pPr>
-      <w:r>
-        <w:rPr>
-          <w:rFonts w:asciiTheme="majorHAnsi" w:eastAsiaTheme="majorEastAsia" w:hAnsiTheme="majorHAnsi" w:cstheme="majorBidi"/>
+          <w:color w:val="808080" w:themeColor="background1" w:themeShade="80"/>
+        </w:rPr>
+      </w:pPr>
+      <w:r>
+        <w:rPr>
+          <w:rFonts w:asciiTheme="majorHAnsi" w:eastAsiaTheme="majorEastAsia" w:hAnsiTheme="majorHAnsi" w:cstheme="majorBidi"/>
+          <w:color w:val="808080" w:themeColor="background1" w:themeShade="80"/>
         </w:rPr>
         <w:t xml:space="preserve">SUS </w:t>
       </w:r>
@@ -1503,11 +1715,13 @@
         </w:numPr>
         <w:rPr>
           <w:rFonts w:asciiTheme="majorHAnsi" w:eastAsiaTheme="majorEastAsia" w:hAnsiTheme="majorHAnsi" w:cstheme="majorBidi"/>
-        </w:rPr>
-      </w:pPr>
-      <w:r>
-        <w:rPr>
-          <w:rFonts w:asciiTheme="majorHAnsi" w:eastAsiaTheme="majorEastAsia" w:hAnsiTheme="majorHAnsi" w:cstheme="majorBidi"/>
+          <w:color w:val="808080" w:themeColor="background1" w:themeShade="80"/>
+        </w:rPr>
+      </w:pPr>
+      <w:r>
+        <w:rPr>
+          <w:rFonts w:asciiTheme="majorHAnsi" w:eastAsiaTheme="majorEastAsia" w:hAnsiTheme="majorHAnsi" w:cstheme="majorBidi"/>
+          <w:color w:val="808080" w:themeColor="background1" w:themeShade="80"/>
         </w:rPr>
         <w:t xml:space="preserve">Tournament </w:t>
       </w:r>
@@ -1521,11 +1735,13 @@
         </w:numPr>
         <w:rPr>
           <w:rFonts w:asciiTheme="majorHAnsi" w:eastAsiaTheme="majorEastAsia" w:hAnsiTheme="majorHAnsi" w:cstheme="majorBidi"/>
-        </w:rPr>
-      </w:pPr>
-      <w:r>
-        <w:rPr>
-          <w:rFonts w:asciiTheme="majorHAnsi" w:eastAsiaTheme="majorEastAsia" w:hAnsiTheme="majorHAnsi" w:cstheme="majorBidi"/>
+          <w:color w:val="808080" w:themeColor="background1" w:themeShade="80"/>
+        </w:rPr>
+      </w:pPr>
+      <w:r>
+        <w:rPr>
+          <w:rFonts w:asciiTheme="majorHAnsi" w:eastAsiaTheme="majorEastAsia" w:hAnsiTheme="majorHAnsi" w:cstheme="majorBidi"/>
+          <w:color w:val="808080" w:themeColor="background1" w:themeShade="80"/>
         </w:rPr>
         <w:t xml:space="preserve">Rank </w:t>
       </w:r>
@@ -1542,15 +1758,19 @@
           <w:rFonts w:asciiTheme="majorHAnsi" w:eastAsiaTheme="majorEastAsia" w:hAnsiTheme="majorHAnsi" w:cstheme="majorBidi"/>
         </w:rPr>
         <w:pict w14:anchorId="3EE41DAD">
-          <v:rect id="_x0000_i1491" style="width:0;height:1.5pt" o:hralign="center" o:hrstd="t" o:hr="t" fillcolor="#a0a0a0" stroked="f"/>
+          <v:rect id="_x0000_i1036" style="width:0;height:1.5pt" o:hralign="center" o:hrstd="t" o:hr="t" fillcolor="#a0a0a0" stroked="f"/>
         </w:pict>
       </w:r>
     </w:p>
+    <w:p/>
     <w:p>
       <w:pPr>
         <w:pStyle w:val="Heading4"/>
       </w:pPr>
       <w:r>
+        <w:t xml:space="preserve">3.3.4 </w:t>
+      </w:r>
+      <w:r>
         <w:t>Crossover</w:t>
       </w:r>
     </w:p>
@@ -1559,11 +1779,13 @@
         <w:pStyle w:val="NormalWeb"/>
         <w:rPr>
           <w:rFonts w:asciiTheme="majorHAnsi" w:eastAsiaTheme="majorEastAsia" w:hAnsiTheme="majorHAnsi" w:cstheme="majorBidi"/>
-        </w:rPr>
-      </w:pPr>
-      <w:r>
-        <w:rPr>
-          <w:rFonts w:asciiTheme="majorHAnsi" w:eastAsiaTheme="majorEastAsia" w:hAnsiTheme="majorHAnsi" w:cstheme="majorBidi"/>
+          <w:color w:val="808080" w:themeColor="background1" w:themeShade="80"/>
+        </w:rPr>
+      </w:pPr>
+      <w:r>
+        <w:rPr>
+          <w:rFonts w:asciiTheme="majorHAnsi" w:eastAsiaTheme="majorEastAsia" w:hAnsiTheme="majorHAnsi" w:cstheme="majorBidi"/>
+          <w:color w:val="808080" w:themeColor="background1" w:themeShade="80"/>
         </w:rPr>
         <w:t>Explain your crossover type.</w:t>
       </w:r>
@@ -1579,17 +1801,20 @@
         <w:rPr>
           <w:rFonts w:asciiTheme="majorHAnsi" w:eastAsiaTheme="majorEastAsia" w:hAnsiTheme="majorHAnsi" w:cstheme="majorBidi"/>
         </w:rPr>
-        <w:lastRenderedPageBreak/>
         <w:pict w14:anchorId="50534CD7">
-          <v:rect id="_x0000_i1492" style="width:0;height:1.5pt" o:hralign="center" o:hrstd="t" o:hr="t" fillcolor="#a0a0a0" stroked="f"/>
+          <v:rect id="_x0000_i1037" style="width:0;height:1.5pt" o:hralign="center" o:hrstd="t" o:hr="t" fillcolor="#a0a0a0" stroked="f"/>
         </w:pict>
       </w:r>
     </w:p>
+    <w:p/>
     <w:p>
       <w:pPr>
         <w:pStyle w:val="Heading4"/>
       </w:pPr>
       <w:r>
+        <w:t xml:space="preserve">3.3.5 </w:t>
+      </w:r>
+      <w:r>
         <w:t>Mutation</w:t>
       </w:r>
     </w:p>
@@ -1598,11 +1823,13 @@
         <w:pStyle w:val="NormalWeb"/>
         <w:rPr>
           <w:rFonts w:asciiTheme="majorHAnsi" w:eastAsiaTheme="majorEastAsia" w:hAnsiTheme="majorHAnsi" w:cstheme="majorBidi"/>
-        </w:rPr>
-      </w:pPr>
-      <w:r>
-        <w:rPr>
-          <w:rFonts w:asciiTheme="majorHAnsi" w:eastAsiaTheme="majorEastAsia" w:hAnsiTheme="majorHAnsi" w:cstheme="majorBidi"/>
+          <w:color w:val="808080" w:themeColor="background1" w:themeShade="80"/>
+        </w:rPr>
+      </w:pPr>
+      <w:r>
+        <w:rPr>
+          <w:rFonts w:asciiTheme="majorHAnsi" w:eastAsiaTheme="majorEastAsia" w:hAnsiTheme="majorHAnsi" w:cstheme="majorBidi"/>
+          <w:color w:val="808080" w:themeColor="background1" w:themeShade="80"/>
         </w:rPr>
         <w:t>Explain swap mutation.</w:t>
       </w:r>
@@ -1625,10 +1852,11 @@
           <w:szCs w:val="32"/>
         </w:rPr>
         <w:pict w14:anchorId="26B7A987">
-          <v:rect id="_x0000_i1493" style="width:0;height:1.5pt" o:hralign="center" o:hrstd="t" o:hr="t" fillcolor="#a0a0a0" stroked="f"/>
+          <v:rect id="_x0000_i1038" style="width:0;height:1.5pt" o:hralign="center" o:hrstd="t" o:hr="t" fillcolor="#a0a0a0" stroked="f"/>
         </w:pict>
       </w:r>
     </w:p>
+    <w:p/>
     <w:p>
       <w:pPr>
         <w:pStyle w:val="Heading3"/>
@@ -1642,11 +1870,13 @@
         <w:pStyle w:val="NormalWeb"/>
         <w:rPr>
           <w:rFonts w:asciiTheme="majorHAnsi" w:eastAsiaTheme="majorEastAsia" w:hAnsiTheme="majorHAnsi" w:cstheme="majorBidi"/>
-        </w:rPr>
-      </w:pPr>
-      <w:r>
-        <w:rPr>
-          <w:rFonts w:asciiTheme="majorHAnsi" w:eastAsiaTheme="majorEastAsia" w:hAnsiTheme="majorHAnsi" w:cstheme="majorBidi"/>
+          <w:color w:val="808080" w:themeColor="background1" w:themeShade="80"/>
+        </w:rPr>
+      </w:pPr>
+      <w:r>
+        <w:rPr>
+          <w:rFonts w:asciiTheme="majorHAnsi" w:eastAsiaTheme="majorEastAsia" w:hAnsiTheme="majorHAnsi" w:cstheme="majorBidi"/>
+          <w:color w:val="808080" w:themeColor="background1" w:themeShade="80"/>
         </w:rPr>
         <w:t>Explain:</w:t>
       </w:r>
@@ -1660,12 +1890,15 @@
         </w:numPr>
         <w:rPr>
           <w:rFonts w:asciiTheme="majorHAnsi" w:eastAsiaTheme="majorEastAsia" w:hAnsiTheme="majorHAnsi" w:cstheme="majorBidi"/>
-        </w:rPr>
-      </w:pPr>
-      <w:r>
-        <w:rPr>
-          <w:rFonts w:asciiTheme="majorHAnsi" w:eastAsiaTheme="majorEastAsia" w:hAnsiTheme="majorHAnsi" w:cstheme="majorBidi"/>
-        </w:rPr>
+          <w:color w:val="808080" w:themeColor="background1" w:themeShade="80"/>
+        </w:rPr>
+      </w:pPr>
+      <w:r>
+        <w:rPr>
+          <w:rFonts w:asciiTheme="majorHAnsi" w:eastAsiaTheme="majorEastAsia" w:hAnsiTheme="majorHAnsi" w:cstheme="majorBidi"/>
+          <w:color w:val="808080" w:themeColor="background1" w:themeShade="80"/>
+        </w:rPr>
+        <w:lastRenderedPageBreak/>
         <w:t xml:space="preserve">matplotlib heatmaps </w:t>
       </w:r>
     </w:p>
@@ -1678,11 +1911,13 @@
         </w:numPr>
         <w:rPr>
           <w:rFonts w:asciiTheme="majorHAnsi" w:eastAsiaTheme="majorEastAsia" w:hAnsiTheme="majorHAnsi" w:cstheme="majorBidi"/>
-        </w:rPr>
-      </w:pPr>
-      <w:r>
-        <w:rPr>
-          <w:rFonts w:asciiTheme="majorHAnsi" w:eastAsiaTheme="majorEastAsia" w:hAnsiTheme="majorHAnsi" w:cstheme="majorBidi"/>
+          <w:color w:val="808080" w:themeColor="background1" w:themeShade="80"/>
+        </w:rPr>
+      </w:pPr>
+      <w:r>
+        <w:rPr>
+          <w:rFonts w:asciiTheme="majorHAnsi" w:eastAsiaTheme="majorEastAsia" w:hAnsiTheme="majorHAnsi" w:cstheme="majorBidi"/>
+          <w:color w:val="808080" w:themeColor="background1" w:themeShade="80"/>
         </w:rPr>
         <w:t xml:space="preserve">animations </w:t>
       </w:r>
@@ -1696,11 +1931,13 @@
         </w:numPr>
         <w:rPr>
           <w:rFonts w:asciiTheme="majorHAnsi" w:eastAsiaTheme="majorEastAsia" w:hAnsiTheme="majorHAnsi" w:cstheme="majorBidi"/>
-        </w:rPr>
-      </w:pPr>
-      <w:r>
-        <w:rPr>
-          <w:rFonts w:asciiTheme="majorHAnsi" w:eastAsiaTheme="majorEastAsia" w:hAnsiTheme="majorHAnsi" w:cstheme="majorBidi"/>
+          <w:color w:val="808080" w:themeColor="background1" w:themeShade="80"/>
+        </w:rPr>
+      </w:pPr>
+      <w:r>
+        <w:rPr>
+          <w:rFonts w:asciiTheme="majorHAnsi" w:eastAsiaTheme="majorEastAsia" w:hAnsiTheme="majorHAnsi" w:cstheme="majorBidi"/>
+          <w:color w:val="808080" w:themeColor="background1" w:themeShade="80"/>
         </w:rPr>
         <w:t xml:space="preserve">fading trails </w:t>
       </w:r>
@@ -1714,11 +1951,13 @@
         </w:numPr>
         <w:rPr>
           <w:rFonts w:asciiTheme="majorHAnsi" w:eastAsiaTheme="majorEastAsia" w:hAnsiTheme="majorHAnsi" w:cstheme="majorBidi"/>
-        </w:rPr>
-      </w:pPr>
-      <w:r>
-        <w:rPr>
-          <w:rFonts w:asciiTheme="majorHAnsi" w:eastAsiaTheme="majorEastAsia" w:hAnsiTheme="majorHAnsi" w:cstheme="majorBidi"/>
+          <w:color w:val="808080" w:themeColor="background1" w:themeShade="80"/>
+        </w:rPr>
+      </w:pPr>
+      <w:r>
+        <w:rPr>
+          <w:rFonts w:asciiTheme="majorHAnsi" w:eastAsiaTheme="majorEastAsia" w:hAnsiTheme="majorHAnsi" w:cstheme="majorBidi"/>
+          <w:color w:val="808080" w:themeColor="background1" w:themeShade="80"/>
         </w:rPr>
         <w:t xml:space="preserve">route visualization </w:t>
       </w:r>
@@ -1732,11 +1971,13 @@
         </w:numPr>
         <w:rPr>
           <w:rFonts w:asciiTheme="majorHAnsi" w:eastAsiaTheme="majorEastAsia" w:hAnsiTheme="majorHAnsi" w:cstheme="majorBidi"/>
-        </w:rPr>
-      </w:pPr>
-      <w:r>
-        <w:rPr>
-          <w:rFonts w:asciiTheme="majorHAnsi" w:eastAsiaTheme="majorEastAsia" w:hAnsiTheme="majorHAnsi" w:cstheme="majorBidi"/>
+          <w:color w:val="808080" w:themeColor="background1" w:themeShade="80"/>
+        </w:rPr>
+      </w:pPr>
+      <w:r>
+        <w:rPr>
+          <w:rFonts w:asciiTheme="majorHAnsi" w:eastAsiaTheme="majorEastAsia" w:hAnsiTheme="majorHAnsi" w:cstheme="majorBidi"/>
+          <w:color w:val="808080" w:themeColor="background1" w:themeShade="80"/>
         </w:rPr>
         <w:t xml:space="preserve">generation evolution visualization </w:t>
       </w:r>
@@ -1746,11 +1987,13 @@
         <w:pStyle w:val="NormalWeb"/>
         <w:rPr>
           <w:rFonts w:asciiTheme="majorHAnsi" w:eastAsiaTheme="majorEastAsia" w:hAnsiTheme="majorHAnsi" w:cstheme="majorBidi"/>
-        </w:rPr>
-      </w:pPr>
-      <w:r>
-        <w:rPr>
-          <w:rFonts w:asciiTheme="majorHAnsi" w:eastAsiaTheme="majorEastAsia" w:hAnsiTheme="majorHAnsi" w:cstheme="majorBidi"/>
+          <w:color w:val="808080" w:themeColor="background1" w:themeShade="80"/>
+        </w:rPr>
+      </w:pPr>
+      <w:r>
+        <w:rPr>
+          <w:rFonts w:asciiTheme="majorHAnsi" w:eastAsiaTheme="majorEastAsia" w:hAnsiTheme="majorHAnsi" w:cstheme="majorBidi"/>
+          <w:color w:val="808080" w:themeColor="background1" w:themeShade="80"/>
         </w:rPr>
         <w:t>This section is VERY valuable because your visualizations are now one of the strongest parts of the project.</w:t>
       </w:r>
@@ -1773,10 +2016,11 @@
           <w:szCs w:val="32"/>
         </w:rPr>
         <w:pict w14:anchorId="6EEF5637">
-          <v:rect id="_x0000_i1494" style="width:0;height:1.5pt" o:hralign="center" o:hrstd="t" o:hr="t" fillcolor="#a0a0a0" stroked="f"/>
+          <v:rect id="_x0000_i1039" style="width:0;height:1.5pt" o:hralign="center" o:hrstd="t" o:hr="t" fillcolor="#a0a0a0" stroked="f"/>
         </w:pict>
       </w:r>
     </w:p>
+    <w:p/>
     <w:p>
       <w:pPr>
         <w:pStyle w:val="Heading2"/>
@@ -1790,11 +2034,13 @@
         <w:pStyle w:val="NormalWeb"/>
         <w:rPr>
           <w:rFonts w:asciiTheme="majorHAnsi" w:eastAsiaTheme="majorEastAsia" w:hAnsiTheme="majorHAnsi" w:cstheme="majorBidi"/>
-        </w:rPr>
-      </w:pPr>
-      <w:r>
-        <w:rPr>
-          <w:rFonts w:asciiTheme="majorHAnsi" w:eastAsiaTheme="majorEastAsia" w:hAnsiTheme="majorHAnsi" w:cstheme="majorBidi"/>
+          <w:color w:val="808080" w:themeColor="background1" w:themeShade="80"/>
+        </w:rPr>
+      </w:pPr>
+      <w:r>
+        <w:rPr>
+          <w:rFonts w:asciiTheme="majorHAnsi" w:eastAsiaTheme="majorEastAsia" w:hAnsiTheme="majorHAnsi" w:cstheme="majorBidi"/>
+          <w:color w:val="808080" w:themeColor="background1" w:themeShade="80"/>
         </w:rPr>
         <w:t>This section explains HOW experiments were conducted.</w:t>
       </w:r>
@@ -1817,10 +2063,11 @@
           <w:szCs w:val="32"/>
         </w:rPr>
         <w:pict w14:anchorId="6ECB6254">
-          <v:rect id="_x0000_i1495" style="width:0;height:1.5pt" o:hralign="center" o:hrstd="t" o:hr="t" fillcolor="#a0a0a0" stroked="f"/>
+          <v:rect id="_x0000_i1040" style="width:0;height:1.5pt" o:hralign="center" o:hrstd="t" o:hr="t" fillcolor="#a0a0a0" stroked="f"/>
         </w:pict>
       </w:r>
     </w:p>
+    <w:p/>
     <w:p>
       <w:pPr>
         <w:pStyle w:val="Heading3"/>
@@ -1834,11 +2081,13 @@
         <w:pStyle w:val="NormalWeb"/>
         <w:rPr>
           <w:rFonts w:asciiTheme="majorHAnsi" w:eastAsiaTheme="majorEastAsia" w:hAnsiTheme="majorHAnsi" w:cstheme="majorBidi"/>
-        </w:rPr>
-      </w:pPr>
-      <w:r>
-        <w:rPr>
-          <w:rFonts w:asciiTheme="majorHAnsi" w:eastAsiaTheme="majorEastAsia" w:hAnsiTheme="majorHAnsi" w:cstheme="majorBidi"/>
+          <w:color w:val="808080" w:themeColor="background1" w:themeShade="80"/>
+        </w:rPr>
+      </w:pPr>
+      <w:r>
+        <w:rPr>
+          <w:rFonts w:asciiTheme="majorHAnsi" w:eastAsiaTheme="majorEastAsia" w:hAnsiTheme="majorHAnsi" w:cstheme="majorBidi"/>
+          <w:color w:val="808080" w:themeColor="background1" w:themeShade="80"/>
         </w:rPr>
         <w:t>Explain:</w:t>
       </w:r>
@@ -1852,11 +2101,13 @@
         </w:numPr>
         <w:rPr>
           <w:rFonts w:asciiTheme="majorHAnsi" w:eastAsiaTheme="majorEastAsia" w:hAnsiTheme="majorHAnsi" w:cstheme="majorBidi"/>
-        </w:rPr>
-      </w:pPr>
-      <w:r>
-        <w:rPr>
-          <w:rFonts w:asciiTheme="majorHAnsi" w:eastAsiaTheme="majorEastAsia" w:hAnsiTheme="majorHAnsi" w:cstheme="majorBidi"/>
+          <w:color w:val="808080" w:themeColor="background1" w:themeShade="80"/>
+        </w:rPr>
+      </w:pPr>
+      <w:r>
+        <w:rPr>
+          <w:rFonts w:asciiTheme="majorHAnsi" w:eastAsiaTheme="majorEastAsia" w:hAnsiTheme="majorHAnsi" w:cstheme="majorBidi"/>
+          <w:color w:val="808080" w:themeColor="background1" w:themeShade="80"/>
         </w:rPr>
         <w:t xml:space="preserve">population size ranges </w:t>
       </w:r>
@@ -1870,11 +2121,13 @@
         </w:numPr>
         <w:rPr>
           <w:rFonts w:asciiTheme="majorHAnsi" w:eastAsiaTheme="majorEastAsia" w:hAnsiTheme="majorHAnsi" w:cstheme="majorBidi"/>
-        </w:rPr>
-      </w:pPr>
-      <w:r>
-        <w:rPr>
-          <w:rFonts w:asciiTheme="majorHAnsi" w:eastAsiaTheme="majorEastAsia" w:hAnsiTheme="majorHAnsi" w:cstheme="majorBidi"/>
+          <w:color w:val="808080" w:themeColor="background1" w:themeShade="80"/>
+        </w:rPr>
+      </w:pPr>
+      <w:r>
+        <w:rPr>
+          <w:rFonts w:asciiTheme="majorHAnsi" w:eastAsiaTheme="majorEastAsia" w:hAnsiTheme="majorHAnsi" w:cstheme="majorBidi"/>
+          <w:color w:val="808080" w:themeColor="background1" w:themeShade="80"/>
         </w:rPr>
         <w:t xml:space="preserve">mutation rates </w:t>
       </w:r>
@@ -1888,11 +2141,13 @@
         </w:numPr>
         <w:rPr>
           <w:rFonts w:asciiTheme="majorHAnsi" w:eastAsiaTheme="majorEastAsia" w:hAnsiTheme="majorHAnsi" w:cstheme="majorBidi"/>
-        </w:rPr>
-      </w:pPr>
-      <w:r>
-        <w:rPr>
-          <w:rFonts w:asciiTheme="majorHAnsi" w:eastAsiaTheme="majorEastAsia" w:hAnsiTheme="majorHAnsi" w:cstheme="majorBidi"/>
+          <w:color w:val="808080" w:themeColor="background1" w:themeShade="80"/>
+        </w:rPr>
+      </w:pPr>
+      <w:r>
+        <w:rPr>
+          <w:rFonts w:asciiTheme="majorHAnsi" w:eastAsiaTheme="majorEastAsia" w:hAnsiTheme="majorHAnsi" w:cstheme="majorBidi"/>
+          <w:color w:val="808080" w:themeColor="background1" w:themeShade="80"/>
         </w:rPr>
         <w:t xml:space="preserve">generation counts </w:t>
       </w:r>
@@ -1906,11 +2161,13 @@
         </w:numPr>
         <w:rPr>
           <w:rFonts w:asciiTheme="majorHAnsi" w:eastAsiaTheme="majorEastAsia" w:hAnsiTheme="majorHAnsi" w:cstheme="majorBidi"/>
-        </w:rPr>
-      </w:pPr>
-      <w:r>
-        <w:rPr>
-          <w:rFonts w:asciiTheme="majorHAnsi" w:eastAsiaTheme="majorEastAsia" w:hAnsiTheme="majorHAnsi" w:cstheme="majorBidi"/>
+          <w:color w:val="808080" w:themeColor="background1" w:themeShade="80"/>
+        </w:rPr>
+      </w:pPr>
+      <w:r>
+        <w:rPr>
+          <w:rFonts w:asciiTheme="majorHAnsi" w:eastAsiaTheme="majorEastAsia" w:hAnsiTheme="majorHAnsi" w:cstheme="majorBidi"/>
+          <w:color w:val="808080" w:themeColor="background1" w:themeShade="80"/>
         </w:rPr>
         <w:t xml:space="preserve">number of items </w:t>
       </w:r>
@@ -1933,10 +2190,11 @@
           <w:szCs w:val="32"/>
         </w:rPr>
         <w:pict w14:anchorId="0B883584">
-          <v:rect id="_x0000_i1496" style="width:0;height:1.5pt" o:hralign="center" o:hrstd="t" o:hr="t" fillcolor="#a0a0a0" stroked="f"/>
+          <v:rect id="_x0000_i1041" style="width:0;height:1.5pt" o:hralign="center" o:hrstd="t" o:hr="t" fillcolor="#a0a0a0" stroked="f"/>
         </w:pict>
       </w:r>
     </w:p>
+    <w:p/>
     <w:p>
       <w:pPr>
         <w:pStyle w:val="Heading3"/>
@@ -1950,11 +2208,13 @@
         <w:pStyle w:val="NormalWeb"/>
         <w:rPr>
           <w:rFonts w:asciiTheme="majorHAnsi" w:eastAsiaTheme="majorEastAsia" w:hAnsiTheme="majorHAnsi" w:cstheme="majorBidi"/>
-        </w:rPr>
-      </w:pPr>
-      <w:r>
-        <w:rPr>
-          <w:rFonts w:asciiTheme="majorHAnsi" w:eastAsiaTheme="majorEastAsia" w:hAnsiTheme="majorHAnsi" w:cstheme="majorBidi"/>
+          <w:color w:val="808080" w:themeColor="background1" w:themeShade="80"/>
+        </w:rPr>
+      </w:pPr>
+      <w:r>
+        <w:rPr>
+          <w:rFonts w:asciiTheme="majorHAnsi" w:eastAsiaTheme="majorEastAsia" w:hAnsiTheme="majorHAnsi" w:cstheme="majorBidi"/>
+          <w:color w:val="808080" w:themeColor="background1" w:themeShade="80"/>
         </w:rPr>
         <w:t>Define:</w:t>
       </w:r>
@@ -1968,11 +2228,13 @@
         </w:numPr>
         <w:rPr>
           <w:rFonts w:asciiTheme="majorHAnsi" w:eastAsiaTheme="majorEastAsia" w:hAnsiTheme="majorHAnsi" w:cstheme="majorBidi"/>
-        </w:rPr>
-      </w:pPr>
-      <w:r>
-        <w:rPr>
-          <w:rFonts w:asciiTheme="majorHAnsi" w:eastAsiaTheme="majorEastAsia" w:hAnsiTheme="majorHAnsi" w:cstheme="majorBidi"/>
+          <w:color w:val="808080" w:themeColor="background1" w:themeShade="80"/>
+        </w:rPr>
+      </w:pPr>
+      <w:r>
+        <w:rPr>
+          <w:rFonts w:asciiTheme="majorHAnsi" w:eastAsiaTheme="majorEastAsia" w:hAnsiTheme="majorHAnsi" w:cstheme="majorBidi"/>
+          <w:color w:val="808080" w:themeColor="background1" w:themeShade="80"/>
         </w:rPr>
         <w:t xml:space="preserve">route distance </w:t>
       </w:r>
@@ -1986,13 +2248,14 @@
         </w:numPr>
         <w:rPr>
           <w:rFonts w:asciiTheme="majorHAnsi" w:eastAsiaTheme="majorEastAsia" w:hAnsiTheme="majorHAnsi" w:cstheme="majorBidi"/>
-        </w:rPr>
-      </w:pPr>
-      <w:r>
-        <w:rPr>
-          <w:rFonts w:asciiTheme="majorHAnsi" w:eastAsiaTheme="majorEastAsia" w:hAnsiTheme="majorHAnsi" w:cstheme="majorBidi"/>
-        </w:rPr>
-        <w:lastRenderedPageBreak/>
+          <w:color w:val="808080" w:themeColor="background1" w:themeShade="80"/>
+        </w:rPr>
+      </w:pPr>
+      <w:r>
+        <w:rPr>
+          <w:rFonts w:asciiTheme="majorHAnsi" w:eastAsiaTheme="majorEastAsia" w:hAnsiTheme="majorHAnsi" w:cstheme="majorBidi"/>
+          <w:color w:val="808080" w:themeColor="background1" w:themeShade="80"/>
+        </w:rPr>
         <w:t xml:space="preserve">runtime </w:t>
       </w:r>
     </w:p>
@@ -2005,11 +2268,13 @@
         </w:numPr>
         <w:rPr>
           <w:rFonts w:asciiTheme="majorHAnsi" w:eastAsiaTheme="majorEastAsia" w:hAnsiTheme="majorHAnsi" w:cstheme="majorBidi"/>
-        </w:rPr>
-      </w:pPr>
-      <w:r>
-        <w:rPr>
-          <w:rFonts w:asciiTheme="majorHAnsi" w:eastAsiaTheme="majorEastAsia" w:hAnsiTheme="majorHAnsi" w:cstheme="majorBidi"/>
+          <w:color w:val="808080" w:themeColor="background1" w:themeShade="80"/>
+        </w:rPr>
+      </w:pPr>
+      <w:r>
+        <w:rPr>
+          <w:rFonts w:asciiTheme="majorHAnsi" w:eastAsiaTheme="majorEastAsia" w:hAnsiTheme="majorHAnsi" w:cstheme="majorBidi"/>
+          <w:color w:val="808080" w:themeColor="background1" w:themeShade="80"/>
         </w:rPr>
         <w:t xml:space="preserve">convergence speed </w:t>
       </w:r>
@@ -2023,11 +2288,13 @@
         </w:numPr>
         <w:rPr>
           <w:rFonts w:asciiTheme="majorHAnsi" w:eastAsiaTheme="majorEastAsia" w:hAnsiTheme="majorHAnsi" w:cstheme="majorBidi"/>
-        </w:rPr>
-      </w:pPr>
-      <w:r>
-        <w:rPr>
-          <w:rFonts w:asciiTheme="majorHAnsi" w:eastAsiaTheme="majorEastAsia" w:hAnsiTheme="majorHAnsi" w:cstheme="majorBidi"/>
+          <w:color w:val="808080" w:themeColor="background1" w:themeShade="80"/>
+        </w:rPr>
+      </w:pPr>
+      <w:r>
+        <w:rPr>
+          <w:rFonts w:asciiTheme="majorHAnsi" w:eastAsiaTheme="majorEastAsia" w:hAnsiTheme="majorHAnsi" w:cstheme="majorBidi"/>
+          <w:color w:val="808080" w:themeColor="background1" w:themeShade="80"/>
         </w:rPr>
         <w:t xml:space="preserve">fitness evolution </w:t>
       </w:r>
@@ -2050,15 +2317,17 @@
           <w:szCs w:val="32"/>
         </w:rPr>
         <w:pict w14:anchorId="0379CC51">
-          <v:rect id="_x0000_i1497" style="width:0;height:1.5pt" o:hralign="center" o:hrstd="t" o:hr="t" fillcolor="#a0a0a0" stroked="f"/>
+          <v:rect id="_x0000_i1042" style="width:0;height:1.5pt" o:hralign="center" o:hrstd="t" o:hr="t" fillcolor="#a0a0a0" stroked="f"/>
         </w:pict>
       </w:r>
     </w:p>
+    <w:p/>
     <w:p>
       <w:pPr>
         <w:pStyle w:val="Heading3"/>
       </w:pPr>
       <w:r>
+        <w:lastRenderedPageBreak/>
         <w:t>4.3 Baseline Comparison</w:t>
       </w:r>
     </w:p>
@@ -2067,11 +2336,13 @@
         <w:pStyle w:val="NormalWeb"/>
         <w:rPr>
           <w:rFonts w:asciiTheme="majorHAnsi" w:eastAsiaTheme="majorEastAsia" w:hAnsiTheme="majorHAnsi" w:cstheme="majorBidi"/>
-        </w:rPr>
-      </w:pPr>
-      <w:r>
-        <w:rPr>
-          <w:rFonts w:asciiTheme="majorHAnsi" w:eastAsiaTheme="majorEastAsia" w:hAnsiTheme="majorHAnsi" w:cstheme="majorBidi"/>
+          <w:color w:val="808080" w:themeColor="background1" w:themeShade="80"/>
+        </w:rPr>
+      </w:pPr>
+      <w:r>
+        <w:rPr>
+          <w:rFonts w:asciiTheme="majorHAnsi" w:eastAsiaTheme="majorEastAsia" w:hAnsiTheme="majorHAnsi" w:cstheme="majorBidi"/>
+          <w:color w:val="808080" w:themeColor="background1" w:themeShade="80"/>
         </w:rPr>
         <w:t>Explain the random route comparison:</w:t>
       </w:r>
@@ -2085,11 +2356,13 @@
         </w:numPr>
         <w:rPr>
           <w:rFonts w:asciiTheme="majorHAnsi" w:eastAsiaTheme="majorEastAsia" w:hAnsiTheme="majorHAnsi" w:cstheme="majorBidi"/>
-        </w:rPr>
-      </w:pPr>
-      <w:r>
-        <w:rPr>
-          <w:rFonts w:asciiTheme="majorHAnsi" w:eastAsiaTheme="majorEastAsia" w:hAnsiTheme="majorHAnsi" w:cstheme="majorBidi"/>
+          <w:color w:val="808080" w:themeColor="background1" w:themeShade="80"/>
+        </w:rPr>
+      </w:pPr>
+      <w:r>
+        <w:rPr>
+          <w:rFonts w:asciiTheme="majorHAnsi" w:eastAsiaTheme="majorEastAsia" w:hAnsiTheme="majorHAnsi" w:cstheme="majorBidi"/>
+          <w:color w:val="808080" w:themeColor="background1" w:themeShade="80"/>
         </w:rPr>
         <w:t xml:space="preserve">random picking order </w:t>
       </w:r>
@@ -2103,11 +2376,13 @@
         </w:numPr>
         <w:rPr>
           <w:rFonts w:asciiTheme="majorHAnsi" w:eastAsiaTheme="majorEastAsia" w:hAnsiTheme="majorHAnsi" w:cstheme="majorBidi"/>
-        </w:rPr>
-      </w:pPr>
-      <w:r>
-        <w:rPr>
-          <w:rFonts w:asciiTheme="majorHAnsi" w:eastAsiaTheme="majorEastAsia" w:hAnsiTheme="majorHAnsi" w:cstheme="majorBidi"/>
+          <w:color w:val="808080" w:themeColor="background1" w:themeShade="80"/>
+        </w:rPr>
+      </w:pPr>
+      <w:r>
+        <w:rPr>
+          <w:rFonts w:asciiTheme="majorHAnsi" w:eastAsiaTheme="majorEastAsia" w:hAnsiTheme="majorHAnsi" w:cstheme="majorBidi"/>
+          <w:color w:val="808080" w:themeColor="background1" w:themeShade="80"/>
         </w:rPr>
         <w:t xml:space="preserve">optimized picking order </w:t>
       </w:r>
@@ -2117,11 +2392,13 @@
         <w:pStyle w:val="NormalWeb"/>
         <w:rPr>
           <w:rFonts w:asciiTheme="majorHAnsi" w:eastAsiaTheme="majorEastAsia" w:hAnsiTheme="majorHAnsi" w:cstheme="majorBidi"/>
-        </w:rPr>
-      </w:pPr>
-      <w:r>
-        <w:rPr>
-          <w:rFonts w:asciiTheme="majorHAnsi" w:eastAsiaTheme="majorEastAsia" w:hAnsiTheme="majorHAnsi" w:cstheme="majorBidi"/>
+          <w:color w:val="808080" w:themeColor="background1" w:themeShade="80"/>
+        </w:rPr>
+      </w:pPr>
+      <w:r>
+        <w:rPr>
+          <w:rFonts w:asciiTheme="majorHAnsi" w:eastAsiaTheme="majorEastAsia" w:hAnsiTheme="majorHAnsi" w:cstheme="majorBidi"/>
+          <w:color w:val="808080" w:themeColor="background1" w:themeShade="80"/>
         </w:rPr>
         <w:t>This is important because it validates the optimization.</w:t>
       </w:r>
@@ -2144,10 +2421,11 @@
           <w:szCs w:val="32"/>
         </w:rPr>
         <w:pict w14:anchorId="729FFE37">
-          <v:rect id="_x0000_i1498" style="width:0;height:1.5pt" o:hralign="center" o:hrstd="t" o:hr="t" fillcolor="#a0a0a0" stroked="f"/>
+          <v:rect id="_x0000_i1043" style="width:0;height:1.5pt" o:hralign="center" o:hrstd="t" o:hr="t" fillcolor="#a0a0a0" stroked="f"/>
         </w:pict>
       </w:r>
     </w:p>
+    <w:p/>
     <w:p>
       <w:pPr>
         <w:pStyle w:val="Heading2"/>
@@ -2161,11 +2439,13 @@
         <w:pStyle w:val="NormalWeb"/>
         <w:rPr>
           <w:rFonts w:asciiTheme="majorHAnsi" w:eastAsiaTheme="majorEastAsia" w:hAnsiTheme="majorHAnsi" w:cstheme="majorBidi"/>
-        </w:rPr>
-      </w:pPr>
-      <w:r>
-        <w:rPr>
-          <w:rFonts w:asciiTheme="majorHAnsi" w:eastAsiaTheme="majorEastAsia" w:hAnsiTheme="majorHAnsi" w:cstheme="majorBidi"/>
+          <w:color w:val="808080" w:themeColor="background1" w:themeShade="80"/>
+        </w:rPr>
+      </w:pPr>
+      <w:r>
+        <w:rPr>
+          <w:rFonts w:asciiTheme="majorHAnsi" w:eastAsiaTheme="majorEastAsia" w:hAnsiTheme="majorHAnsi" w:cstheme="majorBidi"/>
+          <w:color w:val="808080" w:themeColor="background1" w:themeShade="80"/>
         </w:rPr>
         <w:t>This is now your largest and strongest section.</w:t>
       </w:r>
@@ -2188,10 +2468,11 @@
           <w:szCs w:val="32"/>
         </w:rPr>
         <w:pict w14:anchorId="7EE8660F">
-          <v:rect id="_x0000_i1499" style="width:0;height:1.5pt" o:hralign="center" o:hrstd="t" o:hr="t" fillcolor="#a0a0a0" stroked="f"/>
+          <v:rect id="_x0000_i1044" style="width:0;height:1.5pt" o:hralign="center" o:hrstd="t" o:hr="t" fillcolor="#a0a0a0" stroked="f"/>
         </w:pict>
       </w:r>
     </w:p>
+    <w:p/>
     <w:p>
       <w:pPr>
         <w:pStyle w:val="Heading3"/>
@@ -2205,11 +2486,13 @@
         <w:pStyle w:val="NormalWeb"/>
         <w:rPr>
           <w:rFonts w:asciiTheme="majorHAnsi" w:eastAsiaTheme="majorEastAsia" w:hAnsiTheme="majorHAnsi" w:cstheme="majorBidi"/>
-        </w:rPr>
-      </w:pPr>
-      <w:r>
-        <w:rPr>
-          <w:rFonts w:asciiTheme="majorHAnsi" w:eastAsiaTheme="majorEastAsia" w:hAnsiTheme="majorHAnsi" w:cstheme="majorBidi"/>
+          <w:color w:val="808080" w:themeColor="background1" w:themeShade="80"/>
+        </w:rPr>
+      </w:pPr>
+      <w:r>
+        <w:rPr>
+          <w:rFonts w:asciiTheme="majorHAnsi" w:eastAsiaTheme="majorEastAsia" w:hAnsiTheme="majorHAnsi" w:cstheme="majorBidi"/>
+          <w:color w:val="808080" w:themeColor="background1" w:themeShade="80"/>
         </w:rPr>
         <w:t>Include:</w:t>
       </w:r>
@@ -2223,11 +2506,13 @@
         </w:numPr>
         <w:rPr>
           <w:rFonts w:asciiTheme="majorHAnsi" w:eastAsiaTheme="majorEastAsia" w:hAnsiTheme="majorHAnsi" w:cstheme="majorBidi"/>
-        </w:rPr>
-      </w:pPr>
-      <w:r>
-        <w:rPr>
-          <w:rFonts w:asciiTheme="majorHAnsi" w:eastAsiaTheme="majorEastAsia" w:hAnsiTheme="majorHAnsi" w:cstheme="majorBidi"/>
+          <w:color w:val="808080" w:themeColor="background1" w:themeShade="80"/>
+        </w:rPr>
+      </w:pPr>
+      <w:r>
+        <w:rPr>
+          <w:rFonts w:asciiTheme="majorHAnsi" w:eastAsiaTheme="majorEastAsia" w:hAnsiTheme="majorHAnsi" w:cstheme="majorBidi"/>
+          <w:color w:val="808080" w:themeColor="background1" w:themeShade="80"/>
         </w:rPr>
         <w:t xml:space="preserve">random route visualization </w:t>
       </w:r>
@@ -2241,11 +2526,13 @@
         </w:numPr>
         <w:rPr>
           <w:rFonts w:asciiTheme="majorHAnsi" w:eastAsiaTheme="majorEastAsia" w:hAnsiTheme="majorHAnsi" w:cstheme="majorBidi"/>
-        </w:rPr>
-      </w:pPr>
-      <w:r>
-        <w:rPr>
-          <w:rFonts w:asciiTheme="majorHAnsi" w:eastAsiaTheme="majorEastAsia" w:hAnsiTheme="majorHAnsi" w:cstheme="majorBidi"/>
+          <w:color w:val="808080" w:themeColor="background1" w:themeShade="80"/>
+        </w:rPr>
+      </w:pPr>
+      <w:r>
+        <w:rPr>
+          <w:rFonts w:asciiTheme="majorHAnsi" w:eastAsiaTheme="majorEastAsia" w:hAnsiTheme="majorHAnsi" w:cstheme="majorBidi"/>
+          <w:color w:val="808080" w:themeColor="background1" w:themeShade="80"/>
         </w:rPr>
         <w:t xml:space="preserve">optimized route visualization </w:t>
       </w:r>
@@ -2255,11 +2542,13 @@
         <w:pStyle w:val="NormalWeb"/>
         <w:rPr>
           <w:rFonts w:asciiTheme="majorHAnsi" w:eastAsiaTheme="majorEastAsia" w:hAnsiTheme="majorHAnsi" w:cstheme="majorBidi"/>
-        </w:rPr>
-      </w:pPr>
-      <w:r>
-        <w:rPr>
-          <w:rFonts w:asciiTheme="majorHAnsi" w:eastAsiaTheme="majorEastAsia" w:hAnsiTheme="majorHAnsi" w:cstheme="majorBidi"/>
+          <w:color w:val="808080" w:themeColor="background1" w:themeShade="80"/>
+        </w:rPr>
+      </w:pPr>
+      <w:r>
+        <w:rPr>
+          <w:rFonts w:asciiTheme="majorHAnsi" w:eastAsiaTheme="majorEastAsia" w:hAnsiTheme="majorHAnsi" w:cstheme="majorBidi"/>
+          <w:color w:val="808080" w:themeColor="background1" w:themeShade="80"/>
         </w:rPr>
         <w:t>Table example:</w:t>
       </w:r>
@@ -2298,6 +2587,7 @@
                 <w:rFonts w:asciiTheme="majorHAnsi" w:eastAsiaTheme="majorEastAsia" w:hAnsiTheme="majorHAnsi" w:cstheme="majorBidi"/>
                 <w:b/>
                 <w:bCs/>
+                <w:color w:val="808080" w:themeColor="background1" w:themeShade="80"/>
               </w:rPr>
             </w:pPr>
             <w:r>
@@ -2305,6 +2595,7 @@
                 <w:rFonts w:asciiTheme="majorHAnsi" w:eastAsiaTheme="majorEastAsia" w:hAnsiTheme="majorHAnsi" w:cstheme="majorBidi"/>
                 <w:b/>
                 <w:bCs/>
+                <w:color w:val="808080" w:themeColor="background1" w:themeShade="80"/>
               </w:rPr>
               <w:t>Method</w:t>
             </w:r>
@@ -2323,6 +2614,7 @@
                 <w:rFonts w:asciiTheme="majorHAnsi" w:eastAsiaTheme="majorEastAsia" w:hAnsiTheme="majorHAnsi" w:cstheme="majorBidi"/>
                 <w:b/>
                 <w:bCs/>
+                <w:color w:val="808080" w:themeColor="background1" w:themeShade="80"/>
               </w:rPr>
             </w:pPr>
             <w:r>
@@ -2330,6 +2622,7 @@
                 <w:rFonts w:asciiTheme="majorHAnsi" w:eastAsiaTheme="majorEastAsia" w:hAnsiTheme="majorHAnsi" w:cstheme="majorBidi"/>
                 <w:b/>
                 <w:bCs/>
+                <w:color w:val="808080" w:themeColor="background1" w:themeShade="80"/>
               </w:rPr>
               <w:t>Distance</w:t>
             </w:r>
@@ -2351,11 +2644,13 @@
               <w:pStyle w:val="NormalWeb"/>
               <w:rPr>
                 <w:rFonts w:asciiTheme="majorHAnsi" w:eastAsiaTheme="majorEastAsia" w:hAnsiTheme="majorHAnsi" w:cstheme="majorBidi"/>
+                <w:color w:val="808080" w:themeColor="background1" w:themeShade="80"/>
               </w:rPr>
             </w:pPr>
             <w:r>
               <w:rPr>
                 <w:rFonts w:asciiTheme="majorHAnsi" w:eastAsiaTheme="majorEastAsia" w:hAnsiTheme="majorHAnsi" w:cstheme="majorBidi"/>
+                <w:color w:val="808080" w:themeColor="background1" w:themeShade="80"/>
               </w:rPr>
               <w:t>Random</w:t>
             </w:r>
@@ -2372,11 +2667,13 @@
               <w:pStyle w:val="NormalWeb"/>
               <w:rPr>
                 <w:rFonts w:asciiTheme="majorHAnsi" w:eastAsiaTheme="majorEastAsia" w:hAnsiTheme="majorHAnsi" w:cstheme="majorBidi"/>
+                <w:color w:val="808080" w:themeColor="background1" w:themeShade="80"/>
               </w:rPr>
             </w:pPr>
             <w:r>
               <w:rPr>
                 <w:rFonts w:asciiTheme="majorHAnsi" w:eastAsiaTheme="majorEastAsia" w:hAnsiTheme="majorHAnsi" w:cstheme="majorBidi"/>
+                <w:color w:val="808080" w:themeColor="background1" w:themeShade="80"/>
               </w:rPr>
               <w:t>1240</w:t>
             </w:r>
@@ -2398,11 +2695,13 @@
               <w:pStyle w:val="NormalWeb"/>
               <w:rPr>
                 <w:rFonts w:asciiTheme="majorHAnsi" w:eastAsiaTheme="majorEastAsia" w:hAnsiTheme="majorHAnsi" w:cstheme="majorBidi"/>
+                <w:color w:val="808080" w:themeColor="background1" w:themeShade="80"/>
               </w:rPr>
             </w:pPr>
             <w:r>
               <w:rPr>
                 <w:rFonts w:asciiTheme="majorHAnsi" w:eastAsiaTheme="majorEastAsia" w:hAnsiTheme="majorHAnsi" w:cstheme="majorBidi"/>
+                <w:color w:val="808080" w:themeColor="background1" w:themeShade="80"/>
               </w:rPr>
               <w:t>GA Optimized</w:t>
             </w:r>
@@ -2419,11 +2718,13 @@
               <w:pStyle w:val="NormalWeb"/>
               <w:rPr>
                 <w:rFonts w:asciiTheme="majorHAnsi" w:eastAsiaTheme="majorEastAsia" w:hAnsiTheme="majorHAnsi" w:cstheme="majorBidi"/>
+                <w:color w:val="808080" w:themeColor="background1" w:themeShade="80"/>
               </w:rPr>
             </w:pPr>
             <w:r>
               <w:rPr>
                 <w:rFonts w:asciiTheme="majorHAnsi" w:eastAsiaTheme="majorEastAsia" w:hAnsiTheme="majorHAnsi" w:cstheme="majorBidi"/>
+                <w:color w:val="808080" w:themeColor="background1" w:themeShade="80"/>
               </w:rPr>
               <w:t>590</w:t>
             </w:r>
@@ -2436,11 +2737,13 @@
         <w:pStyle w:val="NormalWeb"/>
         <w:rPr>
           <w:rFonts w:asciiTheme="majorHAnsi" w:eastAsiaTheme="majorEastAsia" w:hAnsiTheme="majorHAnsi" w:cstheme="majorBidi"/>
-        </w:rPr>
-      </w:pPr>
-      <w:r>
-        <w:rPr>
-          <w:rFonts w:asciiTheme="majorHAnsi" w:eastAsiaTheme="majorEastAsia" w:hAnsiTheme="majorHAnsi" w:cstheme="majorBidi"/>
+          <w:color w:val="808080" w:themeColor="background1" w:themeShade="80"/>
+        </w:rPr>
+      </w:pPr>
+      <w:r>
+        <w:rPr>
+          <w:rFonts w:asciiTheme="majorHAnsi" w:eastAsiaTheme="majorEastAsia" w:hAnsiTheme="majorHAnsi" w:cstheme="majorBidi"/>
+          <w:color w:val="808080" w:themeColor="background1" w:themeShade="80"/>
         </w:rPr>
         <w:t>Discuss:</w:t>
       </w:r>
@@ -2454,11 +2757,13 @@
         </w:numPr>
         <w:rPr>
           <w:rFonts w:asciiTheme="majorHAnsi" w:eastAsiaTheme="majorEastAsia" w:hAnsiTheme="majorHAnsi" w:cstheme="majorBidi"/>
-        </w:rPr>
-      </w:pPr>
-      <w:r>
-        <w:rPr>
-          <w:rFonts w:asciiTheme="majorHAnsi" w:eastAsiaTheme="majorEastAsia" w:hAnsiTheme="majorHAnsi" w:cstheme="majorBidi"/>
+          <w:color w:val="808080" w:themeColor="background1" w:themeShade="80"/>
+        </w:rPr>
+      </w:pPr>
+      <w:r>
+        <w:rPr>
+          <w:rFonts w:asciiTheme="majorHAnsi" w:eastAsiaTheme="majorEastAsia" w:hAnsiTheme="majorHAnsi" w:cstheme="majorBidi"/>
+          <w:color w:val="808080" w:themeColor="background1" w:themeShade="80"/>
         </w:rPr>
         <w:t xml:space="preserve">percentage improvement </w:t>
       </w:r>
@@ -2481,16 +2786,16 @@
           <w:szCs w:val="32"/>
         </w:rPr>
         <w:pict w14:anchorId="34A044D0">
-          <v:rect id="_x0000_i1500" style="width:0;height:1.5pt" o:hralign="center" o:hrstd="t" o:hr="t" fillcolor="#a0a0a0" stroked="f"/>
+          <v:rect id="_x0000_i1045" style="width:0;height:1.5pt" o:hralign="center" o:hrstd="t" o:hr="t" fillcolor="#a0a0a0" stroked="f"/>
         </w:pict>
       </w:r>
     </w:p>
+    <w:p/>
     <w:p>
       <w:pPr>
         <w:pStyle w:val="Heading3"/>
       </w:pPr>
       <w:r>
-        <w:lastRenderedPageBreak/>
         <w:t>5.2 Parent Selection Analysis</w:t>
       </w:r>
     </w:p>
@@ -2499,11 +2804,13 @@
         <w:pStyle w:val="NormalWeb"/>
         <w:rPr>
           <w:rFonts w:asciiTheme="majorHAnsi" w:eastAsiaTheme="majorEastAsia" w:hAnsiTheme="majorHAnsi" w:cstheme="majorBidi"/>
-        </w:rPr>
-      </w:pPr>
-      <w:r>
-        <w:rPr>
-          <w:rFonts w:asciiTheme="majorHAnsi" w:eastAsiaTheme="majorEastAsia" w:hAnsiTheme="majorHAnsi" w:cstheme="majorBidi"/>
+          <w:color w:val="808080" w:themeColor="background1" w:themeShade="80"/>
+        </w:rPr>
+      </w:pPr>
+      <w:r>
+        <w:rPr>
+          <w:rFonts w:asciiTheme="majorHAnsi" w:eastAsiaTheme="majorEastAsia" w:hAnsiTheme="majorHAnsi" w:cstheme="majorBidi"/>
+          <w:color w:val="808080" w:themeColor="background1" w:themeShade="80"/>
         </w:rPr>
         <w:t>Compare:</w:t>
       </w:r>
@@ -2517,12 +2824,15 @@
         </w:numPr>
         <w:rPr>
           <w:rFonts w:asciiTheme="majorHAnsi" w:eastAsiaTheme="majorEastAsia" w:hAnsiTheme="majorHAnsi" w:cstheme="majorBidi"/>
-        </w:rPr>
-      </w:pPr>
-      <w:r>
-        <w:rPr>
-          <w:rFonts w:asciiTheme="majorHAnsi" w:eastAsiaTheme="majorEastAsia" w:hAnsiTheme="majorHAnsi" w:cstheme="majorBidi"/>
-        </w:rPr>
+          <w:color w:val="808080" w:themeColor="background1" w:themeShade="80"/>
+        </w:rPr>
+      </w:pPr>
+      <w:r>
+        <w:rPr>
+          <w:rFonts w:asciiTheme="majorHAnsi" w:eastAsiaTheme="majorEastAsia" w:hAnsiTheme="majorHAnsi" w:cstheme="majorBidi"/>
+          <w:color w:val="808080" w:themeColor="background1" w:themeShade="80"/>
+        </w:rPr>
+        <w:lastRenderedPageBreak/>
         <w:t xml:space="preserve">Random </w:t>
       </w:r>
     </w:p>
@@ -2535,11 +2845,13 @@
         </w:numPr>
         <w:rPr>
           <w:rFonts w:asciiTheme="majorHAnsi" w:eastAsiaTheme="majorEastAsia" w:hAnsiTheme="majorHAnsi" w:cstheme="majorBidi"/>
-        </w:rPr>
-      </w:pPr>
-      <w:r>
-        <w:rPr>
-          <w:rFonts w:asciiTheme="majorHAnsi" w:eastAsiaTheme="majorEastAsia" w:hAnsiTheme="majorHAnsi" w:cstheme="majorBidi"/>
+          <w:color w:val="808080" w:themeColor="background1" w:themeShade="80"/>
+        </w:rPr>
+      </w:pPr>
+      <w:r>
+        <w:rPr>
+          <w:rFonts w:asciiTheme="majorHAnsi" w:eastAsiaTheme="majorEastAsia" w:hAnsiTheme="majorHAnsi" w:cstheme="majorBidi"/>
+          <w:color w:val="808080" w:themeColor="background1" w:themeShade="80"/>
         </w:rPr>
         <w:t xml:space="preserve">Roulette </w:t>
       </w:r>
@@ -2553,11 +2865,13 @@
         </w:numPr>
         <w:rPr>
           <w:rFonts w:asciiTheme="majorHAnsi" w:eastAsiaTheme="majorEastAsia" w:hAnsiTheme="majorHAnsi" w:cstheme="majorBidi"/>
-        </w:rPr>
-      </w:pPr>
-      <w:r>
-        <w:rPr>
-          <w:rFonts w:asciiTheme="majorHAnsi" w:eastAsiaTheme="majorEastAsia" w:hAnsiTheme="majorHAnsi" w:cstheme="majorBidi"/>
+          <w:color w:val="808080" w:themeColor="background1" w:themeShade="80"/>
+        </w:rPr>
+      </w:pPr>
+      <w:r>
+        <w:rPr>
+          <w:rFonts w:asciiTheme="majorHAnsi" w:eastAsiaTheme="majorEastAsia" w:hAnsiTheme="majorHAnsi" w:cstheme="majorBidi"/>
+          <w:color w:val="808080" w:themeColor="background1" w:themeShade="80"/>
         </w:rPr>
         <w:t xml:space="preserve">SUS </w:t>
       </w:r>
@@ -2571,11 +2885,13 @@
         </w:numPr>
         <w:rPr>
           <w:rFonts w:asciiTheme="majorHAnsi" w:eastAsiaTheme="majorEastAsia" w:hAnsiTheme="majorHAnsi" w:cstheme="majorBidi"/>
-        </w:rPr>
-      </w:pPr>
-      <w:r>
-        <w:rPr>
-          <w:rFonts w:asciiTheme="majorHAnsi" w:eastAsiaTheme="majorEastAsia" w:hAnsiTheme="majorHAnsi" w:cstheme="majorBidi"/>
+          <w:color w:val="808080" w:themeColor="background1" w:themeShade="80"/>
+        </w:rPr>
+      </w:pPr>
+      <w:r>
+        <w:rPr>
+          <w:rFonts w:asciiTheme="majorHAnsi" w:eastAsiaTheme="majorEastAsia" w:hAnsiTheme="majorHAnsi" w:cstheme="majorBidi"/>
+          <w:color w:val="808080" w:themeColor="background1" w:themeShade="80"/>
         </w:rPr>
         <w:t xml:space="preserve">Tournament </w:t>
       </w:r>
@@ -2589,11 +2905,13 @@
         </w:numPr>
         <w:rPr>
           <w:rFonts w:asciiTheme="majorHAnsi" w:eastAsiaTheme="majorEastAsia" w:hAnsiTheme="majorHAnsi" w:cstheme="majorBidi"/>
-        </w:rPr>
-      </w:pPr>
-      <w:r>
-        <w:rPr>
-          <w:rFonts w:asciiTheme="majorHAnsi" w:eastAsiaTheme="majorEastAsia" w:hAnsiTheme="majorHAnsi" w:cstheme="majorBidi"/>
+          <w:color w:val="808080" w:themeColor="background1" w:themeShade="80"/>
+        </w:rPr>
+      </w:pPr>
+      <w:r>
+        <w:rPr>
+          <w:rFonts w:asciiTheme="majorHAnsi" w:eastAsiaTheme="majorEastAsia" w:hAnsiTheme="majorHAnsi" w:cstheme="majorBidi"/>
+          <w:color w:val="808080" w:themeColor="background1" w:themeShade="80"/>
         </w:rPr>
         <w:t xml:space="preserve">Rank </w:t>
       </w:r>
@@ -2603,11 +2921,13 @@
         <w:pStyle w:val="NormalWeb"/>
         <w:rPr>
           <w:rFonts w:asciiTheme="majorHAnsi" w:eastAsiaTheme="majorEastAsia" w:hAnsiTheme="majorHAnsi" w:cstheme="majorBidi"/>
-        </w:rPr>
-      </w:pPr>
-      <w:r>
-        <w:rPr>
-          <w:rFonts w:asciiTheme="majorHAnsi" w:eastAsiaTheme="majorEastAsia" w:hAnsiTheme="majorHAnsi" w:cstheme="majorBidi"/>
+          <w:color w:val="808080" w:themeColor="background1" w:themeShade="80"/>
+        </w:rPr>
+      </w:pPr>
+      <w:r>
+        <w:rPr>
+          <w:rFonts w:asciiTheme="majorHAnsi" w:eastAsiaTheme="majorEastAsia" w:hAnsiTheme="majorHAnsi" w:cstheme="majorBidi"/>
+          <w:color w:val="808080" w:themeColor="background1" w:themeShade="80"/>
         </w:rPr>
         <w:t>Include:</w:t>
       </w:r>
@@ -2621,11 +2941,13 @@
         </w:numPr>
         <w:rPr>
           <w:rFonts w:asciiTheme="majorHAnsi" w:eastAsiaTheme="majorEastAsia" w:hAnsiTheme="majorHAnsi" w:cstheme="majorBidi"/>
-        </w:rPr>
-      </w:pPr>
-      <w:r>
-        <w:rPr>
-          <w:rFonts w:asciiTheme="majorHAnsi" w:eastAsiaTheme="majorEastAsia" w:hAnsiTheme="majorHAnsi" w:cstheme="majorBidi"/>
+          <w:color w:val="808080" w:themeColor="background1" w:themeShade="80"/>
+        </w:rPr>
+      </w:pPr>
+      <w:r>
+        <w:rPr>
+          <w:rFonts w:asciiTheme="majorHAnsi" w:eastAsiaTheme="majorEastAsia" w:hAnsiTheme="majorHAnsi" w:cstheme="majorBidi"/>
+          <w:color w:val="808080" w:themeColor="background1" w:themeShade="80"/>
         </w:rPr>
         <w:t xml:space="preserve">runtime comparison </w:t>
       </w:r>
@@ -2639,11 +2961,13 @@
         </w:numPr>
         <w:rPr>
           <w:rFonts w:asciiTheme="majorHAnsi" w:eastAsiaTheme="majorEastAsia" w:hAnsiTheme="majorHAnsi" w:cstheme="majorBidi"/>
-        </w:rPr>
-      </w:pPr>
-      <w:r>
-        <w:rPr>
-          <w:rFonts w:asciiTheme="majorHAnsi" w:eastAsiaTheme="majorEastAsia" w:hAnsiTheme="majorHAnsi" w:cstheme="majorBidi"/>
+          <w:color w:val="808080" w:themeColor="background1" w:themeShade="80"/>
+        </w:rPr>
+      </w:pPr>
+      <w:r>
+        <w:rPr>
+          <w:rFonts w:asciiTheme="majorHAnsi" w:eastAsiaTheme="majorEastAsia" w:hAnsiTheme="majorHAnsi" w:cstheme="majorBidi"/>
+          <w:color w:val="808080" w:themeColor="background1" w:themeShade="80"/>
         </w:rPr>
         <w:t xml:space="preserve">best distance comparison </w:t>
       </w:r>
@@ -2657,11 +2981,13 @@
         </w:numPr>
         <w:rPr>
           <w:rFonts w:asciiTheme="majorHAnsi" w:eastAsiaTheme="majorEastAsia" w:hAnsiTheme="majorHAnsi" w:cstheme="majorBidi"/>
-        </w:rPr>
-      </w:pPr>
-      <w:r>
-        <w:rPr>
-          <w:rFonts w:asciiTheme="majorHAnsi" w:eastAsiaTheme="majorEastAsia" w:hAnsiTheme="majorHAnsi" w:cstheme="majorBidi"/>
+          <w:color w:val="808080" w:themeColor="background1" w:themeShade="80"/>
+        </w:rPr>
+      </w:pPr>
+      <w:r>
+        <w:rPr>
+          <w:rFonts w:asciiTheme="majorHAnsi" w:eastAsiaTheme="majorEastAsia" w:hAnsiTheme="majorHAnsi" w:cstheme="majorBidi"/>
+          <w:color w:val="808080" w:themeColor="background1" w:themeShade="80"/>
         </w:rPr>
         <w:t xml:space="preserve">convergence graphs </w:t>
       </w:r>
@@ -2671,11 +2997,13 @@
         <w:pStyle w:val="NormalWeb"/>
         <w:rPr>
           <w:rFonts w:asciiTheme="majorHAnsi" w:eastAsiaTheme="majorEastAsia" w:hAnsiTheme="majorHAnsi" w:cstheme="majorBidi"/>
-        </w:rPr>
-      </w:pPr>
-      <w:r>
-        <w:rPr>
-          <w:rFonts w:asciiTheme="majorHAnsi" w:eastAsiaTheme="majorEastAsia" w:hAnsiTheme="majorHAnsi" w:cstheme="majorBidi"/>
+          <w:color w:val="808080" w:themeColor="background1" w:themeShade="80"/>
+        </w:rPr>
+      </w:pPr>
+      <w:r>
+        <w:rPr>
+          <w:rFonts w:asciiTheme="majorHAnsi" w:eastAsiaTheme="majorEastAsia" w:hAnsiTheme="majorHAnsi" w:cstheme="majorBidi"/>
+          <w:color w:val="808080" w:themeColor="background1" w:themeShade="80"/>
         </w:rPr>
         <w:t>Then conclude:</w:t>
       </w:r>
@@ -2685,11 +3013,13 @@
         <w:pStyle w:val="NormalWeb"/>
         <w:rPr>
           <w:rFonts w:asciiTheme="majorHAnsi" w:eastAsiaTheme="majorEastAsia" w:hAnsiTheme="majorHAnsi" w:cstheme="majorBidi"/>
-        </w:rPr>
-      </w:pPr>
-      <w:r>
-        <w:rPr>
-          <w:rFonts w:asciiTheme="majorHAnsi" w:eastAsiaTheme="majorEastAsia" w:hAnsiTheme="majorHAnsi" w:cstheme="majorBidi"/>
+          <w:color w:val="808080" w:themeColor="background1" w:themeShade="80"/>
+        </w:rPr>
+      </w:pPr>
+      <w:r>
+        <w:rPr>
+          <w:rFonts w:asciiTheme="majorHAnsi" w:eastAsiaTheme="majorEastAsia" w:hAnsiTheme="majorHAnsi" w:cstheme="majorBidi"/>
+          <w:color w:val="808080" w:themeColor="background1" w:themeShade="80"/>
         </w:rPr>
         <w:t>Tournament selection was selected for subsequent experiments due to...</w:t>
       </w:r>
@@ -2712,10 +3042,11 @@
           <w:szCs w:val="32"/>
         </w:rPr>
         <w:pict w14:anchorId="037CA0AE">
-          <v:rect id="_x0000_i1501" style="width:0;height:1.5pt" o:hralign="center" o:hrstd="t" o:hr="t" fillcolor="#a0a0a0" stroked="f"/>
+          <v:rect id="_x0000_i1046" style="width:0;height:1.5pt" o:hralign="center" o:hrstd="t" o:hr="t" fillcolor="#a0a0a0" stroked="f"/>
         </w:pict>
       </w:r>
     </w:p>
+    <w:p/>
     <w:p>
       <w:pPr>
         <w:pStyle w:val="Heading3"/>
@@ -2729,11 +3060,13 @@
         <w:pStyle w:val="NormalWeb"/>
         <w:rPr>
           <w:rFonts w:asciiTheme="majorHAnsi" w:eastAsiaTheme="majorEastAsia" w:hAnsiTheme="majorHAnsi" w:cstheme="majorBidi"/>
-        </w:rPr>
-      </w:pPr>
-      <w:r>
-        <w:rPr>
-          <w:rFonts w:asciiTheme="majorHAnsi" w:eastAsiaTheme="majorEastAsia" w:hAnsiTheme="majorHAnsi" w:cstheme="majorBidi"/>
+          <w:color w:val="808080" w:themeColor="background1" w:themeShade="80"/>
+        </w:rPr>
+      </w:pPr>
+      <w:r>
+        <w:rPr>
+          <w:rFonts w:asciiTheme="majorHAnsi" w:eastAsiaTheme="majorEastAsia" w:hAnsiTheme="majorHAnsi" w:cstheme="majorBidi"/>
+          <w:color w:val="808080" w:themeColor="background1" w:themeShade="80"/>
         </w:rPr>
         <w:t>Separate subsections:</w:t>
       </w:r>
@@ -2750,15 +3083,19 @@
           <w:rFonts w:asciiTheme="majorHAnsi" w:eastAsiaTheme="majorEastAsia" w:hAnsiTheme="majorHAnsi" w:cstheme="majorBidi"/>
         </w:rPr>
         <w:pict w14:anchorId="5F2CE0C4">
-          <v:rect id="_x0000_i1502" style="width:0;height:1.5pt" o:hralign="center" o:hrstd="t" o:hr="t" fillcolor="#a0a0a0" stroked="f"/>
+          <v:rect id="_x0000_i1047" style="width:0;height:1.5pt" o:hralign="center" o:hrstd="t" o:hr="t" fillcolor="#a0a0a0" stroked="f"/>
         </w:pict>
       </w:r>
     </w:p>
+    <w:p/>
     <w:p>
       <w:pPr>
         <w:pStyle w:val="Heading4"/>
       </w:pPr>
       <w:r>
+        <w:t xml:space="preserve">5.3.1 </w:t>
+      </w:r>
+      <w:r>
         <w:t>Population Size</w:t>
       </w:r>
     </w:p>
@@ -2767,11 +3104,13 @@
         <w:pStyle w:val="NormalWeb"/>
         <w:rPr>
           <w:rFonts w:asciiTheme="majorHAnsi" w:eastAsiaTheme="majorEastAsia" w:hAnsiTheme="majorHAnsi" w:cstheme="majorBidi"/>
-        </w:rPr>
-      </w:pPr>
-      <w:r>
-        <w:rPr>
-          <w:rFonts w:asciiTheme="majorHAnsi" w:eastAsiaTheme="majorEastAsia" w:hAnsiTheme="majorHAnsi" w:cstheme="majorBidi"/>
+          <w:color w:val="808080" w:themeColor="background1" w:themeShade="80"/>
+        </w:rPr>
+      </w:pPr>
+      <w:r>
+        <w:rPr>
+          <w:rFonts w:asciiTheme="majorHAnsi" w:eastAsiaTheme="majorEastAsia" w:hAnsiTheme="majorHAnsi" w:cstheme="majorBidi"/>
+          <w:color w:val="808080" w:themeColor="background1" w:themeShade="80"/>
         </w:rPr>
         <w:t>Graph:</w:t>
       </w:r>
@@ -2785,11 +3124,13 @@
         </w:numPr>
         <w:rPr>
           <w:rFonts w:asciiTheme="majorHAnsi" w:eastAsiaTheme="majorEastAsia" w:hAnsiTheme="majorHAnsi" w:cstheme="majorBidi"/>
-        </w:rPr>
-      </w:pPr>
-      <w:r>
-        <w:rPr>
-          <w:rFonts w:asciiTheme="majorHAnsi" w:eastAsiaTheme="majorEastAsia" w:hAnsiTheme="majorHAnsi" w:cstheme="majorBidi"/>
+          <w:color w:val="808080" w:themeColor="background1" w:themeShade="80"/>
+        </w:rPr>
+      </w:pPr>
+      <w:r>
+        <w:rPr>
+          <w:rFonts w:asciiTheme="majorHAnsi" w:eastAsiaTheme="majorEastAsia" w:hAnsiTheme="majorHAnsi" w:cstheme="majorBidi"/>
+          <w:color w:val="808080" w:themeColor="background1" w:themeShade="80"/>
         </w:rPr>
         <w:t xml:space="preserve">population vs distance </w:t>
       </w:r>
@@ -2799,11 +3140,13 @@
         <w:pStyle w:val="NormalWeb"/>
         <w:rPr>
           <w:rFonts w:asciiTheme="majorHAnsi" w:eastAsiaTheme="majorEastAsia" w:hAnsiTheme="majorHAnsi" w:cstheme="majorBidi"/>
-        </w:rPr>
-      </w:pPr>
-      <w:r>
-        <w:rPr>
-          <w:rFonts w:asciiTheme="majorHAnsi" w:eastAsiaTheme="majorEastAsia" w:hAnsiTheme="majorHAnsi" w:cstheme="majorBidi"/>
+          <w:color w:val="808080" w:themeColor="background1" w:themeShade="80"/>
+        </w:rPr>
+      </w:pPr>
+      <w:r>
+        <w:rPr>
+          <w:rFonts w:asciiTheme="majorHAnsi" w:eastAsiaTheme="majorEastAsia" w:hAnsiTheme="majorHAnsi" w:cstheme="majorBidi"/>
+          <w:color w:val="808080" w:themeColor="background1" w:themeShade="80"/>
         </w:rPr>
         <w:t>Discuss:</w:t>
       </w:r>
@@ -2817,11 +3160,13 @@
         </w:numPr>
         <w:rPr>
           <w:rFonts w:asciiTheme="majorHAnsi" w:eastAsiaTheme="majorEastAsia" w:hAnsiTheme="majorHAnsi" w:cstheme="majorBidi"/>
-        </w:rPr>
-      </w:pPr>
-      <w:r>
-        <w:rPr>
-          <w:rFonts w:asciiTheme="majorHAnsi" w:eastAsiaTheme="majorEastAsia" w:hAnsiTheme="majorHAnsi" w:cstheme="majorBidi"/>
+          <w:color w:val="808080" w:themeColor="background1" w:themeShade="80"/>
+        </w:rPr>
+      </w:pPr>
+      <w:r>
+        <w:rPr>
+          <w:rFonts w:asciiTheme="majorHAnsi" w:eastAsiaTheme="majorEastAsia" w:hAnsiTheme="majorHAnsi" w:cstheme="majorBidi"/>
+          <w:color w:val="808080" w:themeColor="background1" w:themeShade="80"/>
         </w:rPr>
         <w:t xml:space="preserve">diversity vs runtime </w:t>
       </w:r>
@@ -2838,15 +3183,19 @@
           <w:rFonts w:asciiTheme="majorHAnsi" w:eastAsiaTheme="majorEastAsia" w:hAnsiTheme="majorHAnsi" w:cstheme="majorBidi"/>
         </w:rPr>
         <w:pict w14:anchorId="57B7A9D3">
-          <v:rect id="_x0000_i1503" style="width:0;height:1.5pt" o:hralign="center" o:hrstd="t" o:hr="t" fillcolor="#a0a0a0" stroked="f"/>
+          <v:rect id="_x0000_i1048" style="width:0;height:1.5pt" o:hralign="center" o:hrstd="t" o:hr="t" fillcolor="#a0a0a0" stroked="f"/>
         </w:pict>
       </w:r>
     </w:p>
+    <w:p/>
     <w:p>
       <w:pPr>
         <w:pStyle w:val="Heading4"/>
       </w:pPr>
       <w:r>
+        <w:t xml:space="preserve">5.3.2 </w:t>
+      </w:r>
+      <w:r>
         <w:t>Mutation Rate</w:t>
       </w:r>
     </w:p>
@@ -2855,11 +3204,13 @@
         <w:pStyle w:val="NormalWeb"/>
         <w:rPr>
           <w:rFonts w:asciiTheme="majorHAnsi" w:eastAsiaTheme="majorEastAsia" w:hAnsiTheme="majorHAnsi" w:cstheme="majorBidi"/>
-        </w:rPr>
-      </w:pPr>
-      <w:r>
-        <w:rPr>
-          <w:rFonts w:asciiTheme="majorHAnsi" w:eastAsiaTheme="majorEastAsia" w:hAnsiTheme="majorHAnsi" w:cstheme="majorBidi"/>
+          <w:color w:val="808080" w:themeColor="background1" w:themeShade="80"/>
+        </w:rPr>
+      </w:pPr>
+      <w:r>
+        <w:rPr>
+          <w:rFonts w:asciiTheme="majorHAnsi" w:eastAsiaTheme="majorEastAsia" w:hAnsiTheme="majorHAnsi" w:cstheme="majorBidi"/>
+          <w:color w:val="808080" w:themeColor="background1" w:themeShade="80"/>
         </w:rPr>
         <w:t>Graph:</w:t>
       </w:r>
@@ -2873,11 +3224,13 @@
         </w:numPr>
         <w:rPr>
           <w:rFonts w:asciiTheme="majorHAnsi" w:eastAsiaTheme="majorEastAsia" w:hAnsiTheme="majorHAnsi" w:cstheme="majorBidi"/>
-        </w:rPr>
-      </w:pPr>
-      <w:r>
-        <w:rPr>
-          <w:rFonts w:asciiTheme="majorHAnsi" w:eastAsiaTheme="majorEastAsia" w:hAnsiTheme="majorHAnsi" w:cstheme="majorBidi"/>
+          <w:color w:val="808080" w:themeColor="background1" w:themeShade="80"/>
+        </w:rPr>
+      </w:pPr>
+      <w:r>
+        <w:rPr>
+          <w:rFonts w:asciiTheme="majorHAnsi" w:eastAsiaTheme="majorEastAsia" w:hAnsiTheme="majorHAnsi" w:cstheme="majorBidi"/>
+          <w:color w:val="808080" w:themeColor="background1" w:themeShade="80"/>
         </w:rPr>
         <w:t xml:space="preserve">mutation rate vs performance </w:t>
       </w:r>
@@ -2887,12 +3240,15 @@
         <w:pStyle w:val="NormalWeb"/>
         <w:rPr>
           <w:rFonts w:asciiTheme="majorHAnsi" w:eastAsiaTheme="majorEastAsia" w:hAnsiTheme="majorHAnsi" w:cstheme="majorBidi"/>
-        </w:rPr>
-      </w:pPr>
-      <w:r>
-        <w:rPr>
-          <w:rFonts w:asciiTheme="majorHAnsi" w:eastAsiaTheme="majorEastAsia" w:hAnsiTheme="majorHAnsi" w:cstheme="majorBidi"/>
-        </w:rPr>
+          <w:color w:val="808080" w:themeColor="background1" w:themeShade="80"/>
+        </w:rPr>
+      </w:pPr>
+      <w:r>
+        <w:rPr>
+          <w:rFonts w:asciiTheme="majorHAnsi" w:eastAsiaTheme="majorEastAsia" w:hAnsiTheme="majorHAnsi" w:cstheme="majorBidi"/>
+          <w:color w:val="808080" w:themeColor="background1" w:themeShade="80"/>
+        </w:rPr>
+        <w:lastRenderedPageBreak/>
         <w:t>Discuss:</w:t>
       </w:r>
     </w:p>
@@ -2905,13 +3261,14 @@
         </w:numPr>
         <w:rPr>
           <w:rFonts w:asciiTheme="majorHAnsi" w:eastAsiaTheme="majorEastAsia" w:hAnsiTheme="majorHAnsi" w:cstheme="majorBidi"/>
-        </w:rPr>
-      </w:pPr>
-      <w:r>
-        <w:rPr>
-          <w:rFonts w:asciiTheme="majorHAnsi" w:eastAsiaTheme="majorEastAsia" w:hAnsiTheme="majorHAnsi" w:cstheme="majorBidi"/>
-        </w:rPr>
-        <w:lastRenderedPageBreak/>
+          <w:color w:val="808080" w:themeColor="background1" w:themeShade="80"/>
+        </w:rPr>
+      </w:pPr>
+      <w:r>
+        <w:rPr>
+          <w:rFonts w:asciiTheme="majorHAnsi" w:eastAsiaTheme="majorEastAsia" w:hAnsiTheme="majorHAnsi" w:cstheme="majorBidi"/>
+          <w:color w:val="808080" w:themeColor="background1" w:themeShade="80"/>
+        </w:rPr>
         <w:t xml:space="preserve">exploration vs instability </w:t>
       </w:r>
     </w:p>
@@ -2927,15 +3284,19 @@
           <w:rFonts w:asciiTheme="majorHAnsi" w:eastAsiaTheme="majorEastAsia" w:hAnsiTheme="majorHAnsi" w:cstheme="majorBidi"/>
         </w:rPr>
         <w:pict w14:anchorId="3BFAEFB3">
-          <v:rect id="_x0000_i1504" style="width:0;height:1.5pt" o:hralign="center" o:hrstd="t" o:hr="t" fillcolor="#a0a0a0" stroked="f"/>
+          <v:rect id="_x0000_i1049" style="width:0;height:1.5pt" o:hralign="center" o:hrstd="t" o:hr="t" fillcolor="#a0a0a0" stroked="f"/>
         </w:pict>
       </w:r>
     </w:p>
+    <w:p/>
     <w:p>
       <w:pPr>
         <w:pStyle w:val="Heading4"/>
       </w:pPr>
       <w:r>
+        <w:t xml:space="preserve">5.3.3 </w:t>
+      </w:r>
+      <w:r>
         <w:t>Generation Count</w:t>
       </w:r>
     </w:p>
@@ -2944,11 +3305,13 @@
         <w:pStyle w:val="NormalWeb"/>
         <w:rPr>
           <w:rFonts w:asciiTheme="majorHAnsi" w:eastAsiaTheme="majorEastAsia" w:hAnsiTheme="majorHAnsi" w:cstheme="majorBidi"/>
-        </w:rPr>
-      </w:pPr>
-      <w:r>
-        <w:rPr>
-          <w:rFonts w:asciiTheme="majorHAnsi" w:eastAsiaTheme="majorEastAsia" w:hAnsiTheme="majorHAnsi" w:cstheme="majorBidi"/>
+          <w:color w:val="808080" w:themeColor="background1" w:themeShade="80"/>
+        </w:rPr>
+      </w:pPr>
+      <w:r>
+        <w:rPr>
+          <w:rFonts w:asciiTheme="majorHAnsi" w:eastAsiaTheme="majorEastAsia" w:hAnsiTheme="majorHAnsi" w:cstheme="majorBidi"/>
+          <w:color w:val="808080" w:themeColor="background1" w:themeShade="80"/>
         </w:rPr>
         <w:t>Graph:</w:t>
       </w:r>
@@ -2962,11 +3325,13 @@
         </w:numPr>
         <w:rPr>
           <w:rFonts w:asciiTheme="majorHAnsi" w:eastAsiaTheme="majorEastAsia" w:hAnsiTheme="majorHAnsi" w:cstheme="majorBidi"/>
-        </w:rPr>
-      </w:pPr>
-      <w:r>
-        <w:rPr>
-          <w:rFonts w:asciiTheme="majorHAnsi" w:eastAsiaTheme="majorEastAsia" w:hAnsiTheme="majorHAnsi" w:cstheme="majorBidi"/>
+          <w:color w:val="808080" w:themeColor="background1" w:themeShade="80"/>
+        </w:rPr>
+      </w:pPr>
+      <w:r>
+        <w:rPr>
+          <w:rFonts w:asciiTheme="majorHAnsi" w:eastAsiaTheme="majorEastAsia" w:hAnsiTheme="majorHAnsi" w:cstheme="majorBidi"/>
+          <w:color w:val="808080" w:themeColor="background1" w:themeShade="80"/>
         </w:rPr>
         <w:t xml:space="preserve">generations vs convergence </w:t>
       </w:r>
@@ -2976,11 +3341,13 @@
         <w:pStyle w:val="NormalWeb"/>
         <w:rPr>
           <w:rFonts w:asciiTheme="majorHAnsi" w:eastAsiaTheme="majorEastAsia" w:hAnsiTheme="majorHAnsi" w:cstheme="majorBidi"/>
-        </w:rPr>
-      </w:pPr>
-      <w:r>
-        <w:rPr>
-          <w:rFonts w:asciiTheme="majorHAnsi" w:eastAsiaTheme="majorEastAsia" w:hAnsiTheme="majorHAnsi" w:cstheme="majorBidi"/>
+          <w:color w:val="808080" w:themeColor="background1" w:themeShade="80"/>
+        </w:rPr>
+      </w:pPr>
+      <w:r>
+        <w:rPr>
+          <w:rFonts w:asciiTheme="majorHAnsi" w:eastAsiaTheme="majorEastAsia" w:hAnsiTheme="majorHAnsi" w:cstheme="majorBidi"/>
+          <w:color w:val="808080" w:themeColor="background1" w:themeShade="80"/>
         </w:rPr>
         <w:t>Discuss:</w:t>
       </w:r>
@@ -2994,11 +3361,13 @@
         </w:numPr>
         <w:rPr>
           <w:rFonts w:asciiTheme="majorHAnsi" w:eastAsiaTheme="majorEastAsia" w:hAnsiTheme="majorHAnsi" w:cstheme="majorBidi"/>
-        </w:rPr>
-      </w:pPr>
-      <w:r>
-        <w:rPr>
-          <w:rFonts w:asciiTheme="majorHAnsi" w:eastAsiaTheme="majorEastAsia" w:hAnsiTheme="majorHAnsi" w:cstheme="majorBidi"/>
+          <w:color w:val="808080" w:themeColor="background1" w:themeShade="80"/>
+        </w:rPr>
+      </w:pPr>
+      <w:r>
+        <w:rPr>
+          <w:rFonts w:asciiTheme="majorHAnsi" w:eastAsiaTheme="majorEastAsia" w:hAnsiTheme="majorHAnsi" w:cstheme="majorBidi"/>
+          <w:color w:val="808080" w:themeColor="background1" w:themeShade="80"/>
         </w:rPr>
         <w:t xml:space="preserve">diminishing returns </w:t>
       </w:r>
@@ -3015,15 +3384,19 @@
           <w:rFonts w:asciiTheme="majorHAnsi" w:eastAsiaTheme="majorEastAsia" w:hAnsiTheme="majorHAnsi" w:cstheme="majorBidi"/>
         </w:rPr>
         <w:pict w14:anchorId="24CA7D05">
-          <v:rect id="_x0000_i1505" style="width:0;height:1.5pt" o:hralign="center" o:hrstd="t" o:hr="t" fillcolor="#a0a0a0" stroked="f"/>
+          <v:rect id="_x0000_i1050" style="width:0;height:1.5pt" o:hralign="center" o:hrstd="t" o:hr="t" fillcolor="#a0a0a0" stroked="f"/>
         </w:pict>
       </w:r>
     </w:p>
+    <w:p/>
     <w:p>
       <w:pPr>
         <w:pStyle w:val="Heading4"/>
       </w:pPr>
       <w:r>
+        <w:t xml:space="preserve">5.3.4 </w:t>
+      </w:r>
+      <w:r>
         <w:t>Best Hyperparameter Combination</w:t>
       </w:r>
     </w:p>
@@ -3032,11 +3405,13 @@
         <w:pStyle w:val="NormalWeb"/>
         <w:rPr>
           <w:rFonts w:asciiTheme="majorHAnsi" w:eastAsiaTheme="majorEastAsia" w:hAnsiTheme="majorHAnsi" w:cstheme="majorBidi"/>
-        </w:rPr>
-      </w:pPr>
-      <w:r>
-        <w:rPr>
-          <w:rFonts w:asciiTheme="majorHAnsi" w:eastAsiaTheme="majorEastAsia" w:hAnsiTheme="majorHAnsi" w:cstheme="majorBidi"/>
+          <w:color w:val="808080" w:themeColor="background1" w:themeShade="80"/>
+        </w:rPr>
+      </w:pPr>
+      <w:r>
+        <w:rPr>
+          <w:rFonts w:asciiTheme="majorHAnsi" w:eastAsiaTheme="majorEastAsia" w:hAnsiTheme="majorHAnsi" w:cstheme="majorBidi"/>
+          <w:color w:val="808080" w:themeColor="background1" w:themeShade="80"/>
         </w:rPr>
         <w:t>Explain:</w:t>
       </w:r>
@@ -3050,11 +3425,13 @@
         </w:numPr>
         <w:rPr>
           <w:rFonts w:asciiTheme="majorHAnsi" w:eastAsiaTheme="majorEastAsia" w:hAnsiTheme="majorHAnsi" w:cstheme="majorBidi"/>
-        </w:rPr>
-      </w:pPr>
-      <w:r>
-        <w:rPr>
-          <w:rFonts w:asciiTheme="majorHAnsi" w:eastAsiaTheme="majorEastAsia" w:hAnsiTheme="majorHAnsi" w:cstheme="majorBidi"/>
+          <w:color w:val="808080" w:themeColor="background1" w:themeShade="80"/>
+        </w:rPr>
+      </w:pPr>
+      <w:r>
+        <w:rPr>
+          <w:rFonts w:asciiTheme="majorHAnsi" w:eastAsiaTheme="majorEastAsia" w:hAnsiTheme="majorHAnsi" w:cstheme="majorBidi"/>
+          <w:color w:val="808080" w:themeColor="background1" w:themeShade="80"/>
         </w:rPr>
         <w:t xml:space="preserve">grid search </w:t>
       </w:r>
@@ -3068,11 +3445,13 @@
         </w:numPr>
         <w:rPr>
           <w:rFonts w:asciiTheme="majorHAnsi" w:eastAsiaTheme="majorEastAsia" w:hAnsiTheme="majorHAnsi" w:cstheme="majorBidi"/>
-        </w:rPr>
-      </w:pPr>
-      <w:r>
-        <w:rPr>
-          <w:rFonts w:asciiTheme="majorHAnsi" w:eastAsiaTheme="majorEastAsia" w:hAnsiTheme="majorHAnsi" w:cstheme="majorBidi"/>
+          <w:color w:val="808080" w:themeColor="background1" w:themeShade="80"/>
+        </w:rPr>
+      </w:pPr>
+      <w:r>
+        <w:rPr>
+          <w:rFonts w:asciiTheme="majorHAnsi" w:eastAsiaTheme="majorEastAsia" w:hAnsiTheme="majorHAnsi" w:cstheme="majorBidi"/>
+          <w:color w:val="808080" w:themeColor="background1" w:themeShade="80"/>
         </w:rPr>
         <w:t xml:space="preserve">chosen configuration </w:t>
       </w:r>
@@ -3082,11 +3461,13 @@
         <w:pStyle w:val="NormalWeb"/>
         <w:rPr>
           <w:rFonts w:asciiTheme="majorHAnsi" w:eastAsiaTheme="majorEastAsia" w:hAnsiTheme="majorHAnsi" w:cstheme="majorBidi"/>
-        </w:rPr>
-      </w:pPr>
-      <w:r>
-        <w:rPr>
-          <w:rFonts w:asciiTheme="majorHAnsi" w:eastAsiaTheme="majorEastAsia" w:hAnsiTheme="majorHAnsi" w:cstheme="majorBidi"/>
+          <w:color w:val="808080" w:themeColor="background1" w:themeShade="80"/>
+        </w:rPr>
+      </w:pPr>
+      <w:r>
+        <w:rPr>
+          <w:rFonts w:asciiTheme="majorHAnsi" w:eastAsiaTheme="majorEastAsia" w:hAnsiTheme="majorHAnsi" w:cstheme="majorBidi"/>
+          <w:color w:val="808080" w:themeColor="background1" w:themeShade="80"/>
         </w:rPr>
         <w:t>Example:</w:t>
       </w:r>
@@ -3096,17 +3477,20 @@
         <w:pStyle w:val="NormalWeb"/>
         <w:rPr>
           <w:rFonts w:asciiTheme="majorHAnsi" w:eastAsiaTheme="majorEastAsia" w:hAnsiTheme="majorHAnsi" w:cstheme="majorBidi"/>
-        </w:rPr>
-      </w:pPr>
-      <w:r>
-        <w:rPr>
-          <w:rFonts w:asciiTheme="majorHAnsi" w:eastAsiaTheme="majorEastAsia" w:hAnsiTheme="majorHAnsi" w:cstheme="majorBidi"/>
+          <w:color w:val="808080" w:themeColor="background1" w:themeShade="80"/>
+        </w:rPr>
+      </w:pPr>
+      <w:r>
+        <w:rPr>
+          <w:rFonts w:asciiTheme="majorHAnsi" w:eastAsiaTheme="majorEastAsia" w:hAnsiTheme="majorHAnsi" w:cstheme="majorBidi"/>
+          <w:color w:val="808080" w:themeColor="background1" w:themeShade="80"/>
         </w:rPr>
         <w:t>Population = 100</w:t>
       </w:r>
       <w:r>
         <w:rPr>
           <w:rFonts w:asciiTheme="majorHAnsi" w:eastAsiaTheme="majorEastAsia" w:hAnsiTheme="majorHAnsi" w:cstheme="majorBidi"/>
+          <w:color w:val="808080" w:themeColor="background1" w:themeShade="80"/>
         </w:rPr>
         <w:br/>
         <w:t>Mutation = 0.02</w:t>
@@ -3114,6 +3498,7 @@
       <w:r>
         <w:rPr>
           <w:rFonts w:asciiTheme="majorHAnsi" w:eastAsiaTheme="majorEastAsia" w:hAnsiTheme="majorHAnsi" w:cstheme="majorBidi"/>
+          <w:color w:val="808080" w:themeColor="background1" w:themeShade="80"/>
         </w:rPr>
         <w:br/>
         <w:t>Generations = 100</w:t>
@@ -3137,10 +3522,11 @@
           <w:szCs w:val="32"/>
         </w:rPr>
         <w:pict w14:anchorId="072AFE3D">
-          <v:rect id="_x0000_i1506" style="width:0;height:1.5pt" o:hralign="center" o:hrstd="t" o:hr="t" fillcolor="#a0a0a0" stroked="f"/>
+          <v:rect id="_x0000_i1051" style="width:0;height:1.5pt" o:hralign="center" o:hrstd="t" o:hr="t" fillcolor="#a0a0a0" stroked="f"/>
         </w:pict>
       </w:r>
     </w:p>
+    <w:p/>
     <w:p>
       <w:pPr>
         <w:pStyle w:val="Heading3"/>
@@ -3154,11 +3540,13 @@
         <w:pStyle w:val="NormalWeb"/>
         <w:rPr>
           <w:rFonts w:asciiTheme="majorHAnsi" w:eastAsiaTheme="majorEastAsia" w:hAnsiTheme="majorHAnsi" w:cstheme="majorBidi"/>
-        </w:rPr>
-      </w:pPr>
-      <w:r>
-        <w:rPr>
-          <w:rFonts w:asciiTheme="majorHAnsi" w:eastAsiaTheme="majorEastAsia" w:hAnsiTheme="majorHAnsi" w:cstheme="majorBidi"/>
+          <w:color w:val="808080" w:themeColor="background1" w:themeShade="80"/>
+        </w:rPr>
+      </w:pPr>
+      <w:r>
+        <w:rPr>
+          <w:rFonts w:asciiTheme="majorHAnsi" w:eastAsiaTheme="majorEastAsia" w:hAnsiTheme="majorHAnsi" w:cstheme="majorBidi"/>
+          <w:color w:val="808080" w:themeColor="background1" w:themeShade="80"/>
         </w:rPr>
         <w:t>This is where your new fitness graphs go.</w:t>
       </w:r>
@@ -3168,11 +3556,13 @@
         <w:pStyle w:val="NormalWeb"/>
         <w:rPr>
           <w:rFonts w:asciiTheme="majorHAnsi" w:eastAsiaTheme="majorEastAsia" w:hAnsiTheme="majorHAnsi" w:cstheme="majorBidi"/>
-        </w:rPr>
-      </w:pPr>
-      <w:r>
-        <w:rPr>
-          <w:rFonts w:asciiTheme="majorHAnsi" w:eastAsiaTheme="majorEastAsia" w:hAnsiTheme="majorHAnsi" w:cstheme="majorBidi"/>
+          <w:color w:val="808080" w:themeColor="background1" w:themeShade="80"/>
+        </w:rPr>
+      </w:pPr>
+      <w:r>
+        <w:rPr>
+          <w:rFonts w:asciiTheme="majorHAnsi" w:eastAsiaTheme="majorEastAsia" w:hAnsiTheme="majorHAnsi" w:cstheme="majorBidi"/>
+          <w:color w:val="808080" w:themeColor="background1" w:themeShade="80"/>
         </w:rPr>
         <w:t>Include:</w:t>
       </w:r>
@@ -3186,11 +3576,13 @@
         </w:numPr>
         <w:rPr>
           <w:rFonts w:asciiTheme="majorHAnsi" w:eastAsiaTheme="majorEastAsia" w:hAnsiTheme="majorHAnsi" w:cstheme="majorBidi"/>
-        </w:rPr>
-      </w:pPr>
-      <w:r>
-        <w:rPr>
-          <w:rFonts w:asciiTheme="majorHAnsi" w:eastAsiaTheme="majorEastAsia" w:hAnsiTheme="majorHAnsi" w:cstheme="majorBidi"/>
+          <w:color w:val="808080" w:themeColor="background1" w:themeShade="80"/>
+        </w:rPr>
+      </w:pPr>
+      <w:r>
+        <w:rPr>
+          <w:rFonts w:asciiTheme="majorHAnsi" w:eastAsiaTheme="majorEastAsia" w:hAnsiTheme="majorHAnsi" w:cstheme="majorBidi"/>
+          <w:color w:val="808080" w:themeColor="background1" w:themeShade="80"/>
         </w:rPr>
         <w:t xml:space="preserve">best fitness </w:t>
       </w:r>
@@ -3204,11 +3596,13 @@
         </w:numPr>
         <w:rPr>
           <w:rFonts w:asciiTheme="majorHAnsi" w:eastAsiaTheme="majorEastAsia" w:hAnsiTheme="majorHAnsi" w:cstheme="majorBidi"/>
-        </w:rPr>
-      </w:pPr>
-      <w:r>
-        <w:rPr>
-          <w:rFonts w:asciiTheme="majorHAnsi" w:eastAsiaTheme="majorEastAsia" w:hAnsiTheme="majorHAnsi" w:cstheme="majorBidi"/>
+          <w:color w:val="808080" w:themeColor="background1" w:themeShade="80"/>
+        </w:rPr>
+      </w:pPr>
+      <w:r>
+        <w:rPr>
+          <w:rFonts w:asciiTheme="majorHAnsi" w:eastAsiaTheme="majorEastAsia" w:hAnsiTheme="majorHAnsi" w:cstheme="majorBidi"/>
+          <w:color w:val="808080" w:themeColor="background1" w:themeShade="80"/>
         </w:rPr>
         <w:t xml:space="preserve">average fitness </w:t>
       </w:r>
@@ -3222,11 +3616,13 @@
         </w:numPr>
         <w:rPr>
           <w:rFonts w:asciiTheme="majorHAnsi" w:eastAsiaTheme="majorEastAsia" w:hAnsiTheme="majorHAnsi" w:cstheme="majorBidi"/>
-        </w:rPr>
-      </w:pPr>
-      <w:r>
-        <w:rPr>
-          <w:rFonts w:asciiTheme="majorHAnsi" w:eastAsiaTheme="majorEastAsia" w:hAnsiTheme="majorHAnsi" w:cstheme="majorBidi"/>
+          <w:color w:val="808080" w:themeColor="background1" w:themeShade="80"/>
+        </w:rPr>
+      </w:pPr>
+      <w:r>
+        <w:rPr>
+          <w:rFonts w:asciiTheme="majorHAnsi" w:eastAsiaTheme="majorEastAsia" w:hAnsiTheme="majorHAnsi" w:cstheme="majorBidi"/>
+          <w:color w:val="808080" w:themeColor="background1" w:themeShade="80"/>
         </w:rPr>
         <w:t xml:space="preserve">worst fitness </w:t>
       </w:r>
@@ -3236,12 +3632,15 @@
         <w:pStyle w:val="NormalWeb"/>
         <w:rPr>
           <w:rFonts w:asciiTheme="majorHAnsi" w:eastAsiaTheme="majorEastAsia" w:hAnsiTheme="majorHAnsi" w:cstheme="majorBidi"/>
-        </w:rPr>
-      </w:pPr>
-      <w:r>
-        <w:rPr>
-          <w:rFonts w:asciiTheme="majorHAnsi" w:eastAsiaTheme="majorEastAsia" w:hAnsiTheme="majorHAnsi" w:cstheme="majorBidi"/>
-        </w:rPr>
+          <w:color w:val="808080" w:themeColor="background1" w:themeShade="80"/>
+        </w:rPr>
+      </w:pPr>
+      <w:r>
+        <w:rPr>
+          <w:rFonts w:asciiTheme="majorHAnsi" w:eastAsiaTheme="majorEastAsia" w:hAnsiTheme="majorHAnsi" w:cstheme="majorBidi"/>
+          <w:color w:val="808080" w:themeColor="background1" w:themeShade="80"/>
+        </w:rPr>
+        <w:lastRenderedPageBreak/>
         <w:t>Discuss:</w:t>
       </w:r>
     </w:p>
@@ -3254,11 +3653,13 @@
         </w:numPr>
         <w:rPr>
           <w:rFonts w:asciiTheme="majorHAnsi" w:eastAsiaTheme="majorEastAsia" w:hAnsiTheme="majorHAnsi" w:cstheme="majorBidi"/>
-        </w:rPr>
-      </w:pPr>
-      <w:r>
-        <w:rPr>
-          <w:rFonts w:asciiTheme="majorHAnsi" w:eastAsiaTheme="majorEastAsia" w:hAnsiTheme="majorHAnsi" w:cstheme="majorBidi"/>
+          <w:color w:val="808080" w:themeColor="background1" w:themeShade="80"/>
+        </w:rPr>
+      </w:pPr>
+      <w:r>
+        <w:rPr>
+          <w:rFonts w:asciiTheme="majorHAnsi" w:eastAsiaTheme="majorEastAsia" w:hAnsiTheme="majorHAnsi" w:cstheme="majorBidi"/>
+          <w:color w:val="808080" w:themeColor="background1" w:themeShade="80"/>
         </w:rPr>
         <w:t xml:space="preserve">convergence </w:t>
       </w:r>
@@ -3266,6 +3667,7 @@
       <w:r>
         <w:rPr>
           <w:rFonts w:asciiTheme="majorHAnsi" w:eastAsiaTheme="majorEastAsia" w:hAnsiTheme="majorHAnsi" w:cstheme="majorBidi"/>
+          <w:color w:val="808080" w:themeColor="background1" w:themeShade="80"/>
         </w:rPr>
         <w:t>behavior</w:t>
       </w:r>
@@ -3273,6 +3675,7 @@
       <w:r>
         <w:rPr>
           <w:rFonts w:asciiTheme="majorHAnsi" w:eastAsiaTheme="majorEastAsia" w:hAnsiTheme="majorHAnsi" w:cstheme="majorBidi"/>
+          <w:color w:val="808080" w:themeColor="background1" w:themeShade="80"/>
         </w:rPr>
         <w:t xml:space="preserve"> </w:t>
       </w:r>
@@ -3286,11 +3689,13 @@
         </w:numPr>
         <w:rPr>
           <w:rFonts w:asciiTheme="majorHAnsi" w:eastAsiaTheme="majorEastAsia" w:hAnsiTheme="majorHAnsi" w:cstheme="majorBidi"/>
-        </w:rPr>
-      </w:pPr>
-      <w:r>
-        <w:rPr>
-          <w:rFonts w:asciiTheme="majorHAnsi" w:eastAsiaTheme="majorEastAsia" w:hAnsiTheme="majorHAnsi" w:cstheme="majorBidi"/>
+          <w:color w:val="808080" w:themeColor="background1" w:themeShade="80"/>
+        </w:rPr>
+      </w:pPr>
+      <w:r>
+        <w:rPr>
+          <w:rFonts w:asciiTheme="majorHAnsi" w:eastAsiaTheme="majorEastAsia" w:hAnsiTheme="majorHAnsi" w:cstheme="majorBidi"/>
+          <w:color w:val="808080" w:themeColor="background1" w:themeShade="80"/>
         </w:rPr>
         <w:t xml:space="preserve">exploration </w:t>
       </w:r>
@@ -3304,11 +3709,13 @@
         </w:numPr>
         <w:rPr>
           <w:rFonts w:asciiTheme="majorHAnsi" w:eastAsiaTheme="majorEastAsia" w:hAnsiTheme="majorHAnsi" w:cstheme="majorBidi"/>
-        </w:rPr>
-      </w:pPr>
-      <w:r>
-        <w:rPr>
-          <w:rFonts w:asciiTheme="majorHAnsi" w:eastAsiaTheme="majorEastAsia" w:hAnsiTheme="majorHAnsi" w:cstheme="majorBidi"/>
+          <w:color w:val="808080" w:themeColor="background1" w:themeShade="80"/>
+        </w:rPr>
+      </w:pPr>
+      <w:r>
+        <w:rPr>
+          <w:rFonts w:asciiTheme="majorHAnsi" w:eastAsiaTheme="majorEastAsia" w:hAnsiTheme="majorHAnsi" w:cstheme="majorBidi"/>
+          <w:color w:val="808080" w:themeColor="background1" w:themeShade="80"/>
         </w:rPr>
         <w:t xml:space="preserve">lack of elitism </w:t>
       </w:r>
@@ -3322,11 +3729,13 @@
         </w:numPr>
         <w:rPr>
           <w:rFonts w:asciiTheme="majorHAnsi" w:eastAsiaTheme="majorEastAsia" w:hAnsiTheme="majorHAnsi" w:cstheme="majorBidi"/>
-        </w:rPr>
-      </w:pPr>
-      <w:r>
-        <w:rPr>
-          <w:rFonts w:asciiTheme="majorHAnsi" w:eastAsiaTheme="majorEastAsia" w:hAnsiTheme="majorHAnsi" w:cstheme="majorBidi"/>
+          <w:color w:val="808080" w:themeColor="background1" w:themeShade="80"/>
+        </w:rPr>
+      </w:pPr>
+      <w:r>
+        <w:rPr>
+          <w:rFonts w:asciiTheme="majorHAnsi" w:eastAsiaTheme="majorEastAsia" w:hAnsiTheme="majorHAnsi" w:cstheme="majorBidi"/>
+          <w:color w:val="808080" w:themeColor="background1" w:themeShade="80"/>
         </w:rPr>
         <w:t xml:space="preserve">fluctuations in fitness </w:t>
       </w:r>
@@ -3336,13 +3745,14 @@
         <w:pStyle w:val="NormalWeb"/>
         <w:rPr>
           <w:rFonts w:asciiTheme="majorHAnsi" w:eastAsiaTheme="majorEastAsia" w:hAnsiTheme="majorHAnsi" w:cstheme="majorBidi"/>
-        </w:rPr>
-      </w:pPr>
-      <w:r>
-        <w:rPr>
-          <w:rFonts w:asciiTheme="majorHAnsi" w:eastAsiaTheme="majorEastAsia" w:hAnsiTheme="majorHAnsi" w:cstheme="majorBidi"/>
-        </w:rPr>
-        <w:lastRenderedPageBreak/>
+          <w:color w:val="808080" w:themeColor="background1" w:themeShade="80"/>
+        </w:rPr>
+      </w:pPr>
+      <w:r>
+        <w:rPr>
+          <w:rFonts w:asciiTheme="majorHAnsi" w:eastAsiaTheme="majorEastAsia" w:hAnsiTheme="majorHAnsi" w:cstheme="majorBidi"/>
+          <w:color w:val="808080" w:themeColor="background1" w:themeShade="80"/>
+        </w:rPr>
         <w:t>This is now a very strong analytical section.</w:t>
       </w:r>
     </w:p>
@@ -3364,10 +3774,11 @@
           <w:szCs w:val="32"/>
         </w:rPr>
         <w:pict w14:anchorId="17682056">
-          <v:rect id="_x0000_i1507" style="width:0;height:1.5pt" o:hralign="center" o:hrstd="t" o:hr="t" fillcolor="#a0a0a0" stroked="f"/>
+          <v:rect id="_x0000_i1052" style="width:0;height:1.5pt" o:hralign="center" o:hrstd="t" o:hr="t" fillcolor="#a0a0a0" stroked="f"/>
         </w:pict>
       </w:r>
     </w:p>
+    <w:p/>
     <w:p>
       <w:pPr>
         <w:pStyle w:val="Heading3"/>
@@ -3381,11 +3792,13 @@
         <w:pStyle w:val="NormalWeb"/>
         <w:rPr>
           <w:rFonts w:asciiTheme="majorHAnsi" w:eastAsiaTheme="majorEastAsia" w:hAnsiTheme="majorHAnsi" w:cstheme="majorBidi"/>
-        </w:rPr>
-      </w:pPr>
-      <w:r>
-        <w:rPr>
-          <w:rFonts w:asciiTheme="majorHAnsi" w:eastAsiaTheme="majorEastAsia" w:hAnsiTheme="majorHAnsi" w:cstheme="majorBidi"/>
+          <w:color w:val="808080" w:themeColor="background1" w:themeShade="80"/>
+        </w:rPr>
+      </w:pPr>
+      <w:r>
+        <w:rPr>
+          <w:rFonts w:asciiTheme="majorHAnsi" w:eastAsiaTheme="majorEastAsia" w:hAnsiTheme="majorHAnsi" w:cstheme="majorBidi"/>
+          <w:color w:val="808080" w:themeColor="background1" w:themeShade="80"/>
         </w:rPr>
         <w:t>This is an excellent section.</w:t>
       </w:r>
@@ -3395,11 +3808,13 @@
         <w:pStyle w:val="NormalWeb"/>
         <w:rPr>
           <w:rFonts w:asciiTheme="majorHAnsi" w:eastAsiaTheme="majorEastAsia" w:hAnsiTheme="majorHAnsi" w:cstheme="majorBidi"/>
-        </w:rPr>
-      </w:pPr>
-      <w:r>
-        <w:rPr>
-          <w:rFonts w:asciiTheme="majorHAnsi" w:eastAsiaTheme="majorEastAsia" w:hAnsiTheme="majorHAnsi" w:cstheme="majorBidi"/>
+          <w:color w:val="808080" w:themeColor="background1" w:themeShade="80"/>
+        </w:rPr>
+      </w:pPr>
+      <w:r>
+        <w:rPr>
+          <w:rFonts w:asciiTheme="majorHAnsi" w:eastAsiaTheme="majorEastAsia" w:hAnsiTheme="majorHAnsi" w:cstheme="majorBidi"/>
+          <w:color w:val="808080" w:themeColor="background1" w:themeShade="80"/>
         </w:rPr>
         <w:t>Compare:</w:t>
       </w:r>
@@ -3413,11 +3828,13 @@
         </w:numPr>
         <w:rPr>
           <w:rFonts w:asciiTheme="majorHAnsi" w:eastAsiaTheme="majorEastAsia" w:hAnsiTheme="majorHAnsi" w:cstheme="majorBidi"/>
-        </w:rPr>
-      </w:pPr>
-      <w:r>
-        <w:rPr>
-          <w:rFonts w:asciiTheme="majorHAnsi" w:eastAsiaTheme="majorEastAsia" w:hAnsiTheme="majorHAnsi" w:cstheme="majorBidi"/>
+          <w:color w:val="808080" w:themeColor="background1" w:themeShade="80"/>
+        </w:rPr>
+      </w:pPr>
+      <w:r>
+        <w:rPr>
+          <w:rFonts w:asciiTheme="majorHAnsi" w:eastAsiaTheme="majorEastAsia" w:hAnsiTheme="majorHAnsi" w:cstheme="majorBidi"/>
+          <w:color w:val="808080" w:themeColor="background1" w:themeShade="80"/>
         </w:rPr>
         <w:t xml:space="preserve">best possible distance </w:t>
       </w:r>
@@ -3431,11 +3848,13 @@
         </w:numPr>
         <w:rPr>
           <w:rFonts w:asciiTheme="majorHAnsi" w:eastAsiaTheme="majorEastAsia" w:hAnsiTheme="majorHAnsi" w:cstheme="majorBidi"/>
-        </w:rPr>
-      </w:pPr>
-      <w:r>
-        <w:rPr>
-          <w:rFonts w:asciiTheme="majorHAnsi" w:eastAsiaTheme="majorEastAsia" w:hAnsiTheme="majorHAnsi" w:cstheme="majorBidi"/>
+          <w:color w:val="808080" w:themeColor="background1" w:themeShade="80"/>
+        </w:rPr>
+      </w:pPr>
+      <w:r>
+        <w:rPr>
+          <w:rFonts w:asciiTheme="majorHAnsi" w:eastAsiaTheme="majorEastAsia" w:hAnsiTheme="majorHAnsi" w:cstheme="majorBidi"/>
+          <w:color w:val="808080" w:themeColor="background1" w:themeShade="80"/>
         </w:rPr>
         <w:t xml:space="preserve">fastest practical configuration </w:t>
       </w:r>
@@ -3445,11 +3864,13 @@
         <w:pStyle w:val="NormalWeb"/>
         <w:rPr>
           <w:rFonts w:asciiTheme="majorHAnsi" w:eastAsiaTheme="majorEastAsia" w:hAnsiTheme="majorHAnsi" w:cstheme="majorBidi"/>
-        </w:rPr>
-      </w:pPr>
-      <w:r>
-        <w:rPr>
-          <w:rFonts w:asciiTheme="majorHAnsi" w:eastAsiaTheme="majorEastAsia" w:hAnsiTheme="majorHAnsi" w:cstheme="majorBidi"/>
+          <w:color w:val="808080" w:themeColor="background1" w:themeShade="80"/>
+        </w:rPr>
+      </w:pPr>
+      <w:r>
+        <w:rPr>
+          <w:rFonts w:asciiTheme="majorHAnsi" w:eastAsiaTheme="majorEastAsia" w:hAnsiTheme="majorHAnsi" w:cstheme="majorBidi"/>
+          <w:color w:val="808080" w:themeColor="background1" w:themeShade="80"/>
         </w:rPr>
         <w:t>Example table:</w:t>
       </w:r>
@@ -3489,6 +3910,7 @@
                 <w:rFonts w:asciiTheme="majorHAnsi" w:eastAsiaTheme="majorEastAsia" w:hAnsiTheme="majorHAnsi" w:cstheme="majorBidi"/>
                 <w:b/>
                 <w:bCs/>
+                <w:color w:val="808080" w:themeColor="background1" w:themeShade="80"/>
               </w:rPr>
             </w:pPr>
             <w:r>
@@ -3496,6 +3918,7 @@
                 <w:rFonts w:asciiTheme="majorHAnsi" w:eastAsiaTheme="majorEastAsia" w:hAnsiTheme="majorHAnsi" w:cstheme="majorBidi"/>
                 <w:b/>
                 <w:bCs/>
+                <w:color w:val="808080" w:themeColor="background1" w:themeShade="80"/>
               </w:rPr>
               <w:t>Configuration</w:t>
             </w:r>
@@ -3514,6 +3937,7 @@
                 <w:rFonts w:asciiTheme="majorHAnsi" w:eastAsiaTheme="majorEastAsia" w:hAnsiTheme="majorHAnsi" w:cstheme="majorBidi"/>
                 <w:b/>
                 <w:bCs/>
+                <w:color w:val="808080" w:themeColor="background1" w:themeShade="80"/>
               </w:rPr>
             </w:pPr>
             <w:r>
@@ -3521,6 +3945,7 @@
                 <w:rFonts w:asciiTheme="majorHAnsi" w:eastAsiaTheme="majorEastAsia" w:hAnsiTheme="majorHAnsi" w:cstheme="majorBidi"/>
                 <w:b/>
                 <w:bCs/>
+                <w:color w:val="808080" w:themeColor="background1" w:themeShade="80"/>
               </w:rPr>
               <w:t>Distance</w:t>
             </w:r>
@@ -3539,6 +3964,7 @@
                 <w:rFonts w:asciiTheme="majorHAnsi" w:eastAsiaTheme="majorEastAsia" w:hAnsiTheme="majorHAnsi" w:cstheme="majorBidi"/>
                 <w:b/>
                 <w:bCs/>
+                <w:color w:val="808080" w:themeColor="background1" w:themeShade="80"/>
               </w:rPr>
             </w:pPr>
             <w:r>
@@ -3546,6 +3972,7 @@
                 <w:rFonts w:asciiTheme="majorHAnsi" w:eastAsiaTheme="majorEastAsia" w:hAnsiTheme="majorHAnsi" w:cstheme="majorBidi"/>
                 <w:b/>
                 <w:bCs/>
+                <w:color w:val="808080" w:themeColor="background1" w:themeShade="80"/>
               </w:rPr>
               <w:t>Runtime</w:t>
             </w:r>
@@ -3567,11 +3994,13 @@
               <w:pStyle w:val="NormalWeb"/>
               <w:rPr>
                 <w:rFonts w:asciiTheme="majorHAnsi" w:eastAsiaTheme="majorEastAsia" w:hAnsiTheme="majorHAnsi" w:cstheme="majorBidi"/>
+                <w:color w:val="808080" w:themeColor="background1" w:themeShade="80"/>
               </w:rPr>
             </w:pPr>
             <w:r>
               <w:rPr>
                 <w:rFonts w:asciiTheme="majorHAnsi" w:eastAsiaTheme="majorEastAsia" w:hAnsiTheme="majorHAnsi" w:cstheme="majorBidi"/>
+                <w:color w:val="808080" w:themeColor="background1" w:themeShade="80"/>
               </w:rPr>
               <w:t>Best Quality</w:t>
             </w:r>
@@ -3588,11 +4017,13 @@
               <w:pStyle w:val="NormalWeb"/>
               <w:rPr>
                 <w:rFonts w:asciiTheme="majorHAnsi" w:eastAsiaTheme="majorEastAsia" w:hAnsiTheme="majorHAnsi" w:cstheme="majorBidi"/>
+                <w:color w:val="808080" w:themeColor="background1" w:themeShade="80"/>
               </w:rPr>
             </w:pPr>
             <w:r>
               <w:rPr>
                 <w:rFonts w:asciiTheme="majorHAnsi" w:eastAsiaTheme="majorEastAsia" w:hAnsiTheme="majorHAnsi" w:cstheme="majorBidi"/>
+                <w:color w:val="808080" w:themeColor="background1" w:themeShade="80"/>
               </w:rPr>
               <w:t>580</w:t>
             </w:r>
@@ -3609,11 +4040,13 @@
               <w:pStyle w:val="NormalWeb"/>
               <w:rPr>
                 <w:rFonts w:asciiTheme="majorHAnsi" w:eastAsiaTheme="majorEastAsia" w:hAnsiTheme="majorHAnsi" w:cstheme="majorBidi"/>
+                <w:color w:val="808080" w:themeColor="background1" w:themeShade="80"/>
               </w:rPr>
             </w:pPr>
             <w:r>
               <w:rPr>
                 <w:rFonts w:asciiTheme="majorHAnsi" w:eastAsiaTheme="majorEastAsia" w:hAnsiTheme="majorHAnsi" w:cstheme="majorBidi"/>
+                <w:color w:val="808080" w:themeColor="background1" w:themeShade="80"/>
               </w:rPr>
               <w:t>12s</w:t>
             </w:r>
@@ -3635,11 +4068,13 @@
               <w:pStyle w:val="NormalWeb"/>
               <w:rPr>
                 <w:rFonts w:asciiTheme="majorHAnsi" w:eastAsiaTheme="majorEastAsia" w:hAnsiTheme="majorHAnsi" w:cstheme="majorBidi"/>
+                <w:color w:val="808080" w:themeColor="background1" w:themeShade="80"/>
               </w:rPr>
             </w:pPr>
             <w:r>
               <w:rPr>
                 <w:rFonts w:asciiTheme="majorHAnsi" w:eastAsiaTheme="majorEastAsia" w:hAnsiTheme="majorHAnsi" w:cstheme="majorBidi"/>
+                <w:color w:val="808080" w:themeColor="background1" w:themeShade="80"/>
               </w:rPr>
               <w:t>Optimized Runtime</w:t>
             </w:r>
@@ -3656,11 +4091,13 @@
               <w:pStyle w:val="NormalWeb"/>
               <w:rPr>
                 <w:rFonts w:asciiTheme="majorHAnsi" w:eastAsiaTheme="majorEastAsia" w:hAnsiTheme="majorHAnsi" w:cstheme="majorBidi"/>
+                <w:color w:val="808080" w:themeColor="background1" w:themeShade="80"/>
               </w:rPr>
             </w:pPr>
             <w:r>
               <w:rPr>
                 <w:rFonts w:asciiTheme="majorHAnsi" w:eastAsiaTheme="majorEastAsia" w:hAnsiTheme="majorHAnsi" w:cstheme="majorBidi"/>
+                <w:color w:val="808080" w:themeColor="background1" w:themeShade="80"/>
               </w:rPr>
               <w:t>610</w:t>
             </w:r>
@@ -3677,11 +4114,13 @@
               <w:pStyle w:val="NormalWeb"/>
               <w:rPr>
                 <w:rFonts w:asciiTheme="majorHAnsi" w:eastAsiaTheme="majorEastAsia" w:hAnsiTheme="majorHAnsi" w:cstheme="majorBidi"/>
+                <w:color w:val="808080" w:themeColor="background1" w:themeShade="80"/>
               </w:rPr>
             </w:pPr>
             <w:r>
               <w:rPr>
                 <w:rFonts w:asciiTheme="majorHAnsi" w:eastAsiaTheme="majorEastAsia" w:hAnsiTheme="majorHAnsi" w:cstheme="majorBidi"/>
+                <w:color w:val="808080" w:themeColor="background1" w:themeShade="80"/>
               </w:rPr>
               <w:t>3s</w:t>
             </w:r>
@@ -3694,11 +4133,13 @@
         <w:pStyle w:val="NormalWeb"/>
         <w:rPr>
           <w:rFonts w:asciiTheme="majorHAnsi" w:eastAsiaTheme="majorEastAsia" w:hAnsiTheme="majorHAnsi" w:cstheme="majorBidi"/>
-        </w:rPr>
-      </w:pPr>
-      <w:r>
-        <w:rPr>
-          <w:rFonts w:asciiTheme="majorHAnsi" w:eastAsiaTheme="majorEastAsia" w:hAnsiTheme="majorHAnsi" w:cstheme="majorBidi"/>
+          <w:color w:val="808080" w:themeColor="background1" w:themeShade="80"/>
+        </w:rPr>
+      </w:pPr>
+      <w:r>
+        <w:rPr>
+          <w:rFonts w:asciiTheme="majorHAnsi" w:eastAsiaTheme="majorEastAsia" w:hAnsiTheme="majorHAnsi" w:cstheme="majorBidi"/>
+          <w:color w:val="808080" w:themeColor="background1" w:themeShade="80"/>
         </w:rPr>
         <w:t>Discuss:</w:t>
       </w:r>
@@ -3712,11 +4153,13 @@
         </w:numPr>
         <w:rPr>
           <w:rFonts w:asciiTheme="majorHAnsi" w:eastAsiaTheme="majorEastAsia" w:hAnsiTheme="majorHAnsi" w:cstheme="majorBidi"/>
-        </w:rPr>
-      </w:pPr>
-      <w:r>
-        <w:rPr>
-          <w:rFonts w:asciiTheme="majorHAnsi" w:eastAsiaTheme="majorEastAsia" w:hAnsiTheme="majorHAnsi" w:cstheme="majorBidi"/>
+          <w:color w:val="808080" w:themeColor="background1" w:themeShade="80"/>
+        </w:rPr>
+      </w:pPr>
+      <w:r>
+        <w:rPr>
+          <w:rFonts w:asciiTheme="majorHAnsi" w:eastAsiaTheme="majorEastAsia" w:hAnsiTheme="majorHAnsi" w:cstheme="majorBidi"/>
+          <w:color w:val="808080" w:themeColor="background1" w:themeShade="80"/>
         </w:rPr>
         <w:t xml:space="preserve">quality/runtime </w:t>
       </w:r>
@@ -3724,6 +4167,7 @@
       <w:r>
         <w:rPr>
           <w:rFonts w:asciiTheme="majorHAnsi" w:eastAsiaTheme="majorEastAsia" w:hAnsiTheme="majorHAnsi" w:cstheme="majorBidi"/>
+          <w:color w:val="808080" w:themeColor="background1" w:themeShade="80"/>
         </w:rPr>
         <w:t>tradeoff</w:t>
       </w:r>
@@ -3731,6 +4175,7 @@
       <w:r>
         <w:rPr>
           <w:rFonts w:asciiTheme="majorHAnsi" w:eastAsiaTheme="majorEastAsia" w:hAnsiTheme="majorHAnsi" w:cstheme="majorBidi"/>
+          <w:color w:val="808080" w:themeColor="background1" w:themeShade="80"/>
         </w:rPr>
         <w:t xml:space="preserve"> </w:t>
       </w:r>
@@ -3740,11 +4185,13 @@
         <w:pStyle w:val="NormalWeb"/>
         <w:rPr>
           <w:rFonts w:asciiTheme="majorHAnsi" w:eastAsiaTheme="majorEastAsia" w:hAnsiTheme="majorHAnsi" w:cstheme="majorBidi"/>
-        </w:rPr>
-      </w:pPr>
-      <w:r>
-        <w:rPr>
-          <w:rFonts w:asciiTheme="majorHAnsi" w:eastAsiaTheme="majorEastAsia" w:hAnsiTheme="majorHAnsi" w:cstheme="majorBidi"/>
+          <w:color w:val="808080" w:themeColor="background1" w:themeShade="80"/>
+        </w:rPr>
+      </w:pPr>
+      <w:r>
+        <w:rPr>
+          <w:rFonts w:asciiTheme="majorHAnsi" w:eastAsiaTheme="majorEastAsia" w:hAnsiTheme="majorHAnsi" w:cstheme="majorBidi"/>
+          <w:color w:val="808080" w:themeColor="background1" w:themeShade="80"/>
         </w:rPr>
         <w:t>This is a very mature analysis section.</w:t>
       </w:r>
@@ -3767,10 +4214,11 @@
           <w:szCs w:val="32"/>
         </w:rPr>
         <w:pict w14:anchorId="10AD433C">
-          <v:rect id="_x0000_i1508" style="width:0;height:1.5pt" o:hralign="center" o:hrstd="t" o:hr="t" fillcolor="#a0a0a0" stroked="f"/>
+          <v:rect id="_x0000_i1053" style="width:0;height:1.5pt" o:hralign="center" o:hrstd="t" o:hr="t" fillcolor="#a0a0a0" stroked="f"/>
         </w:pict>
       </w:r>
     </w:p>
+    <w:p/>
     <w:p>
       <w:pPr>
         <w:pStyle w:val="Heading3"/>
@@ -3784,11 +4232,13 @@
         <w:pStyle w:val="NormalWeb"/>
         <w:rPr>
           <w:rFonts w:asciiTheme="majorHAnsi" w:eastAsiaTheme="majorEastAsia" w:hAnsiTheme="majorHAnsi" w:cstheme="majorBidi"/>
-        </w:rPr>
-      </w:pPr>
-      <w:r>
-        <w:rPr>
-          <w:rFonts w:asciiTheme="majorHAnsi" w:eastAsiaTheme="majorEastAsia" w:hAnsiTheme="majorHAnsi" w:cstheme="majorBidi"/>
+          <w:color w:val="808080" w:themeColor="background1" w:themeShade="80"/>
+        </w:rPr>
+      </w:pPr>
+      <w:r>
+        <w:rPr>
+          <w:rFonts w:asciiTheme="majorHAnsi" w:eastAsiaTheme="majorEastAsia" w:hAnsiTheme="majorHAnsi" w:cstheme="majorBidi"/>
+          <w:color w:val="808080" w:themeColor="background1" w:themeShade="80"/>
         </w:rPr>
         <w:t>Include:</w:t>
       </w:r>
@@ -3802,11 +4252,13 @@
         </w:numPr>
         <w:rPr>
           <w:rFonts w:asciiTheme="majorHAnsi" w:eastAsiaTheme="majorEastAsia" w:hAnsiTheme="majorHAnsi" w:cstheme="majorBidi"/>
-        </w:rPr>
-      </w:pPr>
-      <w:r>
-        <w:rPr>
-          <w:rFonts w:asciiTheme="majorHAnsi" w:eastAsiaTheme="majorEastAsia" w:hAnsiTheme="majorHAnsi" w:cstheme="majorBidi"/>
+          <w:color w:val="808080" w:themeColor="background1" w:themeShade="80"/>
+        </w:rPr>
+      </w:pPr>
+      <w:r>
+        <w:rPr>
+          <w:rFonts w:asciiTheme="majorHAnsi" w:eastAsiaTheme="majorEastAsia" w:hAnsiTheme="majorHAnsi" w:cstheme="majorBidi"/>
+          <w:color w:val="808080" w:themeColor="background1" w:themeShade="80"/>
         </w:rPr>
         <w:t xml:space="preserve">5 items </w:t>
       </w:r>
@@ -3820,11 +4272,13 @@
         </w:numPr>
         <w:rPr>
           <w:rFonts w:asciiTheme="majorHAnsi" w:eastAsiaTheme="majorEastAsia" w:hAnsiTheme="majorHAnsi" w:cstheme="majorBidi"/>
-        </w:rPr>
-      </w:pPr>
-      <w:r>
-        <w:rPr>
-          <w:rFonts w:asciiTheme="majorHAnsi" w:eastAsiaTheme="majorEastAsia" w:hAnsiTheme="majorHAnsi" w:cstheme="majorBidi"/>
+          <w:color w:val="808080" w:themeColor="background1" w:themeShade="80"/>
+        </w:rPr>
+      </w:pPr>
+      <w:r>
+        <w:rPr>
+          <w:rFonts w:asciiTheme="majorHAnsi" w:eastAsiaTheme="majorEastAsia" w:hAnsiTheme="majorHAnsi" w:cstheme="majorBidi"/>
+          <w:color w:val="808080" w:themeColor="background1" w:themeShade="80"/>
         </w:rPr>
         <w:t xml:space="preserve">10 items </w:t>
       </w:r>
@@ -3838,11 +4292,13 @@
         </w:numPr>
         <w:rPr>
           <w:rFonts w:asciiTheme="majorHAnsi" w:eastAsiaTheme="majorEastAsia" w:hAnsiTheme="majorHAnsi" w:cstheme="majorBidi"/>
-        </w:rPr>
-      </w:pPr>
-      <w:r>
-        <w:rPr>
-          <w:rFonts w:asciiTheme="majorHAnsi" w:eastAsiaTheme="majorEastAsia" w:hAnsiTheme="majorHAnsi" w:cstheme="majorBidi"/>
+          <w:color w:val="808080" w:themeColor="background1" w:themeShade="80"/>
+        </w:rPr>
+      </w:pPr>
+      <w:r>
+        <w:rPr>
+          <w:rFonts w:asciiTheme="majorHAnsi" w:eastAsiaTheme="majorEastAsia" w:hAnsiTheme="majorHAnsi" w:cstheme="majorBidi"/>
+          <w:color w:val="808080" w:themeColor="background1" w:themeShade="80"/>
         </w:rPr>
         <w:t xml:space="preserve">15 items </w:t>
       </w:r>
@@ -3856,11 +4312,13 @@
         </w:numPr>
         <w:rPr>
           <w:rFonts w:asciiTheme="majorHAnsi" w:eastAsiaTheme="majorEastAsia" w:hAnsiTheme="majorHAnsi" w:cstheme="majorBidi"/>
-        </w:rPr>
-      </w:pPr>
-      <w:r>
-        <w:rPr>
-          <w:rFonts w:asciiTheme="majorHAnsi" w:eastAsiaTheme="majorEastAsia" w:hAnsiTheme="majorHAnsi" w:cstheme="majorBidi"/>
+          <w:color w:val="808080" w:themeColor="background1" w:themeShade="80"/>
+        </w:rPr>
+      </w:pPr>
+      <w:r>
+        <w:rPr>
+          <w:rFonts w:asciiTheme="majorHAnsi" w:eastAsiaTheme="majorEastAsia" w:hAnsiTheme="majorHAnsi" w:cstheme="majorBidi"/>
+          <w:color w:val="808080" w:themeColor="background1" w:themeShade="80"/>
         </w:rPr>
         <w:t xml:space="preserve">20 items </w:t>
       </w:r>
@@ -3870,12 +4328,15 @@
         <w:pStyle w:val="NormalWeb"/>
         <w:rPr>
           <w:rFonts w:asciiTheme="majorHAnsi" w:eastAsiaTheme="majorEastAsia" w:hAnsiTheme="majorHAnsi" w:cstheme="majorBidi"/>
-        </w:rPr>
-      </w:pPr>
-      <w:r>
-        <w:rPr>
-          <w:rFonts w:asciiTheme="majorHAnsi" w:eastAsiaTheme="majorEastAsia" w:hAnsiTheme="majorHAnsi" w:cstheme="majorBidi"/>
-        </w:rPr>
+          <w:color w:val="808080" w:themeColor="background1" w:themeShade="80"/>
+        </w:rPr>
+      </w:pPr>
+      <w:r>
+        <w:rPr>
+          <w:rFonts w:asciiTheme="majorHAnsi" w:eastAsiaTheme="majorEastAsia" w:hAnsiTheme="majorHAnsi" w:cstheme="majorBidi"/>
+          <w:color w:val="808080" w:themeColor="background1" w:themeShade="80"/>
+        </w:rPr>
+        <w:lastRenderedPageBreak/>
         <w:t>Graphs:</w:t>
       </w:r>
     </w:p>
@@ -3888,11 +4349,13 @@
         </w:numPr>
         <w:rPr>
           <w:rFonts w:asciiTheme="majorHAnsi" w:eastAsiaTheme="majorEastAsia" w:hAnsiTheme="majorHAnsi" w:cstheme="majorBidi"/>
-        </w:rPr>
-      </w:pPr>
-      <w:r>
-        <w:rPr>
-          <w:rFonts w:asciiTheme="majorHAnsi" w:eastAsiaTheme="majorEastAsia" w:hAnsiTheme="majorHAnsi" w:cstheme="majorBidi"/>
+          <w:color w:val="808080" w:themeColor="background1" w:themeShade="80"/>
+        </w:rPr>
+      </w:pPr>
+      <w:r>
+        <w:rPr>
+          <w:rFonts w:asciiTheme="majorHAnsi" w:eastAsiaTheme="majorEastAsia" w:hAnsiTheme="majorHAnsi" w:cstheme="majorBidi"/>
+          <w:color w:val="808080" w:themeColor="background1" w:themeShade="80"/>
         </w:rPr>
         <w:t xml:space="preserve">runtime scaling </w:t>
       </w:r>
@@ -3906,11 +4369,13 @@
         </w:numPr>
         <w:rPr>
           <w:rFonts w:asciiTheme="majorHAnsi" w:eastAsiaTheme="majorEastAsia" w:hAnsiTheme="majorHAnsi" w:cstheme="majorBidi"/>
-        </w:rPr>
-      </w:pPr>
-      <w:r>
-        <w:rPr>
-          <w:rFonts w:asciiTheme="majorHAnsi" w:eastAsiaTheme="majorEastAsia" w:hAnsiTheme="majorHAnsi" w:cstheme="majorBidi"/>
+          <w:color w:val="808080" w:themeColor="background1" w:themeShade="80"/>
+        </w:rPr>
+      </w:pPr>
+      <w:r>
+        <w:rPr>
+          <w:rFonts w:asciiTheme="majorHAnsi" w:eastAsiaTheme="majorEastAsia" w:hAnsiTheme="majorHAnsi" w:cstheme="majorBidi"/>
+          <w:color w:val="808080" w:themeColor="background1" w:themeShade="80"/>
         </w:rPr>
         <w:t xml:space="preserve">distance scaling </w:t>
       </w:r>
@@ -3920,11 +4385,13 @@
         <w:pStyle w:val="NormalWeb"/>
         <w:rPr>
           <w:rFonts w:asciiTheme="majorHAnsi" w:eastAsiaTheme="majorEastAsia" w:hAnsiTheme="majorHAnsi" w:cstheme="majorBidi"/>
-        </w:rPr>
-      </w:pPr>
-      <w:r>
-        <w:rPr>
-          <w:rFonts w:asciiTheme="majorHAnsi" w:eastAsiaTheme="majorEastAsia" w:hAnsiTheme="majorHAnsi" w:cstheme="majorBidi"/>
+          <w:color w:val="808080" w:themeColor="background1" w:themeShade="80"/>
+        </w:rPr>
+      </w:pPr>
+      <w:r>
+        <w:rPr>
+          <w:rFonts w:asciiTheme="majorHAnsi" w:eastAsiaTheme="majorEastAsia" w:hAnsiTheme="majorHAnsi" w:cstheme="majorBidi"/>
+          <w:color w:val="808080" w:themeColor="background1" w:themeShade="80"/>
         </w:rPr>
         <w:t>Discuss:</w:t>
       </w:r>
@@ -3938,11 +4405,13 @@
         </w:numPr>
         <w:rPr>
           <w:rFonts w:asciiTheme="majorHAnsi" w:eastAsiaTheme="majorEastAsia" w:hAnsiTheme="majorHAnsi" w:cstheme="majorBidi"/>
-        </w:rPr>
-      </w:pPr>
-      <w:r>
-        <w:rPr>
-          <w:rFonts w:asciiTheme="majorHAnsi" w:eastAsiaTheme="majorEastAsia" w:hAnsiTheme="majorHAnsi" w:cstheme="majorBidi"/>
+          <w:color w:val="808080" w:themeColor="background1" w:themeShade="80"/>
+        </w:rPr>
+      </w:pPr>
+      <w:r>
+        <w:rPr>
+          <w:rFonts w:asciiTheme="majorHAnsi" w:eastAsiaTheme="majorEastAsia" w:hAnsiTheme="majorHAnsi" w:cstheme="majorBidi"/>
+          <w:color w:val="808080" w:themeColor="background1" w:themeShade="80"/>
         </w:rPr>
         <w:t xml:space="preserve">computational complexity </w:t>
       </w:r>
@@ -3956,11 +4425,13 @@
         </w:numPr>
         <w:rPr>
           <w:rFonts w:asciiTheme="majorHAnsi" w:eastAsiaTheme="majorEastAsia" w:hAnsiTheme="majorHAnsi" w:cstheme="majorBidi"/>
-        </w:rPr>
-      </w:pPr>
-      <w:r>
-        <w:rPr>
-          <w:rFonts w:asciiTheme="majorHAnsi" w:eastAsiaTheme="majorEastAsia" w:hAnsiTheme="majorHAnsi" w:cstheme="majorBidi"/>
+          <w:color w:val="808080" w:themeColor="background1" w:themeShade="80"/>
+        </w:rPr>
+      </w:pPr>
+      <w:r>
+        <w:rPr>
+          <w:rFonts w:asciiTheme="majorHAnsi" w:eastAsiaTheme="majorEastAsia" w:hAnsiTheme="majorHAnsi" w:cstheme="majorBidi"/>
+          <w:color w:val="808080" w:themeColor="background1" w:themeShade="80"/>
         </w:rPr>
         <w:t xml:space="preserve">increasing optimization difficulty </w:t>
       </w:r>
@@ -3982,12 +4453,12 @@
           <w:sz w:val="32"/>
           <w:szCs w:val="32"/>
         </w:rPr>
-        <w:lastRenderedPageBreak/>
         <w:pict w14:anchorId="61F90CEB">
-          <v:rect id="_x0000_i1509" style="width:0;height:1.5pt" o:hralign="center" o:hrstd="t" o:hr="t" fillcolor="#a0a0a0" stroked="f"/>
+          <v:rect id="_x0000_i1054" style="width:0;height:1.5pt" o:hralign="center" o:hrstd="t" o:hr="t" fillcolor="#a0a0a0" stroked="f"/>
         </w:pict>
       </w:r>
     </w:p>
+    <w:p/>
     <w:p>
       <w:pPr>
         <w:pStyle w:val="Heading2"/>
@@ -4001,11 +4472,13 @@
         <w:pStyle w:val="NormalWeb"/>
         <w:rPr>
           <w:rFonts w:asciiTheme="majorHAnsi" w:eastAsiaTheme="majorEastAsia" w:hAnsiTheme="majorHAnsi" w:cstheme="majorBidi"/>
-        </w:rPr>
-      </w:pPr>
-      <w:r>
-        <w:rPr>
-          <w:rFonts w:asciiTheme="majorHAnsi" w:eastAsiaTheme="majorEastAsia" w:hAnsiTheme="majorHAnsi" w:cstheme="majorBidi"/>
+          <w:color w:val="808080" w:themeColor="background1" w:themeShade="80"/>
+        </w:rPr>
+      </w:pPr>
+      <w:r>
+        <w:rPr>
+          <w:rFonts w:asciiTheme="majorHAnsi" w:eastAsiaTheme="majorEastAsia" w:hAnsiTheme="majorHAnsi" w:cstheme="majorBidi"/>
+          <w:color w:val="808080" w:themeColor="background1" w:themeShade="80"/>
         </w:rPr>
         <w:t>This section is interpretation and reflection.</w:t>
       </w:r>
@@ -4015,11 +4488,13 @@
         <w:pStyle w:val="NormalWeb"/>
         <w:rPr>
           <w:rFonts w:asciiTheme="majorHAnsi" w:eastAsiaTheme="majorEastAsia" w:hAnsiTheme="majorHAnsi" w:cstheme="majorBidi"/>
-        </w:rPr>
-      </w:pPr>
-      <w:r>
-        <w:rPr>
-          <w:rFonts w:asciiTheme="majorHAnsi" w:eastAsiaTheme="majorEastAsia" w:hAnsiTheme="majorHAnsi" w:cstheme="majorBidi"/>
+          <w:color w:val="808080" w:themeColor="background1" w:themeShade="80"/>
+        </w:rPr>
+      </w:pPr>
+      <w:r>
+        <w:rPr>
+          <w:rFonts w:asciiTheme="majorHAnsi" w:eastAsiaTheme="majorEastAsia" w:hAnsiTheme="majorHAnsi" w:cstheme="majorBidi"/>
+          <w:color w:val="808080" w:themeColor="background1" w:themeShade="80"/>
         </w:rPr>
         <w:t>Discuss:</w:t>
       </w:r>
@@ -4033,11 +4508,13 @@
         </w:numPr>
         <w:rPr>
           <w:rFonts w:asciiTheme="majorHAnsi" w:eastAsiaTheme="majorEastAsia" w:hAnsiTheme="majorHAnsi" w:cstheme="majorBidi"/>
-        </w:rPr>
-      </w:pPr>
-      <w:r>
-        <w:rPr>
-          <w:rFonts w:asciiTheme="majorHAnsi" w:eastAsiaTheme="majorEastAsia" w:hAnsiTheme="majorHAnsi" w:cstheme="majorBidi"/>
+          <w:color w:val="808080" w:themeColor="background1" w:themeShade="80"/>
+        </w:rPr>
+      </w:pPr>
+      <w:r>
+        <w:rPr>
+          <w:rFonts w:asciiTheme="majorHAnsi" w:eastAsiaTheme="majorEastAsia" w:hAnsiTheme="majorHAnsi" w:cstheme="majorBidi"/>
+          <w:color w:val="808080" w:themeColor="background1" w:themeShade="80"/>
         </w:rPr>
         <w:t xml:space="preserve">why GA works well </w:t>
       </w:r>
@@ -4051,11 +4528,13 @@
         </w:numPr>
         <w:rPr>
           <w:rFonts w:asciiTheme="majorHAnsi" w:eastAsiaTheme="majorEastAsia" w:hAnsiTheme="majorHAnsi" w:cstheme="majorBidi"/>
-        </w:rPr>
-      </w:pPr>
-      <w:r>
-        <w:rPr>
-          <w:rFonts w:asciiTheme="majorHAnsi" w:eastAsiaTheme="majorEastAsia" w:hAnsiTheme="majorHAnsi" w:cstheme="majorBidi"/>
+          <w:color w:val="808080" w:themeColor="background1" w:themeShade="80"/>
+        </w:rPr>
+      </w:pPr>
+      <w:r>
+        <w:rPr>
+          <w:rFonts w:asciiTheme="majorHAnsi" w:eastAsiaTheme="majorEastAsia" w:hAnsiTheme="majorHAnsi" w:cstheme="majorBidi"/>
+          <w:color w:val="808080" w:themeColor="background1" w:themeShade="80"/>
         </w:rPr>
         <w:t xml:space="preserve">strengths of A* </w:t>
       </w:r>
@@ -4069,11 +4548,13 @@
         </w:numPr>
         <w:rPr>
           <w:rFonts w:asciiTheme="majorHAnsi" w:eastAsiaTheme="majorEastAsia" w:hAnsiTheme="majorHAnsi" w:cstheme="majorBidi"/>
-        </w:rPr>
-      </w:pPr>
-      <w:r>
-        <w:rPr>
-          <w:rFonts w:asciiTheme="majorHAnsi" w:eastAsiaTheme="majorEastAsia" w:hAnsiTheme="majorHAnsi" w:cstheme="majorBidi"/>
+          <w:color w:val="808080" w:themeColor="background1" w:themeShade="80"/>
+        </w:rPr>
+      </w:pPr>
+      <w:r>
+        <w:rPr>
+          <w:rFonts w:asciiTheme="majorHAnsi" w:eastAsiaTheme="majorEastAsia" w:hAnsiTheme="majorHAnsi" w:cstheme="majorBidi"/>
+          <w:color w:val="808080" w:themeColor="background1" w:themeShade="80"/>
         </w:rPr>
         <w:t xml:space="preserve">strengths/weaknesses of different selection methods </w:t>
       </w:r>
@@ -4087,11 +4568,13 @@
         </w:numPr>
         <w:rPr>
           <w:rFonts w:asciiTheme="majorHAnsi" w:eastAsiaTheme="majorEastAsia" w:hAnsiTheme="majorHAnsi" w:cstheme="majorBidi"/>
-        </w:rPr>
-      </w:pPr>
-      <w:r>
-        <w:rPr>
-          <w:rFonts w:asciiTheme="majorHAnsi" w:eastAsiaTheme="majorEastAsia" w:hAnsiTheme="majorHAnsi" w:cstheme="majorBidi"/>
+          <w:color w:val="808080" w:themeColor="background1" w:themeShade="80"/>
+        </w:rPr>
+      </w:pPr>
+      <w:r>
+        <w:rPr>
+          <w:rFonts w:asciiTheme="majorHAnsi" w:eastAsiaTheme="majorEastAsia" w:hAnsiTheme="majorHAnsi" w:cstheme="majorBidi"/>
+          <w:color w:val="808080" w:themeColor="background1" w:themeShade="80"/>
         </w:rPr>
         <w:t xml:space="preserve">why elitism was rejected </w:t>
       </w:r>
@@ -4105,11 +4588,13 @@
         </w:numPr>
         <w:rPr>
           <w:rFonts w:asciiTheme="majorHAnsi" w:eastAsiaTheme="majorEastAsia" w:hAnsiTheme="majorHAnsi" w:cstheme="majorBidi"/>
-        </w:rPr>
-      </w:pPr>
-      <w:r>
-        <w:rPr>
-          <w:rFonts w:asciiTheme="majorHAnsi" w:eastAsiaTheme="majorEastAsia" w:hAnsiTheme="majorHAnsi" w:cstheme="majorBidi"/>
+          <w:color w:val="808080" w:themeColor="background1" w:themeShade="80"/>
+        </w:rPr>
+      </w:pPr>
+      <w:r>
+        <w:rPr>
+          <w:rFonts w:asciiTheme="majorHAnsi" w:eastAsiaTheme="majorEastAsia" w:hAnsiTheme="majorHAnsi" w:cstheme="majorBidi"/>
+          <w:color w:val="808080" w:themeColor="background1" w:themeShade="80"/>
         </w:rPr>
         <w:t xml:space="preserve">exploration vs exploitation </w:t>
       </w:r>
@@ -4123,11 +4608,13 @@
         </w:numPr>
         <w:rPr>
           <w:rFonts w:asciiTheme="majorHAnsi" w:eastAsiaTheme="majorEastAsia" w:hAnsiTheme="majorHAnsi" w:cstheme="majorBidi"/>
-        </w:rPr>
-      </w:pPr>
-      <w:r>
-        <w:rPr>
-          <w:rFonts w:asciiTheme="majorHAnsi" w:eastAsiaTheme="majorEastAsia" w:hAnsiTheme="majorHAnsi" w:cstheme="majorBidi"/>
+          <w:color w:val="808080" w:themeColor="background1" w:themeShade="80"/>
+        </w:rPr>
+      </w:pPr>
+      <w:r>
+        <w:rPr>
+          <w:rFonts w:asciiTheme="majorHAnsi" w:eastAsiaTheme="majorEastAsia" w:hAnsiTheme="majorHAnsi" w:cstheme="majorBidi"/>
+          <w:color w:val="808080" w:themeColor="background1" w:themeShade="80"/>
         </w:rPr>
         <w:t xml:space="preserve">runtime limitations </w:t>
       </w:r>
@@ -4141,11 +4628,13 @@
         </w:numPr>
         <w:rPr>
           <w:rFonts w:asciiTheme="majorHAnsi" w:eastAsiaTheme="majorEastAsia" w:hAnsiTheme="majorHAnsi" w:cstheme="majorBidi"/>
-        </w:rPr>
-      </w:pPr>
-      <w:r>
-        <w:rPr>
-          <w:rFonts w:asciiTheme="majorHAnsi" w:eastAsiaTheme="majorEastAsia" w:hAnsiTheme="majorHAnsi" w:cstheme="majorBidi"/>
+          <w:color w:val="808080" w:themeColor="background1" w:themeShade="80"/>
+        </w:rPr>
+      </w:pPr>
+      <w:r>
+        <w:rPr>
+          <w:rFonts w:asciiTheme="majorHAnsi" w:eastAsiaTheme="majorEastAsia" w:hAnsiTheme="majorHAnsi" w:cstheme="majorBidi"/>
+          <w:color w:val="808080" w:themeColor="background1" w:themeShade="80"/>
         </w:rPr>
         <w:t xml:space="preserve">scalability observations </w:t>
       </w:r>
@@ -4155,11 +4644,13 @@
         <w:pStyle w:val="NormalWeb"/>
         <w:rPr>
           <w:rFonts w:asciiTheme="majorHAnsi" w:eastAsiaTheme="majorEastAsia" w:hAnsiTheme="majorHAnsi" w:cstheme="majorBidi"/>
-        </w:rPr>
-      </w:pPr>
-      <w:r>
-        <w:rPr>
-          <w:rFonts w:asciiTheme="majorHAnsi" w:eastAsiaTheme="majorEastAsia" w:hAnsiTheme="majorHAnsi" w:cstheme="majorBidi"/>
+          <w:color w:val="808080" w:themeColor="background1" w:themeShade="80"/>
+        </w:rPr>
+      </w:pPr>
+      <w:r>
+        <w:rPr>
+          <w:rFonts w:asciiTheme="majorHAnsi" w:eastAsiaTheme="majorEastAsia" w:hAnsiTheme="majorHAnsi" w:cstheme="majorBidi"/>
+          <w:color w:val="808080" w:themeColor="background1" w:themeShade="80"/>
         </w:rPr>
         <w:t>This is where you demonstrate understanding.</w:t>
       </w:r>
@@ -4182,10 +4673,11 @@
           <w:szCs w:val="32"/>
         </w:rPr>
         <w:pict w14:anchorId="2A716F16">
-          <v:rect id="_x0000_i1510" style="width:0;height:1.5pt" o:hralign="center" o:hrstd="t" o:hr="t" fillcolor="#a0a0a0" stroked="f"/>
+          <v:rect id="_x0000_i1055" style="width:0;height:1.5pt" o:hralign="center" o:hrstd="t" o:hr="t" fillcolor="#a0a0a0" stroked="f"/>
         </w:pict>
       </w:r>
     </w:p>
+    <w:p/>
     <w:p>
       <w:pPr>
         <w:pStyle w:val="Heading2"/>
@@ -4199,11 +4691,13 @@
         <w:pStyle w:val="NormalWeb"/>
         <w:rPr>
           <w:rFonts w:asciiTheme="majorHAnsi" w:eastAsiaTheme="majorEastAsia" w:hAnsiTheme="majorHAnsi" w:cstheme="majorBidi"/>
-        </w:rPr>
-      </w:pPr>
-      <w:r>
-        <w:rPr>
-          <w:rFonts w:asciiTheme="majorHAnsi" w:eastAsiaTheme="majorEastAsia" w:hAnsiTheme="majorHAnsi" w:cstheme="majorBidi"/>
+          <w:color w:val="808080" w:themeColor="background1" w:themeShade="80"/>
+        </w:rPr>
+      </w:pPr>
+      <w:r>
+        <w:rPr>
+          <w:rFonts w:asciiTheme="majorHAnsi" w:eastAsiaTheme="majorEastAsia" w:hAnsiTheme="majorHAnsi" w:cstheme="majorBidi"/>
+          <w:color w:val="808080" w:themeColor="background1" w:themeShade="80"/>
         </w:rPr>
         <w:t>Summarize:</w:t>
       </w:r>
@@ -4217,11 +4711,13 @@
         </w:numPr>
         <w:rPr>
           <w:rFonts w:asciiTheme="majorHAnsi" w:eastAsiaTheme="majorEastAsia" w:hAnsiTheme="majorHAnsi" w:cstheme="majorBidi"/>
-        </w:rPr>
-      </w:pPr>
-      <w:r>
-        <w:rPr>
-          <w:rFonts w:asciiTheme="majorHAnsi" w:eastAsiaTheme="majorEastAsia" w:hAnsiTheme="majorHAnsi" w:cstheme="majorBidi"/>
+          <w:color w:val="808080" w:themeColor="background1" w:themeShade="80"/>
+        </w:rPr>
+      </w:pPr>
+      <w:r>
+        <w:rPr>
+          <w:rFonts w:asciiTheme="majorHAnsi" w:eastAsiaTheme="majorEastAsia" w:hAnsiTheme="majorHAnsi" w:cstheme="majorBidi"/>
+          <w:color w:val="808080" w:themeColor="background1" w:themeShade="80"/>
         </w:rPr>
         <w:t xml:space="preserve">project goals achieved </w:t>
       </w:r>
@@ -4235,11 +4731,13 @@
         </w:numPr>
         <w:rPr>
           <w:rFonts w:asciiTheme="majorHAnsi" w:eastAsiaTheme="majorEastAsia" w:hAnsiTheme="majorHAnsi" w:cstheme="majorBidi"/>
-        </w:rPr>
-      </w:pPr>
-      <w:r>
-        <w:rPr>
-          <w:rFonts w:asciiTheme="majorHAnsi" w:eastAsiaTheme="majorEastAsia" w:hAnsiTheme="majorHAnsi" w:cstheme="majorBidi"/>
+          <w:color w:val="808080" w:themeColor="background1" w:themeShade="80"/>
+        </w:rPr>
+      </w:pPr>
+      <w:r>
+        <w:rPr>
+          <w:rFonts w:asciiTheme="majorHAnsi" w:eastAsiaTheme="majorEastAsia" w:hAnsiTheme="majorHAnsi" w:cstheme="majorBidi"/>
+          <w:color w:val="808080" w:themeColor="background1" w:themeShade="80"/>
         </w:rPr>
         <w:t xml:space="preserve">best results </w:t>
       </w:r>
@@ -4253,11 +4751,13 @@
         </w:numPr>
         <w:rPr>
           <w:rFonts w:asciiTheme="majorHAnsi" w:eastAsiaTheme="majorEastAsia" w:hAnsiTheme="majorHAnsi" w:cstheme="majorBidi"/>
-        </w:rPr>
-      </w:pPr>
-      <w:r>
-        <w:rPr>
-          <w:rFonts w:asciiTheme="majorHAnsi" w:eastAsiaTheme="majorEastAsia" w:hAnsiTheme="majorHAnsi" w:cstheme="majorBidi"/>
+          <w:color w:val="808080" w:themeColor="background1" w:themeShade="80"/>
+        </w:rPr>
+      </w:pPr>
+      <w:r>
+        <w:rPr>
+          <w:rFonts w:asciiTheme="majorHAnsi" w:eastAsiaTheme="majorEastAsia" w:hAnsiTheme="majorHAnsi" w:cstheme="majorBidi"/>
+          <w:color w:val="808080" w:themeColor="background1" w:themeShade="80"/>
         </w:rPr>
         <w:t xml:space="preserve">optimization improvements </w:t>
       </w:r>
@@ -4271,11 +4771,13 @@
         </w:numPr>
         <w:rPr>
           <w:rFonts w:asciiTheme="majorHAnsi" w:eastAsiaTheme="majorEastAsia" w:hAnsiTheme="majorHAnsi" w:cstheme="majorBidi"/>
-        </w:rPr>
-      </w:pPr>
-      <w:r>
-        <w:rPr>
-          <w:rFonts w:asciiTheme="majorHAnsi" w:eastAsiaTheme="majorEastAsia" w:hAnsiTheme="majorHAnsi" w:cstheme="majorBidi"/>
+          <w:color w:val="808080" w:themeColor="background1" w:themeShade="80"/>
+        </w:rPr>
+      </w:pPr>
+      <w:r>
+        <w:rPr>
+          <w:rFonts w:asciiTheme="majorHAnsi" w:eastAsiaTheme="majorEastAsia" w:hAnsiTheme="majorHAnsi" w:cstheme="majorBidi"/>
+          <w:color w:val="808080" w:themeColor="background1" w:themeShade="80"/>
         </w:rPr>
         <w:t xml:space="preserve">successful visualizations </w:t>
       </w:r>
@@ -4289,11 +4791,13 @@
         </w:numPr>
         <w:rPr>
           <w:rFonts w:asciiTheme="majorHAnsi" w:eastAsiaTheme="majorEastAsia" w:hAnsiTheme="majorHAnsi" w:cstheme="majorBidi"/>
-        </w:rPr>
-      </w:pPr>
-      <w:r>
-        <w:rPr>
-          <w:rFonts w:asciiTheme="majorHAnsi" w:eastAsiaTheme="majorEastAsia" w:hAnsiTheme="majorHAnsi" w:cstheme="majorBidi"/>
+          <w:color w:val="808080" w:themeColor="background1" w:themeShade="80"/>
+        </w:rPr>
+      </w:pPr>
+      <w:r>
+        <w:rPr>
+          <w:rFonts w:asciiTheme="majorHAnsi" w:eastAsiaTheme="majorEastAsia" w:hAnsiTheme="majorHAnsi" w:cstheme="majorBidi"/>
+          <w:color w:val="808080" w:themeColor="background1" w:themeShade="80"/>
         </w:rPr>
         <w:t xml:space="preserve">major findings </w:t>
       </w:r>
@@ -4303,11 +4807,13 @@
         <w:pStyle w:val="NormalWeb"/>
         <w:rPr>
           <w:rFonts w:asciiTheme="majorHAnsi" w:eastAsiaTheme="majorEastAsia" w:hAnsiTheme="majorHAnsi" w:cstheme="majorBidi"/>
-        </w:rPr>
-      </w:pPr>
-      <w:r>
-        <w:rPr>
-          <w:rFonts w:asciiTheme="majorHAnsi" w:eastAsiaTheme="majorEastAsia" w:hAnsiTheme="majorHAnsi" w:cstheme="majorBidi"/>
+          <w:color w:val="808080" w:themeColor="background1" w:themeShade="80"/>
+        </w:rPr>
+      </w:pPr>
+      <w:r>
+        <w:rPr>
+          <w:rFonts w:asciiTheme="majorHAnsi" w:eastAsiaTheme="majorEastAsia" w:hAnsiTheme="majorHAnsi" w:cstheme="majorBidi"/>
+          <w:color w:val="808080" w:themeColor="background1" w:themeShade="80"/>
         </w:rPr>
         <w:t>Example:</w:t>
       </w:r>
@@ -4317,12 +4823,15 @@
         <w:pStyle w:val="NormalWeb"/>
         <w:rPr>
           <w:rFonts w:asciiTheme="majorHAnsi" w:eastAsiaTheme="majorEastAsia" w:hAnsiTheme="majorHAnsi" w:cstheme="majorBidi"/>
-        </w:rPr>
-      </w:pPr>
-      <w:r>
-        <w:rPr>
-          <w:rFonts w:asciiTheme="majorHAnsi" w:eastAsiaTheme="majorEastAsia" w:hAnsiTheme="majorHAnsi" w:cstheme="majorBidi"/>
-        </w:rPr>
+          <w:color w:val="808080" w:themeColor="background1" w:themeShade="80"/>
+        </w:rPr>
+      </w:pPr>
+      <w:r>
+        <w:rPr>
+          <w:rFonts w:asciiTheme="majorHAnsi" w:eastAsiaTheme="majorEastAsia" w:hAnsiTheme="majorHAnsi" w:cstheme="majorBidi"/>
+          <w:color w:val="808080" w:themeColor="background1" w:themeShade="80"/>
+        </w:rPr>
+        <w:lastRenderedPageBreak/>
         <w:t>The project successfully demonstrated that combining A* pathfinding with a Genetic Algorithm can significantly optimize warehouse picking routes compared to random ordering strategies.</w:t>
       </w:r>
     </w:p>
@@ -4344,10 +4853,11 @@
           <w:szCs w:val="32"/>
         </w:rPr>
         <w:pict w14:anchorId="5CBF5F0E">
-          <v:rect id="_x0000_i1511" style="width:0;height:1.5pt" o:hralign="center" o:hrstd="t" o:hr="t" fillcolor="#a0a0a0" stroked="f"/>
+          <v:rect id="_x0000_i1056" style="width:0;height:1.5pt" o:hralign="center" o:hrstd="t" o:hr="t" fillcolor="#a0a0a0" stroked="f"/>
         </w:pict>
       </w:r>
     </w:p>
+    <w:p/>
     <w:p>
       <w:pPr>
         <w:pStyle w:val="Heading2"/>
@@ -4361,11 +4871,13 @@
         <w:pStyle w:val="NormalWeb"/>
         <w:rPr>
           <w:rFonts w:asciiTheme="majorHAnsi" w:eastAsiaTheme="majorEastAsia" w:hAnsiTheme="majorHAnsi" w:cstheme="majorBidi"/>
-        </w:rPr>
-      </w:pPr>
-      <w:r>
-        <w:rPr>
-          <w:rFonts w:asciiTheme="majorHAnsi" w:eastAsiaTheme="majorEastAsia" w:hAnsiTheme="majorHAnsi" w:cstheme="majorBidi"/>
+          <w:color w:val="808080" w:themeColor="background1" w:themeShade="80"/>
+        </w:rPr>
+      </w:pPr>
+      <w:r>
+        <w:rPr>
+          <w:rFonts w:asciiTheme="majorHAnsi" w:eastAsiaTheme="majorEastAsia" w:hAnsiTheme="majorHAnsi" w:cstheme="majorBidi"/>
+          <w:color w:val="808080" w:themeColor="background1" w:themeShade="80"/>
         </w:rPr>
         <w:t>Very important section.</w:t>
       </w:r>
@@ -4375,11 +4887,13 @@
         <w:pStyle w:val="NormalWeb"/>
         <w:rPr>
           <w:rFonts w:asciiTheme="majorHAnsi" w:eastAsiaTheme="majorEastAsia" w:hAnsiTheme="majorHAnsi" w:cstheme="majorBidi"/>
-        </w:rPr>
-      </w:pPr>
-      <w:r>
-        <w:rPr>
-          <w:rFonts w:asciiTheme="majorHAnsi" w:eastAsiaTheme="majorEastAsia" w:hAnsiTheme="majorHAnsi" w:cstheme="majorBidi"/>
+          <w:color w:val="808080" w:themeColor="background1" w:themeShade="80"/>
+        </w:rPr>
+      </w:pPr>
+      <w:r>
+        <w:rPr>
+          <w:rFonts w:asciiTheme="majorHAnsi" w:eastAsiaTheme="majorEastAsia" w:hAnsiTheme="majorHAnsi" w:cstheme="majorBidi"/>
+          <w:color w:val="808080" w:themeColor="background1" w:themeShade="80"/>
         </w:rPr>
         <w:t>Possible ideas:</w:t>
       </w:r>
@@ -4393,11 +4907,13 @@
         </w:numPr>
         <w:rPr>
           <w:rFonts w:asciiTheme="majorHAnsi" w:eastAsiaTheme="majorEastAsia" w:hAnsiTheme="majorHAnsi" w:cstheme="majorBidi"/>
-        </w:rPr>
-      </w:pPr>
-      <w:r>
-        <w:rPr>
-          <w:rFonts w:asciiTheme="majorHAnsi" w:eastAsiaTheme="majorEastAsia" w:hAnsiTheme="majorHAnsi" w:cstheme="majorBidi"/>
+          <w:color w:val="808080" w:themeColor="background1" w:themeShade="80"/>
+        </w:rPr>
+      </w:pPr>
+      <w:r>
+        <w:rPr>
+          <w:rFonts w:asciiTheme="majorHAnsi" w:eastAsiaTheme="majorEastAsia" w:hAnsiTheme="majorHAnsi" w:cstheme="majorBidi"/>
+          <w:color w:val="808080" w:themeColor="background1" w:themeShade="80"/>
         </w:rPr>
         <w:t xml:space="preserve">reinforcement learning </w:t>
       </w:r>
@@ -4411,13 +4927,14 @@
         </w:numPr>
         <w:rPr>
           <w:rFonts w:asciiTheme="majorHAnsi" w:eastAsiaTheme="majorEastAsia" w:hAnsiTheme="majorHAnsi" w:cstheme="majorBidi"/>
-        </w:rPr>
-      </w:pPr>
-      <w:r>
-        <w:rPr>
-          <w:rFonts w:asciiTheme="majorHAnsi" w:eastAsiaTheme="majorEastAsia" w:hAnsiTheme="majorHAnsi" w:cstheme="majorBidi"/>
-        </w:rPr>
-        <w:lastRenderedPageBreak/>
+          <w:color w:val="808080" w:themeColor="background1" w:themeShade="80"/>
+        </w:rPr>
+      </w:pPr>
+      <w:r>
+        <w:rPr>
+          <w:rFonts w:asciiTheme="majorHAnsi" w:eastAsiaTheme="majorEastAsia" w:hAnsiTheme="majorHAnsi" w:cstheme="majorBidi"/>
+          <w:color w:val="808080" w:themeColor="background1" w:themeShade="80"/>
+        </w:rPr>
         <w:t xml:space="preserve">multi-agent systems </w:t>
       </w:r>
     </w:p>
@@ -4430,11 +4947,13 @@
         </w:numPr>
         <w:rPr>
           <w:rFonts w:asciiTheme="majorHAnsi" w:eastAsiaTheme="majorEastAsia" w:hAnsiTheme="majorHAnsi" w:cstheme="majorBidi"/>
-        </w:rPr>
-      </w:pPr>
-      <w:r>
-        <w:rPr>
-          <w:rFonts w:asciiTheme="majorHAnsi" w:eastAsiaTheme="majorEastAsia" w:hAnsiTheme="majorHAnsi" w:cstheme="majorBidi"/>
+          <w:color w:val="808080" w:themeColor="background1" w:themeShade="80"/>
+        </w:rPr>
+      </w:pPr>
+      <w:r>
+        <w:rPr>
+          <w:rFonts w:asciiTheme="majorHAnsi" w:eastAsiaTheme="majorEastAsia" w:hAnsiTheme="majorHAnsi" w:cstheme="majorBidi"/>
+          <w:color w:val="808080" w:themeColor="background1" w:themeShade="80"/>
         </w:rPr>
         <w:t xml:space="preserve">dynamic obstacles </w:t>
       </w:r>
@@ -4448,11 +4967,13 @@
         </w:numPr>
         <w:rPr>
           <w:rFonts w:asciiTheme="majorHAnsi" w:eastAsiaTheme="majorEastAsia" w:hAnsiTheme="majorHAnsi" w:cstheme="majorBidi"/>
-        </w:rPr>
-      </w:pPr>
-      <w:r>
-        <w:rPr>
-          <w:rFonts w:asciiTheme="majorHAnsi" w:eastAsiaTheme="majorEastAsia" w:hAnsiTheme="majorHAnsi" w:cstheme="majorBidi"/>
+          <w:color w:val="808080" w:themeColor="background1" w:themeShade="80"/>
+        </w:rPr>
+      </w:pPr>
+      <w:r>
+        <w:rPr>
+          <w:rFonts w:asciiTheme="majorHAnsi" w:eastAsiaTheme="majorEastAsia" w:hAnsiTheme="majorHAnsi" w:cstheme="majorBidi"/>
+          <w:color w:val="808080" w:themeColor="background1" w:themeShade="80"/>
         </w:rPr>
         <w:t xml:space="preserve">real warehouse layouts </w:t>
       </w:r>
@@ -4466,11 +4987,13 @@
         </w:numPr>
         <w:rPr>
           <w:rFonts w:asciiTheme="majorHAnsi" w:eastAsiaTheme="majorEastAsia" w:hAnsiTheme="majorHAnsi" w:cstheme="majorBidi"/>
-        </w:rPr>
-      </w:pPr>
-      <w:r>
-        <w:rPr>
-          <w:rFonts w:asciiTheme="majorHAnsi" w:eastAsiaTheme="majorEastAsia" w:hAnsiTheme="majorHAnsi" w:cstheme="majorBidi"/>
+          <w:color w:val="808080" w:themeColor="background1" w:themeShade="80"/>
+        </w:rPr>
+      </w:pPr>
+      <w:r>
+        <w:rPr>
+          <w:rFonts w:asciiTheme="majorHAnsi" w:eastAsiaTheme="majorEastAsia" w:hAnsiTheme="majorHAnsi" w:cstheme="majorBidi"/>
+          <w:color w:val="808080" w:themeColor="background1" w:themeShade="80"/>
         </w:rPr>
         <w:t xml:space="preserve">parallel GA </w:t>
       </w:r>
@@ -4484,11 +5007,13 @@
         </w:numPr>
         <w:rPr>
           <w:rFonts w:asciiTheme="majorHAnsi" w:eastAsiaTheme="majorEastAsia" w:hAnsiTheme="majorHAnsi" w:cstheme="majorBidi"/>
-        </w:rPr>
-      </w:pPr>
-      <w:r>
-        <w:rPr>
-          <w:rFonts w:asciiTheme="majorHAnsi" w:eastAsiaTheme="majorEastAsia" w:hAnsiTheme="majorHAnsi" w:cstheme="majorBidi"/>
+          <w:color w:val="808080" w:themeColor="background1" w:themeShade="80"/>
+        </w:rPr>
+      </w:pPr>
+      <w:r>
+        <w:rPr>
+          <w:rFonts w:asciiTheme="majorHAnsi" w:eastAsiaTheme="majorEastAsia" w:hAnsiTheme="majorHAnsi" w:cstheme="majorBidi"/>
+          <w:color w:val="808080" w:themeColor="background1" w:themeShade="80"/>
         </w:rPr>
         <w:t xml:space="preserve">hybrid algorithms </w:t>
       </w:r>
@@ -4498,11 +5023,13 @@
         <w:pStyle w:val="NormalWeb"/>
         <w:rPr>
           <w:rFonts w:asciiTheme="majorHAnsi" w:eastAsiaTheme="majorEastAsia" w:hAnsiTheme="majorHAnsi" w:cstheme="majorBidi"/>
-        </w:rPr>
-      </w:pPr>
-      <w:r>
-        <w:rPr>
-          <w:rFonts w:asciiTheme="majorHAnsi" w:eastAsiaTheme="majorEastAsia" w:hAnsiTheme="majorHAnsi" w:cstheme="majorBidi"/>
+          <w:color w:val="808080" w:themeColor="background1" w:themeShade="80"/>
+        </w:rPr>
+      </w:pPr>
+      <w:r>
+        <w:rPr>
+          <w:rFonts w:asciiTheme="majorHAnsi" w:eastAsiaTheme="majorEastAsia" w:hAnsiTheme="majorHAnsi" w:cstheme="majorBidi"/>
+          <w:color w:val="808080" w:themeColor="background1" w:themeShade="80"/>
         </w:rPr>
         <w:t>This shows awareness of broader AI applications.</w:t>
       </w:r>
@@ -4525,10 +5052,11 @@
           <w:szCs w:val="32"/>
         </w:rPr>
         <w:pict w14:anchorId="34AE818A">
-          <v:rect id="_x0000_i1512" style="width:0;height:1.5pt" o:hralign="center" o:hrstd="t" o:hr="t" fillcolor="#a0a0a0" stroked="f"/>
+          <v:rect id="_x0000_i1057" style="width:0;height:1.5pt" o:hralign="center" o:hrstd="t" o:hr="t" fillcolor="#a0a0a0" stroked="f"/>
         </w:pict>
       </w:r>
     </w:p>
+    <w:p/>
     <w:p>
       <w:pPr>
         <w:pStyle w:val="Heading2"/>
@@ -4542,11 +5070,13 @@
         <w:pStyle w:val="NormalWeb"/>
         <w:rPr>
           <w:rFonts w:asciiTheme="majorHAnsi" w:eastAsiaTheme="majorEastAsia" w:hAnsiTheme="majorHAnsi" w:cstheme="majorBidi"/>
-        </w:rPr>
-      </w:pPr>
-      <w:r>
-        <w:rPr>
-          <w:rFonts w:asciiTheme="majorHAnsi" w:eastAsiaTheme="majorEastAsia" w:hAnsiTheme="majorHAnsi" w:cstheme="majorBidi"/>
+          <w:color w:val="808080" w:themeColor="background1" w:themeShade="80"/>
+        </w:rPr>
+      </w:pPr>
+      <w:r>
+        <w:rPr>
+          <w:rFonts w:asciiTheme="majorHAnsi" w:eastAsiaTheme="majorEastAsia" w:hAnsiTheme="majorHAnsi" w:cstheme="majorBidi"/>
+          <w:color w:val="808080" w:themeColor="background1" w:themeShade="80"/>
         </w:rPr>
         <w:t>Include:</w:t>
       </w:r>
@@ -4560,11 +5090,13 @@
         </w:numPr>
         <w:rPr>
           <w:rFonts w:asciiTheme="majorHAnsi" w:eastAsiaTheme="majorEastAsia" w:hAnsiTheme="majorHAnsi" w:cstheme="majorBidi"/>
-        </w:rPr>
-      </w:pPr>
-      <w:r>
-        <w:rPr>
-          <w:rFonts w:asciiTheme="majorHAnsi" w:eastAsiaTheme="majorEastAsia" w:hAnsiTheme="majorHAnsi" w:cstheme="majorBidi"/>
+          <w:color w:val="808080" w:themeColor="background1" w:themeShade="80"/>
+        </w:rPr>
+      </w:pPr>
+      <w:r>
+        <w:rPr>
+          <w:rFonts w:asciiTheme="majorHAnsi" w:eastAsiaTheme="majorEastAsia" w:hAnsiTheme="majorHAnsi" w:cstheme="majorBidi"/>
+          <w:color w:val="808080" w:themeColor="background1" w:themeShade="80"/>
         </w:rPr>
         <w:t xml:space="preserve">A* sources </w:t>
       </w:r>
@@ -4578,11 +5110,13 @@
         </w:numPr>
         <w:rPr>
           <w:rFonts w:asciiTheme="majorHAnsi" w:eastAsiaTheme="majorEastAsia" w:hAnsiTheme="majorHAnsi" w:cstheme="majorBidi"/>
-        </w:rPr>
-      </w:pPr>
-      <w:r>
-        <w:rPr>
-          <w:rFonts w:asciiTheme="majorHAnsi" w:eastAsiaTheme="majorEastAsia" w:hAnsiTheme="majorHAnsi" w:cstheme="majorBidi"/>
+          <w:color w:val="808080" w:themeColor="background1" w:themeShade="80"/>
+        </w:rPr>
+      </w:pPr>
+      <w:r>
+        <w:rPr>
+          <w:rFonts w:asciiTheme="majorHAnsi" w:eastAsiaTheme="majorEastAsia" w:hAnsiTheme="majorHAnsi" w:cstheme="majorBidi"/>
+          <w:color w:val="808080" w:themeColor="background1" w:themeShade="80"/>
         </w:rPr>
         <w:t xml:space="preserve">GA sources </w:t>
       </w:r>
@@ -4596,11 +5130,13 @@
         </w:numPr>
         <w:rPr>
           <w:rFonts w:asciiTheme="majorHAnsi" w:eastAsiaTheme="majorEastAsia" w:hAnsiTheme="majorHAnsi" w:cstheme="majorBidi"/>
-        </w:rPr>
-      </w:pPr>
-      <w:r>
-        <w:rPr>
-          <w:rFonts w:asciiTheme="majorHAnsi" w:eastAsiaTheme="majorEastAsia" w:hAnsiTheme="majorHAnsi" w:cstheme="majorBidi"/>
+          <w:color w:val="808080" w:themeColor="background1" w:themeShade="80"/>
+        </w:rPr>
+      </w:pPr>
+      <w:r>
+        <w:rPr>
+          <w:rFonts w:asciiTheme="majorHAnsi" w:eastAsiaTheme="majorEastAsia" w:hAnsiTheme="majorHAnsi" w:cstheme="majorBidi"/>
+          <w:color w:val="808080" w:themeColor="background1" w:themeShade="80"/>
         </w:rPr>
         <w:t>papers/books/tutorials used</w:t>
       </w:r>
@@ -4609,65 +5145,61 @@
       <w:pPr>
         <w:pStyle w:val="NormalWeb"/>
       </w:pPr>
-    </w:p>
-    <w:p>
-      <w:pPr>
-        <w:pStyle w:val="NormalWeb"/>
-      </w:pPr>
-    </w:p>
-    <w:p>
-      <w:pPr>
-        <w:pStyle w:val="NormalWeb"/>
-      </w:pPr>
-    </w:p>
-    <w:p>
-      <w:pPr>
-        <w:pStyle w:val="NormalWeb"/>
-      </w:pPr>
-    </w:p>
-    <w:p>
-      <w:pPr>
-        <w:pStyle w:val="NormalWeb"/>
-      </w:pPr>
-    </w:p>
-    <w:p>
-      <w:pPr>
-        <w:pStyle w:val="NormalWeb"/>
-      </w:pPr>
-    </w:p>
-    <w:p>
-      <w:pPr>
-        <w:pStyle w:val="NormalWeb"/>
-      </w:pPr>
-      <w:r>
+      <w:r>
+        <w:rPr>
+          <w:rFonts w:asciiTheme="majorHAnsi" w:eastAsiaTheme="majorEastAsia" w:hAnsiTheme="majorHAnsi" w:cstheme="majorBidi"/>
+          <w:color w:val="0F4761" w:themeColor="accent1" w:themeShade="BF"/>
+          <w:sz w:val="32"/>
+          <w:szCs w:val="32"/>
+        </w:rPr>
+        <w:pict w14:anchorId="7EE6E268">
+          <v:rect id="_x0000_i1068" style="width:0;height:1.5pt" o:hralign="center" o:hrstd="t" o:hr="t" fillcolor="#a0a0a0" stroked="f"/>
+        </w:pict>
+      </w:r>
+    </w:p>
+    <w:p/>
+    <w:p>
+      <w:pPr>
+        <w:pStyle w:val="NormalWeb"/>
+      </w:pPr>
+    </w:p>
+    <w:p>
+      <w:pPr>
+        <w:pStyle w:val="NormalWeb"/>
+      </w:pPr>
+    </w:p>
+    <w:p>
+      <w:pPr>
+        <w:pStyle w:val="NormalWeb"/>
+      </w:pPr>
+    </w:p>
+    <w:p>
+      <w:pPr>
+        <w:pStyle w:val="NormalWeb"/>
+      </w:pPr>
+    </w:p>
+    <w:p>
+      <w:pPr>
+        <w:pStyle w:val="NormalWeb"/>
+      </w:pPr>
+      <w:r>
+        <w:lastRenderedPageBreak/>
         <w:t>Elitism: (parent selection kind of??)</w:t>
       </w:r>
     </w:p>
     <w:p>
       <w:pPr>
         <w:pStyle w:val="NormalWeb"/>
-        <w:rPr>
-          <w:lang w:val="en-DK"/>
-        </w:rPr>
-      </w:pPr>
-      <w:r>
-        <w:rPr>
-          <w:lang w:val="en-DK"/>
-        </w:rPr>
+      </w:pPr>
+      <w:r>
         <w:t>Elitism was experimentally evaluated by preserving the best individual between generations. However, this resulted in consistently worse route distances for the tested warehouse layouts and parameter configurations. The likely cause was reduced population diversity and premature convergence. Consequently, the final implementation used a non-elitist genetic algorithm.</w:t>
       </w:r>
     </w:p>
     <w:p>
       <w:pPr>
         <w:pStyle w:val="NormalWeb"/>
-        <w:rPr>
-          <w:lang w:val="en-DK"/>
-        </w:rPr>
-      </w:pPr>
-      <w:r>
-        <w:rPr>
-          <w:lang w:val="en-DK"/>
-        </w:rPr>
+      </w:pPr>
+      <w:r>
         <w:t>Fitness evolution:</w:t>
       </w:r>
     </w:p>
@@ -4676,9 +5208,6 @@
         <w:pStyle w:val="NormalWeb"/>
       </w:pPr>
       <w:r>
-        <w:rPr>
-          <w:lang w:val="en-DK"/>
-        </w:rPr>
         <w:t>The fluctuating fitness curves indicate that the population continuously explored new regions of the search space. Since elitism was not used, high-quality individuals could occasionally be lost between generations, causing temporary increases in best and average route distances. However, this maintained diversity and ultimately produced better final solutions in this project.</w:t>
       </w:r>
     </w:p>
@@ -4695,6 +5224,21 @@
 
 <file path=word/numbering.xml><?xml version="1.0" encoding="utf-8"?>
 <w:numbering xmlns:wpc="http://schemas.microsoft.com/office/word/2010/wordprocessingCanvas" xmlns:cx="http://schemas.microsoft.com/office/drawing/2014/chartex" xmlns:cx1="http://schemas.microsoft.com/office/drawing/2015/9/8/chartex" xmlns:cx2="http://schemas.microsoft.com/office/drawing/2015/10/21/chartex" xmlns:cx3="http://schemas.microsoft.com/office/drawing/2016/5/9/chartex" xmlns:cx4="http://schemas.microsoft.com/office/drawing/2016/5/10/chartex" xmlns:cx5="http://schemas.microsoft.com/office/drawing/2016/5/11/chartex" xmlns:cx6="http://schemas.microsoft.com/office/drawing/2016/5/12/chartex" xmlns:cx7="http://schemas.microsoft.com/office/drawing/2016/5/13/chartex" xmlns:cx8="http://schemas.microsoft.com/office/drawing/2016/5/14/chartex" xmlns:mc="http://schemas.openxmlformats.org/markup-compatibility/2006" xmlns:aink="http://schemas.microsoft.com/office/drawing/2016/ink" xmlns:am3d="http://schemas.microsoft.com/office/drawing/2017/model3d" xmlns:o="urn:schemas-microsoft-com:office:office" xmlns:oel="http://schemas.microsoft.com/office/2019/extlst" xmlns:r="http://schemas.openxmlformats.org/officeDocument/2006/relationships" xmlns:m="http://schemas.openxmlformats.org/officeDocument/2006/math" xmlns:v="urn:schemas-microsoft-com:vml" xmlns:wp14="http://schemas.microsoft.com/office/word/2010/wordprocessingDrawing" xmlns:wp="http://schemas.openxmlformats.org/drawingml/2006/wordprocessingDrawing" xmlns:w10="urn:schemas-microsoft-com:office:word" xmlns:w="http://schemas.openxmlformats.org/wordprocessingml/2006/main" xmlns:w14="http://schemas.microsoft.com/office/word/2010/wordml" xmlns:w15="http://schemas.microsoft.com/office/word/2012/wordml" xmlns:w16cex="http://schemas.microsoft.com/office/word/2018/wordml/cex" xmlns:w16cid="http://schemas.microsoft.com/office/word/2016/wordml/cid" xmlns:w16="http://schemas.microsoft.com/office/word/2018/wordml" xmlns:w16du="http://schemas.microsoft.com/office/word/2023/wordml/word16du" xmlns:w16sdtdh="http://schemas.microsoft.com/office/word/2020/wordml/sdtdatahash" xmlns:w16sdtfl="http://schemas.microsoft.com/office/word/2024/wordml/sdtformatlock" xmlns:w16se="http://schemas.microsoft.com/office/word/2015/wordml/symex" xmlns:wpg="http://schemas.microsoft.com/office/word/2010/wordprocessingGroup" xmlns:wpi="http://schemas.microsoft.com/office/word/2010/wordprocessingInk" xmlns:wne="http://schemas.microsoft.com/office/word/2006/wordml" xmlns:wps="http://schemas.microsoft.com/office/word/2010/wordprocessingShape" mc:Ignorable="w14 w15 w16se w16cid w16 w16cex w16sdtdh w16sdtfl w16du wp14">
+  <w:numPicBullet w:numPicBulletId="0">
+    <w:pict>
+      <v:rect id="_x0000_i1025" style="width:0;height:1.5pt" o:hralign="center" o:bullet="t" o:hrstd="t" o:hr="t" fillcolor="#a0a0a0" stroked="f"/>
+    </w:pict>
+  </w:numPicBullet>
+  <w:numPicBullet w:numPicBulletId="1">
+    <w:pict>
+      <v:rect id="_x0000_i1026" style="width:0;height:1.5pt" o:hralign="center" o:bullet="t" o:hrstd="t" o:hr="t" fillcolor="#a0a0a0" stroked="f"/>
+    </w:pict>
+  </w:numPicBullet>
+  <w:numPicBullet w:numPicBulletId="2">
+    <w:pict>
+      <v:rect id="_x0000_i1027" style="width:0;height:1.5pt" o:hralign="center" o:bullet="t" o:hrstd="t" o:hr="t" fillcolor="#a0a0a0" stroked="f"/>
+    </w:pict>
+  </w:numPicBullet>
   <w:abstractNum w:abstractNumId="0" w15:restartNumberingAfterBreak="0">
     <w:nsid w:val="0226190E"/>
     <w:multiLevelType w:val="multilevel"/>
@@ -11840,7 +12384,7 @@
     <w:rPr>
       <w:rFonts w:ascii="Times New Roman" w:eastAsia="Times New Roman" w:hAnsi="Times New Roman" w:cs="Times New Roman"/>
       <w:kern w:val="0"/>
-      <w:lang w:val="en-DK" w:eastAsia="en-DK"/>
+      <w:lang w:eastAsia="en-DK"/>
       <w14:ligatures w14:val="none"/>
     </w:rPr>
   </w:style>

</xml_diff>